<commit_message>
Analyzed 5 research papers for the literature review
Next step will be to synthesize and elicit the most important information.
</commit_message>
<xml_diff>
--- a/doc/milestone_02/miguelabela_swd63a_milestone_02.docx
+++ b/doc/milestone_02/miguelabela_swd63a_milestone_02.docx
@@ -65,43 +65,7 @@
         <w:rPr>
           <w:lang w:val="en-US"/>
         </w:rPr>
-        <w:t xml:space="preserve">driving the demand for </w:t>
-      </w:r>
-      <w:r>
-        <w:rPr>
-          <w:lang w:val="en-US"/>
-        </w:rPr>
-        <w:t>wearable tracking devices</w:t>
-      </w:r>
-      <w:r>
-        <w:rPr>
-          <w:lang w:val="en-US"/>
-        </w:rPr>
-        <w:t xml:space="preserve"> that capture real-time, sport-related data. Due to the complexity of forecasting marathon race times, predictive machine learning (ML) algorithms </w:t>
-      </w:r>
-      <w:r>
-        <w:rPr>
-          <w:lang w:val="en-US"/>
-        </w:rPr>
-        <w:t xml:space="preserve">have become </w:t>
-      </w:r>
-      <w:r>
-        <w:rPr>
-          <w:lang w:val="en-US"/>
-        </w:rPr>
-        <w:t xml:space="preserve">a </w:t>
-      </w:r>
-      <w:r>
-        <w:rPr>
-          <w:lang w:val="en-US"/>
-        </w:rPr>
-        <w:t>prevalent and necessary</w:t>
-      </w:r>
-      <w:r>
-        <w:rPr>
-          <w:lang w:val="en-US"/>
-        </w:rPr>
-        <w:t xml:space="preserve"> resource for individuals in training and attaining target performances. As t</w:t>
+        <w:t>driving the demand for wearable tracking devices that capture real-time, sport-related data. Due to the complexity of forecasting marathon race times, predictive machine learning (ML) algorithms have become a prevalent and necessary resource for individuals in training and attaining target performances. As t</w:t>
       </w:r>
       <w:r>
         <w:rPr>
@@ -145,6 +109,14 @@
         </w:rPr>
         <w:t xml:space="preserve">. </w:t>
       </w:r>
+    </w:p>
+    <w:p>
+      <w:pPr>
+        <w:jc w:val="both"/>
+        <w:rPr>
+          <w:lang w:val="en-US"/>
+        </w:rPr>
+      </w:pPr>
       <w:r>
         <w:rPr>
           <w:lang w:val="en-US"/>
@@ -215,7 +187,1023 @@
         <w:rPr>
           <w:lang w:val="en-US"/>
         </w:rPr>
-        <w:t>. Common methodological patterns will be highlighted, along with their advantages and disadvantages.</w:t>
+        <w:t>.</w:t>
+      </w:r>
+      <w:r>
+        <w:rPr>
+          <w:lang w:val="en-US"/>
+        </w:rPr>
+        <w:t xml:space="preserve"> </w:t>
+      </w:r>
+      <w:r>
+        <w:rPr>
+          <w:lang w:val="en-US"/>
+        </w:rPr>
+        <w:t>To deliver a systematic and comparative analysis, t</w:t>
+      </w:r>
+      <w:r>
+        <w:rPr>
+          <w:lang w:val="en-US"/>
+        </w:rPr>
+        <w:t xml:space="preserve">his section is based </w:t>
+      </w:r>
+      <w:r>
+        <w:rPr>
+          <w:lang w:val="en-US"/>
+        </w:rPr>
+        <w:t>on the research onion model proposed in [9] and</w:t>
+      </w:r>
+      <w:r>
+        <w:rPr>
+          <w:lang w:val="en-US"/>
+        </w:rPr>
+        <w:t xml:space="preserve"> the research design framework proposed in [8</w:t>
+      </w:r>
+      <w:r>
+        <w:rPr>
+          <w:lang w:val="en-US"/>
+        </w:rPr>
+        <w:t xml:space="preserve">]. </w:t>
+      </w:r>
+      <w:r>
+        <w:rPr>
+          <w:lang w:val="en-US"/>
+        </w:rPr>
+        <w:t>Common methodological patterns will be highlighted, along with their advantages and disadvantages.</w:t>
+      </w:r>
+    </w:p>
+    <w:p>
+      <w:pPr>
+        <w:jc w:val="both"/>
+        <w:rPr>
+          <w:i/>
+          <w:iCs/>
+          <w:lang w:val="en-US"/>
+        </w:rPr>
+      </w:pPr>
+      <w:r>
+        <w:rPr>
+          <w:i/>
+          <w:iCs/>
+          <w:lang w:val="en-US"/>
+        </w:rPr>
+        <w:t xml:space="preserve">A. </w:t>
+      </w:r>
+      <w:r>
+        <w:rPr>
+          <w:i/>
+          <w:iCs/>
+          <w:lang w:val="en-US"/>
+        </w:rPr>
+        <w:t>Regression and Deep Learning Models for Performance Prediction</w:t>
+      </w:r>
+    </w:p>
+    <w:p>
+      <w:pPr>
+        <w:jc w:val="both"/>
+        <w:rPr>
+          <w:lang w:val="en-US"/>
+        </w:rPr>
+      </w:pPr>
+      <w:r>
+        <w:rPr>
+          <w:lang w:val="en-US"/>
+        </w:rPr>
+        <w:t>With the same objective in mind</w:t>
+      </w:r>
+      <w:r>
+        <w:rPr>
+          <w:lang w:val="en-US"/>
+        </w:rPr>
+        <w:t xml:space="preserve">, </w:t>
+      </w:r>
+      <w:r>
+        <w:rPr>
+          <w:lang w:val="en-US"/>
+        </w:rPr>
+        <w:t>all six studies</w:t>
+      </w:r>
+      <w:r>
+        <w:rPr>
+          <w:lang w:val="en-US"/>
+        </w:rPr>
+        <w:t xml:space="preserve"> </w:t>
+      </w:r>
+      <w:r>
+        <w:rPr>
+          <w:lang w:val="en-US"/>
+        </w:rPr>
+        <w:t>[10 – 14] adopt</w:t>
+      </w:r>
+      <w:r>
+        <w:rPr>
+          <w:lang w:val="en-US"/>
+        </w:rPr>
+        <w:t>ed</w:t>
+      </w:r>
+      <w:r>
+        <w:rPr>
+          <w:lang w:val="en-US"/>
+        </w:rPr>
+        <w:t xml:space="preserve"> a positivist standpoint</w:t>
+      </w:r>
+      <w:r>
+        <w:rPr>
+          <w:lang w:val="en-US"/>
+        </w:rPr>
+        <w:t xml:space="preserve">,  considering an individual’s performance in a marathon event a continuous, </w:t>
+      </w:r>
+      <w:r>
+        <w:rPr>
+          <w:lang w:val="en-US"/>
+        </w:rPr>
+        <w:t>measurable</w:t>
+      </w:r>
+      <w:r>
+        <w:rPr>
+          <w:lang w:val="en-US"/>
+        </w:rPr>
+        <w:t xml:space="preserve">, and objective outcome that can be precisely calculated by machine learning (ML) </w:t>
+      </w:r>
+      <w:r>
+        <w:rPr>
+          <w:lang w:val="en-US"/>
+        </w:rPr>
+        <w:t>techniques</w:t>
+      </w:r>
+      <w:r>
+        <w:rPr>
+          <w:lang w:val="en-US"/>
+        </w:rPr>
+        <w:t xml:space="preserve">. Hence, they </w:t>
+      </w:r>
+      <w:r>
+        <w:rPr>
+          <w:lang w:val="en-US"/>
+        </w:rPr>
+        <w:t>were</w:t>
+      </w:r>
+      <w:r>
+        <w:rPr>
+          <w:lang w:val="en-US"/>
+        </w:rPr>
+        <w:t xml:space="preserve"> all distinctly deductive in </w:t>
+      </w:r>
+      <w:r>
+        <w:rPr>
+          <w:lang w:val="en-US"/>
+        </w:rPr>
+        <w:t xml:space="preserve">nature </w:t>
+      </w:r>
+      <w:r>
+        <w:rPr>
+          <w:lang w:val="en-US"/>
+        </w:rPr>
+        <w:t>as</w:t>
+      </w:r>
+      <w:r>
+        <w:rPr>
+          <w:lang w:val="en-US"/>
+        </w:rPr>
+        <w:t xml:space="preserve"> they </w:t>
+      </w:r>
+      <w:r>
+        <w:rPr>
+          <w:lang w:val="en-US"/>
+        </w:rPr>
+        <w:t>validated</w:t>
+      </w:r>
+      <w:r>
+        <w:rPr>
+          <w:lang w:val="en-US"/>
+        </w:rPr>
+        <w:t xml:space="preserve"> </w:t>
+      </w:r>
+      <w:r>
+        <w:rPr>
+          <w:lang w:val="en-US"/>
+        </w:rPr>
+        <w:t>existing</w:t>
+      </w:r>
+      <w:r>
+        <w:rPr>
+          <w:lang w:val="en-US"/>
+        </w:rPr>
+        <w:t xml:space="preserve"> hypotheses using experimental designs and </w:t>
+      </w:r>
+      <w:r>
+        <w:rPr>
+          <w:lang w:val="en-US"/>
+        </w:rPr>
+        <w:t>archival</w:t>
+      </w:r>
+      <w:r>
+        <w:rPr>
+          <w:lang w:val="en-US"/>
+        </w:rPr>
+        <w:t xml:space="preserve"> data.</w:t>
+      </w:r>
+      <w:r>
+        <w:rPr>
+          <w:lang w:val="en-US"/>
+        </w:rPr>
+        <w:t xml:space="preserve"> Additionally, they entirely depend on quantitative, numerical data, distinguishing them as mono-method quantitative methodological studies. No qualitative information is gathered about an athlete’s emotional state</w:t>
+      </w:r>
+      <w:r>
+        <w:rPr>
+          <w:lang w:val="en-US"/>
+        </w:rPr>
+        <w:t xml:space="preserve"> or </w:t>
+      </w:r>
+      <w:r>
+        <w:rPr>
+          <w:lang w:val="en-US"/>
+        </w:rPr>
+        <w:t>training experience</w:t>
+      </w:r>
+      <w:r>
+        <w:rPr>
+          <w:lang w:val="en-US"/>
+        </w:rPr>
+        <w:t>.</w:t>
+      </w:r>
+      <w:r>
+        <w:rPr>
+          <w:lang w:val="en-US"/>
+        </w:rPr>
+        <w:t xml:space="preserve"> They only differ in the time-horizon aspect of the research onion.</w:t>
+      </w:r>
+    </w:p>
+    <w:p>
+      <w:pPr>
+        <w:jc w:val="both"/>
+        <w:rPr>
+          <w:lang w:val="en-US"/>
+        </w:rPr>
+      </w:pPr>
+      <w:r>
+        <w:rPr>
+          <w:lang w:val="en-US"/>
+        </w:rPr>
+        <w:t xml:space="preserve">In the case of </w:t>
+      </w:r>
+      <w:r>
+        <w:rPr>
+          <w:lang w:val="en-US"/>
+        </w:rPr>
+        <w:t xml:space="preserve">Feely </w:t>
+      </w:r>
+      <w:r>
+        <w:rPr>
+          <w:i/>
+          <w:iCs/>
+          <w:lang w:val="en-US"/>
+        </w:rPr>
+        <w:t>et al.</w:t>
+      </w:r>
+      <w:r>
+        <w:rPr>
+          <w:lang w:val="en-US"/>
+        </w:rPr>
+        <w:t xml:space="preserve"> [10], </w:t>
+      </w:r>
+      <w:r>
+        <w:rPr>
+          <w:lang w:val="en-US"/>
+        </w:rPr>
+        <w:t xml:space="preserve">a recommender system for weekly training schedules was developed using a case-based reasoning (CBR) approach, leading to highly accurate marathon race time (MRT) predictions. </w:t>
+      </w:r>
+      <w:r>
+        <w:rPr>
+          <w:lang w:val="en-US"/>
+        </w:rPr>
+        <w:t>A longitudinal time</w:t>
+      </w:r>
+      <w:r>
+        <w:rPr>
+          <w:lang w:val="en-US"/>
+        </w:rPr>
+        <w:t xml:space="preserve"> </w:t>
+      </w:r>
+      <w:r>
+        <w:rPr>
+          <w:lang w:val="en-US"/>
+        </w:rPr>
+        <w:t>horizon was used</w:t>
+      </w:r>
+      <w:r>
+        <w:rPr>
+          <w:lang w:val="en-US"/>
+        </w:rPr>
+        <w:t xml:space="preserve">, comprising </w:t>
+      </w:r>
+      <w:r>
+        <w:rPr>
+          <w:lang w:val="en-US"/>
+        </w:rPr>
+        <w:t xml:space="preserve">1.5 million activity records gathered between </w:t>
+      </w:r>
+      <w:r>
+        <w:rPr>
+          <w:lang w:val="en-US"/>
+        </w:rPr>
+        <w:t xml:space="preserve">2014 and 2017. This dataset </w:t>
+      </w:r>
+      <w:r>
+        <w:rPr>
+          <w:lang w:val="en-US"/>
+        </w:rPr>
+        <w:t>had</w:t>
+      </w:r>
+      <w:r>
+        <w:rPr>
+          <w:lang w:val="en-US"/>
+        </w:rPr>
+        <w:t xml:space="preserve"> four main stages of pre-processing, including athlete pace</w:t>
+      </w:r>
+      <w:r>
+        <w:rPr>
+          <w:lang w:val="en-US"/>
+        </w:rPr>
+        <w:t xml:space="preserve"> extraction</w:t>
+      </w:r>
+      <w:r>
+        <w:rPr>
+          <w:lang w:val="en-US"/>
+        </w:rPr>
+        <w:t xml:space="preserve"> from raw 100-meter recorded intervals and aggregating these training activities to create weekly training cases. T</w:t>
+      </w:r>
+      <w:r>
+        <w:rPr>
+          <w:lang w:val="en-US"/>
+        </w:rPr>
+        <w:t xml:space="preserve">his was followed by summarizing features, and </w:t>
+      </w:r>
+      <w:r>
+        <w:rPr>
+          <w:lang w:val="en-US"/>
+        </w:rPr>
+        <w:t xml:space="preserve">due to prediction difficulties, </w:t>
+      </w:r>
+      <w:r>
+        <w:rPr>
+          <w:lang w:val="en-US"/>
+        </w:rPr>
+        <w:t xml:space="preserve">it was slightly condensed to </w:t>
+      </w:r>
+      <w:r>
+        <w:rPr>
+          <w:lang w:val="en-US"/>
+        </w:rPr>
+        <w:t xml:space="preserve">only female and male athletes </w:t>
+      </w:r>
+      <w:r>
+        <w:rPr>
+          <w:lang w:val="en-US"/>
+        </w:rPr>
+        <w:t>who achieved race times</w:t>
+      </w:r>
+      <w:r>
+        <w:rPr>
+          <w:lang w:val="en-US"/>
+        </w:rPr>
+        <w:t xml:space="preserve"> </w:t>
+      </w:r>
+      <w:r>
+        <w:rPr>
+          <w:lang w:val="en-US"/>
+        </w:rPr>
+        <w:t>of</w:t>
+      </w:r>
+      <w:r>
+        <w:rPr>
+          <w:lang w:val="en-US"/>
+        </w:rPr>
+        <w:t xml:space="preserve"> three to five</w:t>
+      </w:r>
+      <w:r>
+        <w:rPr>
+          <w:lang w:val="en-US"/>
+        </w:rPr>
+        <w:t xml:space="preserve"> hours and less than </w:t>
+      </w:r>
+      <w:r>
+        <w:rPr>
+          <w:lang w:val="en-US"/>
+        </w:rPr>
+        <w:t>five</w:t>
+      </w:r>
+      <w:r>
+        <w:rPr>
+          <w:lang w:val="en-US"/>
+        </w:rPr>
+        <w:t xml:space="preserve"> hours, respectively</w:t>
+      </w:r>
+      <w:r>
+        <w:rPr>
+          <w:lang w:val="en-US"/>
+        </w:rPr>
+        <w:t xml:space="preserve">. </w:t>
+      </w:r>
+      <w:r>
+        <w:rPr>
+          <w:lang w:val="en-US"/>
+        </w:rPr>
+        <w:t>This CBR system was employed and evaluated using three algorithms, namely a baseline, feature selection, and multi-week feature variation. Using the Root Mean Square Error (RMSE), t</w:t>
+      </w:r>
+      <w:r>
+        <w:rPr>
+          <w:lang w:val="en-US"/>
+        </w:rPr>
+        <w:t xml:space="preserve">he experiments showed </w:t>
+      </w:r>
+      <w:r>
+        <w:rPr>
+          <w:lang w:val="en-US"/>
+        </w:rPr>
+        <w:t>that as time progressed and the athlete got closer to race day</w:t>
+      </w:r>
+      <w:r>
+        <w:rPr>
+          <w:lang w:val="en-US"/>
+        </w:rPr>
+        <w:t>, prediction accuracy got better</w:t>
+      </w:r>
+      <w:r>
+        <w:rPr>
+          <w:lang w:val="en-US"/>
+        </w:rPr>
+        <w:t xml:space="preserve"> (lower RMSE value). Although this study had promising results, future research should focus on a larger female sample population, as only 4,810 of the 19,930 athletes were females. </w:t>
+      </w:r>
+      <w:r>
+        <w:rPr>
+          <w:lang w:val="en-US"/>
+        </w:rPr>
+        <w:t>Since this prototype did not go through live-user trials</w:t>
+      </w:r>
+      <w:r>
+        <w:rPr>
+          <w:lang w:val="en-US"/>
+        </w:rPr>
+        <w:t xml:space="preserve">, it could result in incorrect training recommendations and MRT prediction in the real-world. Additionally, these could also include </w:t>
+      </w:r>
+      <w:r>
+        <w:rPr>
+          <w:lang w:val="en-US"/>
+        </w:rPr>
+        <w:t>female runners who achieved below three hours as a finish time.</w:t>
+      </w:r>
+    </w:p>
+    <w:p>
+      <w:pPr>
+        <w:jc w:val="both"/>
+        <w:rPr>
+          <w:lang w:val="en-US"/>
+        </w:rPr>
+      </w:pPr>
+      <w:r>
+        <w:rPr>
+          <w:lang w:val="en-US"/>
+        </w:rPr>
+        <w:t xml:space="preserve">The study by Ruiz-Mayo </w:t>
+      </w:r>
+      <w:r>
+        <w:rPr>
+          <w:i/>
+          <w:iCs/>
+          <w:lang w:val="en-US"/>
+        </w:rPr>
+        <w:t>et al.</w:t>
+      </w:r>
+      <w:r>
+        <w:rPr>
+          <w:lang w:val="en-US"/>
+        </w:rPr>
+        <w:t xml:space="preserve"> [11</w:t>
+      </w:r>
+      <w:r>
+        <w:rPr>
+          <w:lang w:val="en-US"/>
+        </w:rPr>
+        <w:t xml:space="preserve">] assessed the use of </w:t>
+      </w:r>
+      <w:r>
+        <w:rPr>
+          <w:lang w:val="en-US"/>
+        </w:rPr>
+        <w:t>L</w:t>
+      </w:r>
+      <w:r>
+        <w:rPr>
+          <w:lang w:val="en-US"/>
+        </w:rPr>
+        <w:t xml:space="preserve">inear </w:t>
+      </w:r>
+      <w:r>
+        <w:rPr>
+          <w:lang w:val="en-US"/>
+        </w:rPr>
+        <w:t>R</w:t>
+      </w:r>
+      <w:r>
+        <w:rPr>
+          <w:lang w:val="en-US"/>
+        </w:rPr>
+        <w:t xml:space="preserve">egression and </w:t>
+      </w:r>
+      <w:r>
+        <w:rPr>
+          <w:lang w:val="en-US"/>
+        </w:rPr>
+        <w:t>B</w:t>
+      </w:r>
+      <w:r>
+        <w:rPr>
+          <w:lang w:val="en-US"/>
+        </w:rPr>
+        <w:t xml:space="preserve">agging ML algorithms against a baseline ZeroR model, and this was performed for MRT prediction only for amateur runners. The dataset that the models were validated on was longitudinal and sequential, </w:t>
+      </w:r>
+      <w:r>
+        <w:rPr>
+          <w:lang w:val="en-US"/>
+        </w:rPr>
+        <w:lastRenderedPageBreak/>
+        <w:t xml:space="preserve">covering a six-week training window before the marathon event. </w:t>
+      </w:r>
+      <w:r>
+        <w:rPr>
+          <w:lang w:val="en-US"/>
+        </w:rPr>
+        <w:t xml:space="preserve">Given that this was secondary data, certain endurance sessions that were categorized incorrectly or had unrealistic paces were removed, and those athletes </w:t>
+      </w:r>
+      <w:r>
+        <w:rPr>
+          <w:lang w:val="en-US"/>
+        </w:rPr>
+        <w:t>who</w:t>
+      </w:r>
+      <w:r>
+        <w:rPr>
+          <w:lang w:val="en-US"/>
+        </w:rPr>
+        <w:t xml:space="preserve"> had less than three workouts per week were removed, resulting in a total of 1,000 athletes from the original </w:t>
+      </w:r>
+      <w:r>
+        <w:rPr>
+          <w:lang w:val="en-US"/>
+        </w:rPr>
+        <w:t xml:space="preserve">3,386. Before feeding this data to the ML models, multiple features of the same nature were engineered, but these were calculated on a weekly, bi-weekly, and 6-week basis. Three experiments were conducted: using the original dataset, the filtered dataset that recognizes marathon preparation characteristics, and another </w:t>
+      </w:r>
+      <w:r>
+        <w:rPr>
+          <w:lang w:val="en-US"/>
+        </w:rPr>
+        <w:t>with further filtering to exclude individuals who might have had cramps or dehydration issues during the marathon. The Bagging algorithms performed the best throughout, especially within the last experiment, with the lowest Mean Absolute Error (MAE). This study showed that through rigorous filtering of data, considerable improvements are possible when predicting the MRT. However, since the training data was gathered from athletes who participated in only two major events from a total of six, this approach cannot be generalized to other marathons. Also, more historical data could result in better predictions</w:t>
+      </w:r>
+      <w:r>
+        <w:rPr>
+          <w:lang w:val="en-US"/>
+        </w:rPr>
+        <w:t>,</w:t>
+      </w:r>
+      <w:r>
+        <w:rPr>
+          <w:lang w:val="en-US"/>
+        </w:rPr>
+        <w:t xml:space="preserve"> as the last 6 weeks of marathon training </w:t>
+      </w:r>
+      <w:r>
+        <w:rPr>
+          <w:lang w:val="en-US"/>
+        </w:rPr>
+        <w:t>hide the majority of the training period.</w:t>
+      </w:r>
+      <w:r>
+        <w:rPr>
+          <w:lang w:val="en-US"/>
+        </w:rPr>
+        <w:t xml:space="preserve"> (backed up by the author's quote: “</w:t>
+      </w:r>
+      <w:r>
+        <w:t>fairly large period of preparation of several months</w:t>
+      </w:r>
+      <w:r>
+        <w:t>”).</w:t>
+      </w:r>
+    </w:p>
+    <w:p>
+      <w:pPr>
+        <w:jc w:val="both"/>
+        <w:rPr>
+          <w:lang w:val="en-US"/>
+        </w:rPr>
+      </w:pPr>
+      <w:r>
+        <w:rPr>
+          <w:lang w:val="en-US"/>
+        </w:rPr>
+        <w:t xml:space="preserve">Lerebourg </w:t>
+      </w:r>
+      <w:r>
+        <w:rPr>
+          <w:i/>
+          <w:iCs/>
+          <w:lang w:val="en-US"/>
+        </w:rPr>
+        <w:t>et al.</w:t>
+      </w:r>
+      <w:r>
+        <w:rPr>
+          <w:lang w:val="en-US"/>
+        </w:rPr>
+        <w:t xml:space="preserve"> [12] conducted a comparative analysis between a regressor and a deep learning model to determine which one performed better in predicting the MRT, considering the accuracy and </w:t>
+      </w:r>
+      <w:r>
+        <w:rPr>
+          <w:lang w:val="en-US"/>
+        </w:rPr>
+        <w:t>precision</w:t>
+      </w:r>
+      <w:r>
+        <w:rPr>
+          <w:lang w:val="en-US"/>
+        </w:rPr>
+        <w:t xml:space="preserve"> of both models. This time, the study was evaluated on a cross-sectional time horizon data source consisting of 820 athletes who participated in a 10-kilometer and a marathon race within the same year. </w:t>
+      </w:r>
+      <w:r>
+        <w:rPr>
+          <w:lang w:val="en-US"/>
+        </w:rPr>
+        <w:t xml:space="preserve">So instead of using daily activity records for prediction, four static inputs were used. This was downscaled from a greater pool of data through a lot of filtering, such as the age, missing biometric data, and having the marathon race after the shorter one. The supervised ML models, k-Nearest Neighbor (KNN) and Artificial Neural Network (ANN), were fed normalized data to align with the </w:t>
+      </w:r>
+      <w:r>
+        <w:rPr>
+          <w:lang w:val="en-US"/>
+        </w:rPr>
+        <w:t>sigmoid</w:t>
+      </w:r>
+      <w:r>
+        <w:rPr>
+          <w:lang w:val="en-US"/>
+        </w:rPr>
+        <w:t xml:space="preserve"> transfer function requirements</w:t>
+      </w:r>
+      <w:r>
+        <w:rPr>
+          <w:lang w:val="en-US"/>
+        </w:rPr>
+        <w:t xml:space="preserve">, and both acquired low MAE values. </w:t>
+      </w:r>
+      <w:r>
+        <w:rPr>
+          <w:lang w:val="en-US"/>
+        </w:rPr>
+        <w:t>This study proved that with a limited dataset</w:t>
+      </w:r>
+      <w:r>
+        <w:rPr>
+          <w:lang w:val="en-US"/>
+        </w:rPr>
+        <w:t xml:space="preserve">, </w:t>
+      </w:r>
+      <w:r>
+        <w:rPr>
+          <w:lang w:val="en-US"/>
+        </w:rPr>
+        <w:t>the</w:t>
+      </w:r>
+      <w:r>
+        <w:rPr>
+          <w:lang w:val="en-US"/>
+        </w:rPr>
+        <w:t xml:space="preserve"> KNN ML model</w:t>
+      </w:r>
+      <w:r>
+        <w:rPr>
+          <w:lang w:val="en-US"/>
+        </w:rPr>
+        <w:t xml:space="preserve"> outperforms the ANN in estimating the MRT, which could mean that better results can prove otherwise with a larger dataset</w:t>
+      </w:r>
+      <w:r>
+        <w:rPr>
+          <w:lang w:val="en-US"/>
+        </w:rPr>
+        <w:t xml:space="preserve">. On the other hand, </w:t>
+      </w:r>
+      <w:r>
+        <w:rPr>
+          <w:lang w:val="en-US"/>
+        </w:rPr>
+        <w:t xml:space="preserve">having additional race results from </w:t>
+      </w:r>
+      <w:r>
+        <w:rPr>
+          <w:lang w:val="en-US"/>
+        </w:rPr>
+        <w:t>multiple 10-kilometer</w:t>
+      </w:r>
+      <w:r>
+        <w:rPr>
+          <w:lang w:val="en-US"/>
+        </w:rPr>
+        <w:t xml:space="preserve"> </w:t>
+      </w:r>
+      <w:r>
+        <w:rPr>
+          <w:lang w:val="en-US"/>
+        </w:rPr>
+        <w:t>and half-marathons</w:t>
+      </w:r>
+      <w:r>
+        <w:rPr>
+          <w:lang w:val="en-US"/>
+        </w:rPr>
+        <w:t xml:space="preserve"> </w:t>
+      </w:r>
+      <w:r>
+        <w:rPr>
+          <w:lang w:val="en-US"/>
+        </w:rPr>
+        <w:t>could be beneficial</w:t>
+      </w:r>
+      <w:r>
+        <w:rPr>
+          <w:lang w:val="en-US"/>
+        </w:rPr>
+        <w:t xml:space="preserve"> </w:t>
+      </w:r>
+      <w:r>
+        <w:rPr>
+          <w:lang w:val="en-US"/>
+        </w:rPr>
+        <w:t xml:space="preserve">to the model, </w:t>
+      </w:r>
+      <w:r>
+        <w:rPr>
+          <w:lang w:val="en-US"/>
+        </w:rPr>
+        <w:t>as</w:t>
+      </w:r>
+      <w:r>
+        <w:rPr>
+          <w:lang w:val="en-US"/>
+        </w:rPr>
+        <w:t xml:space="preserve"> </w:t>
+      </w:r>
+      <w:r>
+        <w:rPr>
+          <w:lang w:val="en-US"/>
+        </w:rPr>
+        <w:t xml:space="preserve">the model would learn from such trends and </w:t>
+      </w:r>
+      <w:r>
+        <w:rPr>
+          <w:lang w:val="en-US"/>
+        </w:rPr>
+        <w:t>yield</w:t>
+      </w:r>
+      <w:r>
+        <w:rPr>
+          <w:lang w:val="en-US"/>
+        </w:rPr>
+        <w:t xml:space="preserve"> even better results</w:t>
+      </w:r>
+      <w:r>
+        <w:rPr>
+          <w:lang w:val="en-US"/>
+        </w:rPr>
+        <w:t xml:space="preserve">. Also, gender imbalance is an evident issue here, </w:t>
+      </w:r>
+      <w:r>
+        <w:rPr>
+          <w:lang w:val="en-US"/>
+        </w:rPr>
+        <w:t xml:space="preserve">with </w:t>
+      </w:r>
+      <w:r>
+        <w:rPr>
+          <w:lang w:val="en-US"/>
+        </w:rPr>
+        <w:t xml:space="preserve">the majority of the sample population </w:t>
+      </w:r>
+      <w:r>
+        <w:rPr>
+          <w:lang w:val="en-US"/>
+        </w:rPr>
+        <w:t>being</w:t>
+      </w:r>
+      <w:r>
+        <w:rPr>
+          <w:lang w:val="en-US"/>
+        </w:rPr>
+        <w:t xml:space="preserve"> males</w:t>
+      </w:r>
+      <w:r>
+        <w:rPr>
+          <w:lang w:val="en-US"/>
+        </w:rPr>
+        <w:t xml:space="preserve"> (83%)</w:t>
+      </w:r>
+      <w:r>
+        <w:rPr>
+          <w:lang w:val="en-US"/>
+        </w:rPr>
+        <w:t>, which could lead to inaccurate performance predictions for females.</w:t>
+      </w:r>
+    </w:p>
+    <w:p>
+      <w:pPr>
+        <w:jc w:val="both"/>
+        <w:rPr>
+          <w:lang w:val="en-US"/>
+        </w:rPr>
+      </w:pPr>
+      <w:r>
+        <w:rPr>
+          <w:lang w:val="en-US"/>
+        </w:rPr>
+        <w:t xml:space="preserve">Dash </w:t>
+      </w:r>
+      <w:r>
+        <w:rPr>
+          <w:i/>
+          <w:iCs/>
+          <w:lang w:val="en-US"/>
+        </w:rPr>
+        <w:t>et al.</w:t>
+      </w:r>
+      <w:r>
+        <w:rPr>
+          <w:lang w:val="en-US"/>
+        </w:rPr>
+        <w:t xml:space="preserve"> [13] </w:t>
+      </w:r>
+      <w:r>
+        <w:rPr>
+          <w:lang w:val="en-US"/>
+        </w:rPr>
+        <w:t xml:space="preserve">tried to develop a predictive model </w:t>
+      </w:r>
+      <w:r>
+        <w:rPr>
+          <w:lang w:val="en-US"/>
+        </w:rPr>
+        <w:t>that applied across a wide range of race distances</w:t>
+      </w:r>
+      <w:r>
+        <w:rPr>
+          <w:lang w:val="en-US"/>
+        </w:rPr>
+        <w:t xml:space="preserve">, different elevations, and even different athlete performance levels. This was all done using the same Long Short-Term Memory (LSTM) </w:t>
+      </w:r>
+      <w:r>
+        <w:rPr>
+          <w:lang w:val="en-US"/>
+        </w:rPr>
+        <w:t>deep learning</w:t>
+      </w:r>
+      <w:r>
+        <w:rPr>
+          <w:lang w:val="en-US"/>
+        </w:rPr>
+        <w:t xml:space="preserve"> model, but only as a regressor and then as a time series regressor (TSR). As a study, it utilized a longitudinal </w:t>
+      </w:r>
+      <w:r>
+        <w:rPr>
+          <w:lang w:val="en-US"/>
+        </w:rPr>
+        <w:t xml:space="preserve">and sequential </w:t>
+      </w:r>
+      <w:r>
+        <w:rPr>
+          <w:lang w:val="en-US"/>
+        </w:rPr>
+        <w:t xml:space="preserve">time horizon dataset, with training logs averaging 6.6 years from a total of 15 recreational ultra-marathon runners. </w:t>
+      </w:r>
+      <w:r>
+        <w:rPr>
+          <w:lang w:val="en-US"/>
+        </w:rPr>
+        <w:t xml:space="preserve">Notably, these runners needed to have a 50-kilometer race result between 2022 and 2023, ranging between a specific pace, to be an eligible participant in the study. An ad-hoc algorithm was used to remove outliers, such as athletes having very short training sessions, incomplete records, and activity paces being better than the world record. </w:t>
+      </w:r>
+      <w:r>
+        <w:rPr>
+          <w:lang w:val="en-US"/>
+        </w:rPr>
+        <w:t xml:space="preserve">Two experiments were held, with the first comparing the mentioned prototypes. Then the second experiment leveraged the superior model, being the LSTM regressor against benchmark models (mainly being traditional formulas), which still proved that the LSTM is the better option. </w:t>
+      </w:r>
+      <w:r>
+        <w:rPr>
+          <w:lang w:val="en-US"/>
+        </w:rPr>
+        <w:t>The</w:t>
+      </w:r>
+      <w:r>
+        <w:rPr>
+          <w:lang w:val="en-US"/>
+        </w:rPr>
+        <w:t xml:space="preserve"> </w:t>
+      </w:r>
+      <w:r>
+        <w:rPr>
+          <w:lang w:val="en-US"/>
+        </w:rPr>
+        <w:t xml:space="preserve">predictive performance of each model was measured </w:t>
+      </w:r>
+      <w:r>
+        <w:rPr>
+          <w:lang w:val="en-US"/>
+        </w:rPr>
+        <w:t xml:space="preserve">using the Mean Absolute Percentage Error (MAPE) and accuracy. This study sustained its validity when providing acceptable predictions on unseen data. A possible improvement would be to gather and test the model on a larger sample </w:t>
+      </w:r>
+      <w:r>
+        <w:rPr>
+          <w:lang w:val="en-US"/>
+        </w:rPr>
+        <w:lastRenderedPageBreak/>
+        <w:t>population</w:t>
+      </w:r>
+      <w:r>
+        <w:rPr>
+          <w:lang w:val="en-US"/>
+        </w:rPr>
+        <w:t xml:space="preserve"> and create a generalized LSTM predictive model, rather than a custom model per athlete, as this is not feasible in the real-world. Also, having more training trajectories would highlight certain flaws within the model and aid in certain improvements.</w:t>
+      </w:r>
+      <w:r>
+        <w:rPr>
+          <w:lang w:val="en-US"/>
+        </w:rPr>
+        <w:t xml:space="preserve"> </w:t>
+      </w:r>
+    </w:p>
+    <w:p>
+      <w:pPr>
+        <w:jc w:val="both"/>
+        <w:rPr>
+          <w:lang w:val="en-US"/>
+        </w:rPr>
+      </w:pPr>
+      <w:r>
+        <w:rPr>
+          <w:lang w:val="en-US"/>
+        </w:rPr>
+        <w:t xml:space="preserve">El-Kassabi </w:t>
+      </w:r>
+      <w:r>
+        <w:rPr>
+          <w:i/>
+          <w:iCs/>
+          <w:lang w:val="en-US"/>
+        </w:rPr>
+        <w:t>et al.</w:t>
+      </w:r>
+      <w:r>
+        <w:rPr>
+          <w:lang w:val="en-US"/>
+        </w:rPr>
+        <w:t xml:space="preserve"> [14] </w:t>
+      </w:r>
+      <w:r>
+        <w:rPr>
+          <w:lang w:val="en-US"/>
+        </w:rPr>
+        <w:t>also had the same goal in mind, to predict the MRT of athletes, but this was done solely using three deep learning models, namely Recurrent Neural Networks (RNN), LSTM, and Gated Recurrent Units (GRU), which were also compared to a Linear Regression (LR) model. The study used a 5-month longitudinal and sequential time horizon, consisting of training preparation for the 2017 Boston marathon.</w:t>
+      </w:r>
+      <w:r>
+        <w:rPr>
+          <w:lang w:val="en-US"/>
+        </w:rPr>
+        <w:t xml:space="preserve"> Data cleaning, transformation, and incomplete data were handled by tools such as Talend and Trifacta wrangler, with outliers beyond the third standard deviation being removed as well. The experiments revolved around different hidden states and the use of the original and filtered dataset</w:t>
+      </w:r>
+      <w:r>
+        <w:rPr>
+          <w:lang w:val="en-US"/>
+        </w:rPr>
+        <w:t>s.</w:t>
+      </w:r>
+      <w:r>
+        <w:rPr>
+          <w:lang w:val="en-US"/>
+        </w:rPr>
+        <w:t xml:space="preserve"> Using more hidden states contributed to a slight improvement whilst removing noise resulted in significant improvements in performance prediction.</w:t>
+      </w:r>
+      <w:r>
+        <w:rPr>
+          <w:lang w:val="en-US"/>
+        </w:rPr>
+        <w:t xml:space="preserve"> This was all evaluated using the RMSE, MAE, and MAPE metrics, showing the superior performance of the GRU model over all the deep learning models and even the baseline model. The achieved results were promising and considerably accurate, but this is only exhibited upon one major marathon, so applicability to other marathons could be analyzed.  </w:t>
+      </w:r>
+      <w:r>
+        <w:rPr>
+          <w:lang w:val="en-US"/>
+        </w:rPr>
+        <w:t>Based on experimental findings</w:t>
+      </w:r>
+      <w:r>
+        <w:rPr>
+          <w:lang w:val="en-US"/>
+        </w:rPr>
+        <w:t>, applying slightly more hidden states to the models could result in slightly more precise predictions, not only for the GRU model but for all the models.</w:t>
       </w:r>
     </w:p>
     <w:p>
@@ -536,13 +1524,21 @@
               <w:rPr>
                 <w:lang w:val="en-US"/>
               </w:rPr>
-              <w:t>Sanini</w:t>
-            </w:r>
-            <w:r>
-              <w:rPr>
-                <w:lang w:val="en-US"/>
-              </w:rPr>
-              <w:t xml:space="preserve"> [7]</w:t>
+              <w:t xml:space="preserve">Lerebourg </w:t>
+            </w:r>
+            <w:r>
+              <w:rPr>
+                <w:i/>
+                <w:iCs/>
+                <w:lang w:val="en-US"/>
+              </w:rPr>
+              <w:t xml:space="preserve">et al. </w:t>
+            </w:r>
+            <w:r>
+              <w:rPr>
+                <w:lang w:val="en-US"/>
+              </w:rPr>
+              <w:t>[12]</w:t>
             </w:r>
           </w:p>
         </w:tc>
@@ -596,25 +1592,7 @@
               <w:rPr>
                 <w:lang w:val="en-US"/>
               </w:rPr>
-              <w:t xml:space="preserve">Experimental and Archival research, </w:t>
-            </w:r>
-            <w:r>
-              <w:rPr>
-                <w:lang w:val="en-US"/>
-              </w:rPr>
-              <w:t xml:space="preserve">Cross-sectional and </w:t>
-            </w:r>
-            <w:r>
-              <w:rPr>
-                <w:lang w:val="en-US"/>
-              </w:rPr>
-              <w:t>Longitudinal</w:t>
-            </w:r>
-            <w:r>
-              <w:rPr>
-                <w:lang w:val="en-US"/>
-              </w:rPr>
-              <w:t xml:space="preserve"> elements</w:t>
+              <w:t xml:space="preserve">Experimental and Archival research, Cross-sectional </w:t>
             </w:r>
           </w:p>
         </w:tc>
@@ -636,21 +1614,7 @@
               <w:rPr>
                 <w:lang w:val="en-US"/>
               </w:rPr>
-              <w:t xml:space="preserve">Lerebourg </w:t>
-            </w:r>
-            <w:r>
-              <w:rPr>
-                <w:i/>
-                <w:iCs/>
-                <w:lang w:val="en-US"/>
-              </w:rPr>
-              <w:t xml:space="preserve">et al. </w:t>
-            </w:r>
-            <w:r>
-              <w:rPr>
-                <w:lang w:val="en-US"/>
-              </w:rPr>
-              <w:t>[12]</w:t>
+              <w:t>Dash [13]</w:t>
             </w:r>
           </w:p>
         </w:tc>
@@ -704,7 +1668,7 @@
               <w:rPr>
                 <w:lang w:val="en-US"/>
               </w:rPr>
-              <w:t xml:space="preserve">Experimental and Archival research, Cross-sectional </w:t>
+              <w:t>Experimental and Archival research, Longitudinal</w:t>
             </w:r>
           </w:p>
         </w:tc>
@@ -729,7 +1693,21 @@
               <w:rPr>
                 <w:lang w:val="en-US"/>
               </w:rPr>
-              <w:t>Dash [13]</w:t>
+              <w:t xml:space="preserve">El-Kassabi </w:t>
+            </w:r>
+            <w:r>
+              <w:rPr>
+                <w:i/>
+                <w:iCs/>
+                <w:lang w:val="en-US"/>
+              </w:rPr>
+              <w:t>et al.</w:t>
+            </w:r>
+            <w:r>
+              <w:rPr>
+                <w:lang w:val="en-US"/>
+              </w:rPr>
+              <w:t xml:space="preserve"> [14]</w:t>
             </w:r>
           </w:p>
         </w:tc>
@@ -773,99 +1751,9 @@
           </w:tcPr>
           <w:p>
             <w:pPr>
+              <w:keepNext/>
               <w:spacing w:line="276" w:lineRule="auto"/>
               <w:cnfStyle w:val="000000100000" w:firstRow="0" w:lastRow="0" w:firstColumn="0" w:lastColumn="0" w:oddVBand="0" w:evenVBand="0" w:oddHBand="1" w:evenHBand="0" w:firstRowFirstColumn="0" w:firstRowLastColumn="0" w:lastRowFirstColumn="0" w:lastRowLastColumn="0"/>
-              <w:rPr>
-                <w:lang w:val="en-US"/>
-              </w:rPr>
-            </w:pPr>
-            <w:r>
-              <w:rPr>
-                <w:lang w:val="en-US"/>
-              </w:rPr>
-              <w:t>Experimental and Archival research, Longitudinal</w:t>
-            </w:r>
-          </w:p>
-        </w:tc>
-      </w:tr>
-      <w:tr>
-        <w:tc>
-          <w:tcPr>
-            <w:cnfStyle w:val="001000000000" w:firstRow="0" w:lastRow="0" w:firstColumn="1" w:lastColumn="0" w:oddVBand="0" w:evenVBand="0" w:oddHBand="0" w:evenHBand="0" w:firstRowFirstColumn="0" w:firstRowLastColumn="0" w:lastRowFirstColumn="0" w:lastRowLastColumn="0"/>
-            <w:tcW w:w="2254" w:type="dxa"/>
-          </w:tcPr>
-          <w:p>
-            <w:pPr>
-              <w:spacing w:line="276" w:lineRule="auto"/>
-              <w:rPr>
-                <w:lang w:val="en-US"/>
-              </w:rPr>
-            </w:pPr>
-            <w:r>
-              <w:rPr>
-                <w:lang w:val="en-US"/>
-              </w:rPr>
-              <w:t xml:space="preserve">El-Kassabi </w:t>
-            </w:r>
-            <w:r>
-              <w:rPr>
-                <w:i/>
-                <w:iCs/>
-                <w:lang w:val="en-US"/>
-              </w:rPr>
-              <w:t>et al.</w:t>
-            </w:r>
-            <w:r>
-              <w:rPr>
-                <w:lang w:val="en-US"/>
-              </w:rPr>
-              <w:t xml:space="preserve"> [14]</w:t>
-            </w:r>
-          </w:p>
-        </w:tc>
-        <w:tc>
-          <w:tcPr>
-            <w:tcW w:w="2254" w:type="dxa"/>
-          </w:tcPr>
-          <w:p>
-            <w:pPr>
-              <w:spacing w:line="276" w:lineRule="auto"/>
-              <w:cnfStyle w:val="000000000000" w:firstRow="0" w:lastRow="0" w:firstColumn="0" w:lastColumn="0" w:oddVBand="0" w:evenVBand="0" w:oddHBand="0" w:evenHBand="0" w:firstRowFirstColumn="0" w:firstRowLastColumn="0" w:lastRowFirstColumn="0" w:lastRowLastColumn="0"/>
-              <w:rPr>
-                <w:lang w:val="en-US"/>
-              </w:rPr>
-            </w:pPr>
-          </w:p>
-        </w:tc>
-        <w:tc>
-          <w:tcPr>
-            <w:tcW w:w="1583" w:type="dxa"/>
-          </w:tcPr>
-          <w:p>
-            <w:pPr>
-              <w:spacing w:line="276" w:lineRule="auto"/>
-              <w:cnfStyle w:val="000000000000" w:firstRow="0" w:lastRow="0" w:firstColumn="0" w:lastColumn="0" w:oddVBand="0" w:evenVBand="0" w:oddHBand="0" w:evenHBand="0" w:firstRowFirstColumn="0" w:firstRowLastColumn="0" w:lastRowFirstColumn="0" w:lastRowLastColumn="0"/>
-              <w:rPr>
-                <w:lang w:val="en-US"/>
-              </w:rPr>
-            </w:pPr>
-            <w:r>
-              <w:rPr>
-                <w:lang w:val="en-US"/>
-              </w:rPr>
-              <w:t>Positivist, Deductive</w:t>
-            </w:r>
-          </w:p>
-        </w:tc>
-        <w:tc>
-          <w:tcPr>
-            <w:tcW w:w="2925" w:type="dxa"/>
-          </w:tcPr>
-          <w:p>
-            <w:pPr>
-              <w:keepNext/>
-              <w:spacing w:line="276" w:lineRule="auto"/>
-              <w:cnfStyle w:val="000000000000" w:firstRow="0" w:lastRow="0" w:firstColumn="0" w:lastColumn="0" w:oddVBand="0" w:evenVBand="0" w:oddHBand="0" w:evenHBand="0" w:firstRowFirstColumn="0" w:firstRowLastColumn="0" w:lastRowFirstColumn="0" w:lastRowLastColumn="0"/>
               <w:rPr>
                 <w:lang w:val="en-US"/>
               </w:rPr>
@@ -1191,13 +2079,21 @@
               <w:rPr>
                 <w:lang w:val="en-US"/>
               </w:rPr>
-              <w:t>Sanini</w:t>
-            </w:r>
-            <w:r>
-              <w:rPr>
-                <w:lang w:val="en-US"/>
-              </w:rPr>
-              <w:t xml:space="preserve"> [7]</w:t>
+              <w:t xml:space="preserve">Lerebourg </w:t>
+            </w:r>
+            <w:r>
+              <w:rPr>
+                <w:i/>
+                <w:iCs/>
+                <w:lang w:val="en-US"/>
+              </w:rPr>
+              <w:t xml:space="preserve">et al. </w:t>
+            </w:r>
+            <w:r>
+              <w:rPr>
+                <w:lang w:val="en-US"/>
+              </w:rPr>
+              <w:t>[12]</w:t>
             </w:r>
           </w:p>
         </w:tc>
@@ -1267,21 +2163,7 @@
               <w:rPr>
                 <w:lang w:val="en-US"/>
               </w:rPr>
-              <w:t xml:space="preserve">Lerebourg </w:t>
-            </w:r>
-            <w:r>
-              <w:rPr>
-                <w:i/>
-                <w:iCs/>
-                <w:lang w:val="en-US"/>
-              </w:rPr>
-              <w:t xml:space="preserve">et al. </w:t>
-            </w:r>
-            <w:r>
-              <w:rPr>
-                <w:lang w:val="en-US"/>
-              </w:rPr>
-              <w:t>[12]</w:t>
+              <w:t>Dash [13]</w:t>
             </w:r>
           </w:p>
         </w:tc>
@@ -1354,7 +2236,21 @@
               <w:rPr>
                 <w:lang w:val="en-US"/>
               </w:rPr>
-              <w:t>Dash [13]</w:t>
+              <w:t xml:space="preserve">El-Kassabi </w:t>
+            </w:r>
+            <w:r>
+              <w:rPr>
+                <w:i/>
+                <w:iCs/>
+                <w:lang w:val="en-US"/>
+              </w:rPr>
+              <w:t>et al.</w:t>
+            </w:r>
+            <w:r>
+              <w:rPr>
+                <w:lang w:val="en-US"/>
+              </w:rPr>
+              <w:t xml:space="preserve"> [14]</w:t>
             </w:r>
           </w:p>
         </w:tc>
@@ -1386,90 +2282,6 @@
             <w:pPr>
               <w:spacing w:line="276" w:lineRule="auto"/>
               <w:cnfStyle w:val="000000100000" w:firstRow="0" w:lastRow="0" w:firstColumn="0" w:lastColumn="0" w:oddVBand="0" w:evenVBand="0" w:oddHBand="1" w:evenHBand="0" w:firstRowFirstColumn="0" w:firstRowLastColumn="0" w:lastRowFirstColumn="0" w:lastRowLastColumn="0"/>
-              <w:rPr>
-                <w:lang w:val="en-US"/>
-              </w:rPr>
-            </w:pPr>
-          </w:p>
-        </w:tc>
-        <w:tc>
-          <w:tcPr>
-            <w:tcW w:w="2254" w:type="dxa"/>
-          </w:tcPr>
-          <w:p>
-            <w:pPr>
-              <w:spacing w:line="276" w:lineRule="auto"/>
-              <w:cnfStyle w:val="000000100000" w:firstRow="0" w:lastRow="0" w:firstColumn="0" w:lastColumn="0" w:oddVBand="0" w:evenVBand="0" w:oddHBand="1" w:evenHBand="0" w:firstRowFirstColumn="0" w:firstRowLastColumn="0" w:lastRowFirstColumn="0" w:lastRowLastColumn="0"/>
-              <w:rPr>
-                <w:lang w:val="en-US"/>
-              </w:rPr>
-            </w:pPr>
-          </w:p>
-        </w:tc>
-      </w:tr>
-      <w:tr>
-        <w:tc>
-          <w:tcPr>
-            <w:cnfStyle w:val="001000000000" w:firstRow="0" w:lastRow="0" w:firstColumn="1" w:lastColumn="0" w:oddVBand="0" w:evenVBand="0" w:oddHBand="0" w:evenHBand="0" w:firstRowFirstColumn="0" w:firstRowLastColumn="0" w:lastRowFirstColumn="0" w:lastRowLastColumn="0"/>
-            <w:tcW w:w="2254" w:type="dxa"/>
-          </w:tcPr>
-          <w:p>
-            <w:pPr>
-              <w:spacing w:line="276" w:lineRule="auto"/>
-              <w:rPr>
-                <w:lang w:val="en-US"/>
-              </w:rPr>
-            </w:pPr>
-            <w:r>
-              <w:rPr>
-                <w:lang w:val="en-US"/>
-              </w:rPr>
-              <w:t xml:space="preserve">El-Kassabi </w:t>
-            </w:r>
-            <w:r>
-              <w:rPr>
-                <w:i/>
-                <w:iCs/>
-                <w:lang w:val="en-US"/>
-              </w:rPr>
-              <w:t>et al.</w:t>
-            </w:r>
-            <w:r>
-              <w:rPr>
-                <w:lang w:val="en-US"/>
-              </w:rPr>
-              <w:t xml:space="preserve"> [14]</w:t>
-            </w:r>
-          </w:p>
-        </w:tc>
-        <w:tc>
-          <w:tcPr>
-            <w:tcW w:w="2254" w:type="dxa"/>
-          </w:tcPr>
-          <w:p>
-            <w:pPr>
-              <w:spacing w:line="276" w:lineRule="auto"/>
-              <w:cnfStyle w:val="000000000000" w:firstRow="0" w:lastRow="0" w:firstColumn="0" w:lastColumn="0" w:oddVBand="0" w:evenVBand="0" w:oddHBand="0" w:evenHBand="0" w:firstRowFirstColumn="0" w:firstRowLastColumn="0" w:lastRowFirstColumn="0" w:lastRowLastColumn="0"/>
-              <w:rPr>
-                <w:lang w:val="en-US"/>
-              </w:rPr>
-            </w:pPr>
-            <w:r>
-              <w:rPr>
-                <w:lang w:val="en-US"/>
-              </w:rPr>
-              <w:t>Mono-method quantitative</w:t>
-            </w:r>
-          </w:p>
-        </w:tc>
-        <w:tc>
-          <w:tcPr>
-            <w:tcW w:w="2254" w:type="dxa"/>
-          </w:tcPr>
-          <w:p>
-            <w:pPr>
-              <w:spacing w:line="276" w:lineRule="auto"/>
-              <w:cnfStyle w:val="000000000000" w:firstRow="0" w:lastRow="0" w:firstColumn="0" w:lastColumn="0" w:oddVBand="0" w:evenVBand="0" w:oddHBand="0" w:evenHBand="0" w:firstRowFirstColumn="0" w:firstRowLastColumn="0" w:lastRowFirstColumn="0" w:lastRowLastColumn="0"/>
               <w:rPr>
                 <w:lang w:val="en-US"/>
               </w:rPr>
@@ -1484,7 +2296,7 @@
             <w:pPr>
               <w:keepNext/>
               <w:spacing w:line="276" w:lineRule="auto"/>
-              <w:cnfStyle w:val="000000000000" w:firstRow="0" w:lastRow="0" w:firstColumn="0" w:lastColumn="0" w:oddVBand="0" w:evenVBand="0" w:oddHBand="0" w:evenHBand="0" w:firstRowFirstColumn="0" w:firstRowLastColumn="0" w:lastRowFirstColumn="0" w:lastRowLastColumn="0"/>
+              <w:cnfStyle w:val="000000100000" w:firstRow="0" w:lastRow="0" w:firstColumn="0" w:lastColumn="0" w:oddVBand="0" w:evenVBand="0" w:oddHBand="1" w:evenHBand="0" w:firstRowFirstColumn="0" w:firstRowLastColumn="0" w:lastRowFirstColumn="0" w:lastRowLastColumn="0"/>
               <w:rPr>
                 <w:lang w:val="en-US"/>
               </w:rPr>
@@ -2014,15 +2826,7 @@
         <w:t xml:space="preserve"> </w:t>
       </w:r>
       <w:r>
-        <w:t xml:space="preserve">M. S. </w:t>
-      </w:r>
-      <w:proofErr w:type="spellStart"/>
-      <w:r>
-        <w:t>Sainin</w:t>
-      </w:r>
-      <w:proofErr w:type="spellEnd"/>
-      <w:r>
-        <w:t xml:space="preserve">, “Regression-based Finish Time Prediction of 100km Trail Running using Structured Athlete Performance,” in </w:t>
+        <w:t xml:space="preserve">M. S. Sainin, “Regression-based Finish Time Prediction of 100km Trail Running using Structured Athlete Performance,” in </w:t>
       </w:r>
       <w:r>
         <w:rPr>
@@ -2123,33 +2927,20 @@
       <w:pPr>
         <w:spacing w:line="360" w:lineRule="auto"/>
         <w:jc w:val="both"/>
-        <w:rPr>
-          <w:lang w:val="en-MT"/>
-        </w:rPr>
       </w:pPr>
       <w:r>
-        <w:rPr>
-          <w:lang w:val="en-MT"/>
-        </w:rPr>
         <w:t>[10]</w:t>
       </w:r>
       <w:r>
-        <w:rPr>
-          <w:lang w:val="en-MT"/>
-        </w:rPr>
         <w:t xml:space="preserve"> </w:t>
       </w:r>
       <w:r>
-        <w:rPr>
-          <w:lang w:val="en-MT"/>
-        </w:rPr>
         <w:t xml:space="preserve">C. Feely, B. Caulfield, A. Lawlor, and B. Smyth, “Providing Explainable Race-Time Predictions and Training Plan Recommendations to Marathon Runners,” in </w:t>
       </w:r>
       <w:r>
         <w:rPr>
           <w:i/>
           <w:iCs/>
-          <w:lang w:val="en-MT"/>
         </w:rPr>
         <w:t xml:space="preserve">Fourteenth ACM Conference on </w:t>
       </w:r>
@@ -2157,44 +2948,30 @@
         <w:rPr>
           <w:i/>
           <w:iCs/>
-          <w:lang w:val="en-MT"/>
         </w:rPr>
         <w:lastRenderedPageBreak/>
         <w:t>Recommender Systems</w:t>
       </w:r>
       <w:r>
-        <w:rPr>
-          <w:lang w:val="en-MT"/>
-        </w:rPr>
         <w:t xml:space="preserve">, Virtual Event Brazil: ACM, Sep. 2020, pp. 539–544. </w:t>
       </w:r>
       <w:proofErr w:type="spellStart"/>
       <w:r>
-        <w:rPr>
-          <w:lang w:val="en-MT"/>
-        </w:rPr>
         <w:t>doi</w:t>
       </w:r>
       <w:proofErr w:type="spellEnd"/>
       <w:r>
-        <w:rPr>
-          <w:lang w:val="en-MT"/>
-        </w:rPr>
         <w:t xml:space="preserve">: </w:t>
       </w:r>
       <w:hyperlink r:id="rId13" w:history="1">
         <w:r>
           <w:rPr>
             <w:rStyle w:val="Hyperlink"/>
-            <w:lang w:val="en-MT"/>
           </w:rPr>
           <w:t>10.1145/3383313.3412220</w:t>
         </w:r>
       </w:hyperlink>
       <w:r>
-        <w:rPr>
-          <w:lang w:val="en-MT"/>
-        </w:rPr>
         <w:t>.</w:t>
       </w:r>
     </w:p>
@@ -2202,40 +2979,22 @@
       <w:pPr>
         <w:spacing w:line="360" w:lineRule="auto"/>
         <w:jc w:val="both"/>
-        <w:rPr>
-          <w:lang w:val="en-MT"/>
-        </w:rPr>
       </w:pPr>
       <w:r>
-        <w:rPr>
-          <w:lang w:val="en-MT"/>
-        </w:rPr>
         <w:t>[11]</w:t>
       </w:r>
       <w:r>
-        <w:rPr>
-          <w:lang w:val="en-MT"/>
-        </w:rPr>
         <w:t xml:space="preserve"> </w:t>
       </w:r>
       <w:r>
-        <w:rPr>
-          <w:lang w:val="en-MT"/>
-        </w:rPr>
         <w:t xml:space="preserve">D. Ruiz-Mayo, E. Pulido, and G. </w:t>
       </w:r>
       <w:proofErr w:type="spellStart"/>
       <w:r>
-        <w:rPr>
-          <w:lang w:val="en-MT"/>
-        </w:rPr>
         <w:t>Martınez</w:t>
       </w:r>
       <w:proofErr w:type="spellEnd"/>
       <w:r>
-        <w:rPr>
-          <w:lang w:val="en-MT"/>
-        </w:rPr>
         <w:t>-Munoz, “Marathon Performance Prediction of Amateur Runners based on Training Session Data”.</w:t>
       </w:r>
     </w:p>
@@ -2243,111 +3002,67 @@
       <w:pPr>
         <w:spacing w:line="360" w:lineRule="auto"/>
         <w:jc w:val="both"/>
-        <w:rPr>
-          <w:lang w:val="en-MT"/>
-        </w:rPr>
       </w:pPr>
       <w:r>
-        <w:rPr>
-          <w:lang w:val="en-MT"/>
-        </w:rPr>
         <w:t>[12]</w:t>
       </w:r>
       <w:r>
-        <w:rPr>
-          <w:lang w:val="en-MT"/>
-        </w:rPr>
         <w:t xml:space="preserve"> </w:t>
       </w:r>
       <w:r>
-        <w:rPr>
-          <w:lang w:val="en-MT"/>
-        </w:rPr>
         <w:t xml:space="preserve">L. Lerebourg, D. </w:t>
       </w:r>
       <w:proofErr w:type="spellStart"/>
       <w:r>
-        <w:rPr>
-          <w:lang w:val="en-MT"/>
-        </w:rPr>
         <w:t>Saboul</w:t>
       </w:r>
       <w:proofErr w:type="spellEnd"/>
       <w:r>
-        <w:rPr>
-          <w:lang w:val="en-MT"/>
-        </w:rPr>
         <w:t xml:space="preserve">, M. </w:t>
       </w:r>
       <w:proofErr w:type="spellStart"/>
       <w:r>
-        <w:rPr>
-          <w:lang w:val="en-MT"/>
-        </w:rPr>
         <w:t>Clémençon</w:t>
       </w:r>
       <w:proofErr w:type="spellEnd"/>
       <w:r>
-        <w:rPr>
-          <w:lang w:val="en-MT"/>
-        </w:rPr>
         <w:t xml:space="preserve">, and J. B. </w:t>
       </w:r>
       <w:proofErr w:type="spellStart"/>
       <w:r>
-        <w:rPr>
-          <w:lang w:val="en-MT"/>
-        </w:rPr>
         <w:t>Coquart</w:t>
       </w:r>
       <w:proofErr w:type="spellEnd"/>
       <w:r>
-        <w:rPr>
-          <w:lang w:val="en-MT"/>
-        </w:rPr>
         <w:t xml:space="preserve">, “Prediction of Marathon Performance using Artificial Intelligence,” </w:t>
       </w:r>
       <w:r>
         <w:rPr>
           <w:i/>
           <w:iCs/>
-          <w:lang w:val="en-MT"/>
         </w:rPr>
         <w:t>Int J Sports Med</w:t>
       </w:r>
       <w:r>
-        <w:rPr>
-          <w:lang w:val="en-MT"/>
-        </w:rPr>
         <w:t xml:space="preserve">, vol. 44, no. 05, pp. 352–360, May 2023, </w:t>
       </w:r>
       <w:proofErr w:type="spellStart"/>
       <w:r>
-        <w:rPr>
-          <w:lang w:val="en-MT"/>
-        </w:rPr>
         <w:t>doi</w:t>
       </w:r>
       <w:proofErr w:type="spellEnd"/>
       <w:r>
-        <w:rPr>
-          <w:lang w:val="en-MT"/>
-        </w:rPr>
         <w:t xml:space="preserve">: </w:t>
       </w:r>
       <w:hyperlink r:id="rId14" w:history="1">
         <w:r>
           <w:rPr>
             <w:rStyle w:val="Hyperlink"/>
-            <w:lang w:val="en-MT"/>
           </w:rPr>
           <w:t>10.1055/a-1993-2371</w:t>
         </w:r>
       </w:hyperlink>
       <w:r>
-        <w:rPr>
-          <w:lang w:val="en-MT"/>
-        </w:rPr>
         <w:t>.</w:t>
       </w:r>
     </w:p>
@@ -2355,81 +3070,49 @@
       <w:pPr>
         <w:spacing w:line="360" w:lineRule="auto"/>
         <w:jc w:val="both"/>
-        <w:rPr>
-          <w:lang w:val="en-MT"/>
-        </w:rPr>
       </w:pPr>
       <w:r>
-        <w:rPr>
-          <w:lang w:val="en-MT"/>
-        </w:rPr>
         <w:t>[1</w:t>
       </w:r>
       <w:r>
-        <w:rPr>
-          <w:lang w:val="en-MT"/>
-        </w:rPr>
         <w:t>3</w:t>
       </w:r>
       <w:r>
-        <w:rPr>
-          <w:lang w:val="en-MT"/>
-        </w:rPr>
         <w:t>]</w:t>
       </w:r>
       <w:r>
-        <w:rPr>
-          <w:lang w:val="en-MT"/>
-        </w:rPr>
         <w:t xml:space="preserve"> </w:t>
       </w:r>
       <w:r>
-        <w:rPr>
-          <w:lang w:val="en-MT"/>
-        </w:rPr>
         <w:t xml:space="preserve">S. Dash, “Win Your Race Goal: A Generalized Approach to Prediction of Running Performance,” </w:t>
       </w:r>
       <w:r>
         <w:rPr>
           <w:i/>
           <w:iCs/>
-          <w:lang w:val="en-MT"/>
         </w:rPr>
         <w:t>Sports Med Int Open</w:t>
       </w:r>
       <w:r>
-        <w:rPr>
-          <w:lang w:val="en-MT"/>
-        </w:rPr>
         <w:t xml:space="preserve">, vol. 08, no. CP, p. a-2401-6234, Oct. 2024, </w:t>
       </w:r>
       <w:proofErr w:type="spellStart"/>
       <w:r>
-        <w:rPr>
-          <w:lang w:val="en-MT"/>
-        </w:rPr>
         <w:t>doi</w:t>
       </w:r>
       <w:proofErr w:type="spellEnd"/>
       <w:r>
-        <w:rPr>
-          <w:lang w:val="en-MT"/>
-        </w:rPr>
         <w:t xml:space="preserve">: </w:t>
       </w:r>
       <w:hyperlink r:id="rId15" w:history="1">
         <w:r>
           <w:rPr>
             <w:rStyle w:val="Hyperlink"/>
-            <w:lang w:val="en-MT"/>
           </w:rPr>
           <w:t>10.1055/a-2401-6234</w:t>
         </w:r>
       </w:hyperlink>
       <w:r>
-        <w:rPr>
-          <w:lang w:val="en-MT"/>
-        </w:rPr>
         <w:t>.</w:t>
       </w:r>
     </w:p>
@@ -2437,104 +3120,63 @@
       <w:pPr>
         <w:spacing w:line="360" w:lineRule="auto"/>
         <w:jc w:val="both"/>
-        <w:rPr>
-          <w:lang w:val="en-MT"/>
-        </w:rPr>
       </w:pPr>
       <w:r>
-        <w:rPr>
-          <w:lang w:val="en-MT"/>
-        </w:rPr>
         <w:t>[1</w:t>
       </w:r>
       <w:r>
-        <w:rPr>
-          <w:lang w:val="en-MT"/>
-        </w:rPr>
         <w:t>4</w:t>
       </w:r>
       <w:r>
-        <w:rPr>
-          <w:lang w:val="en-MT"/>
-        </w:rPr>
         <w:t>]</w:t>
       </w:r>
       <w:r>
-        <w:rPr>
-          <w:lang w:val="en-MT"/>
-        </w:rPr>
         <w:t xml:space="preserve"> </w:t>
       </w:r>
       <w:r>
-        <w:rPr>
-          <w:lang w:val="en-MT"/>
-        </w:rPr>
         <w:t xml:space="preserve">H. T. El-Kassabi, K. Khalil, and M. A. </w:t>
       </w:r>
       <w:proofErr w:type="spellStart"/>
       <w:r>
-        <w:rPr>
-          <w:lang w:val="en-MT"/>
-        </w:rPr>
         <w:t>Serhani</w:t>
       </w:r>
       <w:proofErr w:type="spellEnd"/>
       <w:r>
-        <w:rPr>
-          <w:lang w:val="en-MT"/>
-        </w:rPr>
         <w:t xml:space="preserve">, “Deep Learning Approach for Forecasting Athletes’ Performance in Sports Tournaments,” in </w:t>
       </w:r>
       <w:r>
         <w:rPr>
           <w:i/>
           <w:iCs/>
-          <w:lang w:val="en-MT"/>
         </w:rPr>
         <w:t>Proceedings of the 13th International Conference on Intelligent Systems: Theories and Applications</w:t>
       </w:r>
       <w:r>
-        <w:rPr>
-          <w:lang w:val="en-MT"/>
-        </w:rPr>
         <w:t xml:space="preserve">, Rabat Morocco: ACM, Sep. 2020, pp. 1–6. </w:t>
       </w:r>
       <w:proofErr w:type="spellStart"/>
       <w:r>
-        <w:rPr>
-          <w:lang w:val="en-MT"/>
-        </w:rPr>
         <w:t>doi</w:t>
       </w:r>
       <w:proofErr w:type="spellEnd"/>
       <w:r>
-        <w:rPr>
-          <w:lang w:val="en-MT"/>
-        </w:rPr>
         <w:t xml:space="preserve">: </w:t>
       </w:r>
       <w:hyperlink r:id="rId16" w:history="1">
         <w:r>
           <w:rPr>
             <w:rStyle w:val="Hyperlink"/>
-            <w:lang w:val="en-MT"/>
           </w:rPr>
           <w:t>10.1145/3419604.3419786</w:t>
         </w:r>
       </w:hyperlink>
       <w:r>
-        <w:rPr>
-          <w:lang w:val="en-MT"/>
-        </w:rPr>
         <w:t>.</w:t>
       </w:r>
     </w:p>
     <w:p>
       <w:pPr>
         <w:jc w:val="both"/>
-        <w:rPr>
-          <w:lang w:val="en-MT"/>
-        </w:rPr>
       </w:pPr>
     </w:p>
     <w:p>

</xml_diff>

<commit_message>
Continued working on Milestone 02
Synthesized 2 papers and critically evaluated them along with another paper.
</commit_message>
<xml_diff>
--- a/doc/milestone_02/miguelabela_swd63a_milestone_02.docx
+++ b/doc/milestone_02/miguelabela_swd63a_milestone_02.docx
@@ -269,7 +269,31 @@
         <w:rPr>
           <w:lang w:val="en-US"/>
         </w:rPr>
-        <w:t>With the same objective in mind</w:t>
+        <w:t xml:space="preserve">With </w:t>
+      </w:r>
+      <w:r>
+        <w:rPr>
+          <w:lang w:val="en-US"/>
+        </w:rPr>
+        <w:t>very similar</w:t>
+      </w:r>
+      <w:r>
+        <w:rPr>
+          <w:lang w:val="en-US"/>
+        </w:rPr>
+        <w:t xml:space="preserve"> objective</w:t>
+      </w:r>
+      <w:r>
+        <w:rPr>
+          <w:lang w:val="en-US"/>
+        </w:rPr>
+        <w:t>s</w:t>
+      </w:r>
+      <w:r>
+        <w:rPr>
+          <w:lang w:val="en-US"/>
+        </w:rPr>
+        <w:t xml:space="preserve"> in mind</w:t>
       </w:r>
       <w:r>
         <w:rPr>
@@ -293,37 +317,13 @@
         <w:rPr>
           <w:lang w:val="en-US"/>
         </w:rPr>
-        <w:t>[10 – 14] adopt</w:t>
-      </w:r>
-      <w:r>
-        <w:rPr>
-          <w:lang w:val="en-US"/>
-        </w:rPr>
-        <w:t>ed</w:t>
-      </w:r>
-      <w:r>
-        <w:rPr>
-          <w:lang w:val="en-US"/>
-        </w:rPr>
-        <w:t xml:space="preserve"> a positivist standpoint</w:t>
-      </w:r>
-      <w:r>
-        <w:rPr>
-          <w:lang w:val="en-US"/>
-        </w:rPr>
-        <w:t xml:space="preserve">,  considering an individual’s performance in a marathon event a continuous, </w:t>
-      </w:r>
-      <w:r>
-        <w:rPr>
-          <w:lang w:val="en-US"/>
-        </w:rPr>
-        <w:t>measurable</w:t>
-      </w:r>
-      <w:r>
-        <w:rPr>
-          <w:lang w:val="en-US"/>
-        </w:rPr>
-        <w:t xml:space="preserve">, and objective outcome that can be precisely calculated by machine learning (ML) </w:t>
+        <w:t>[10 – 14] adopted a positivist standpoint</w:t>
+      </w:r>
+      <w:r>
+        <w:rPr>
+          <w:lang w:val="en-US"/>
+        </w:rPr>
+        <w:t xml:space="preserve">,  considering an individual’s performance in a marathon event a continuous, measurable, and objective outcome that can be precisely calculated by machine learning (ML) </w:t>
       </w:r>
       <w:r>
         <w:rPr>
@@ -395,7 +395,7 @@
         <w:rPr>
           <w:lang w:val="en-US"/>
         </w:rPr>
-        <w:t>archival</w:t>
+        <w:t>historical</w:t>
       </w:r>
       <w:r>
         <w:rPr>
@@ -407,7 +407,43 @@
         <w:rPr>
           <w:lang w:val="en-US"/>
         </w:rPr>
-        <w:t xml:space="preserve"> Additionally, they entirely depend on quantitative, numerical data, distinguishing them as mono-method quantitative methodological studies. No qualitative information is gathered about an athlete’s emotional state</w:t>
+        <w:t xml:space="preserve"> </w:t>
+      </w:r>
+      <w:r>
+        <w:rPr>
+          <w:lang w:val="en-US"/>
+        </w:rPr>
+        <w:t>Almost all studies utilized longitudinal data gathered over multiple years, except for [1</w:t>
+      </w:r>
+      <w:r>
+        <w:rPr>
+          <w:lang w:val="en-US"/>
+        </w:rPr>
+        <w:t>1</w:t>
+      </w:r>
+      <w:r>
+        <w:rPr>
+          <w:lang w:val="en-US"/>
+        </w:rPr>
+        <w:t xml:space="preserve">]. </w:t>
+      </w:r>
+      <w:r>
+        <w:rPr>
+          <w:lang w:val="en-US"/>
+        </w:rPr>
+        <w:t xml:space="preserve">Additionally, they entirely depend on quantitative, numerical data, distinguishing them as mono-method quantitative methodological studies. No qualitative information </w:t>
+      </w:r>
+      <w:r>
+        <w:rPr>
+          <w:lang w:val="en-US"/>
+        </w:rPr>
+        <w:t>was</w:t>
+      </w:r>
+      <w:r>
+        <w:rPr>
+          <w:lang w:val="en-US"/>
+        </w:rPr>
+        <w:t xml:space="preserve"> gathered about an athlete’s emotional state</w:t>
       </w:r>
       <w:r>
         <w:rPr>
@@ -426,12 +462,6 @@
           <w:lang w:val="en-US"/>
         </w:rPr>
         <w:t>.</w:t>
-      </w:r>
-      <w:r>
-        <w:rPr>
-          <w:lang w:val="en-US"/>
-        </w:rPr>
-        <w:t xml:space="preserve"> They only differ in the time-horizon aspect of the research onion.</w:t>
       </w:r>
     </w:p>
     <w:p>
@@ -445,13 +475,7 @@
         <w:rPr>
           <w:lang w:val="en-US"/>
         </w:rPr>
-        <w:t xml:space="preserve">In the case of </w:t>
-      </w:r>
-      <w:r>
-        <w:rPr>
-          <w:lang w:val="en-US"/>
-        </w:rPr>
-        <w:t xml:space="preserve">Feely </w:t>
+        <w:t xml:space="preserve">Both Feely </w:t>
       </w:r>
       <w:r>
         <w:rPr>
@@ -465,19 +489,27 @@
         <w:rPr>
           <w:lang w:val="en-US"/>
         </w:rPr>
-        <w:t xml:space="preserve"> [10], </w:t>
-      </w:r>
-      <w:r>
-        <w:rPr>
-          <w:lang w:val="en-US"/>
-        </w:rPr>
-        <w:t xml:space="preserve">a recommender system for weekly training schedules was developed using a case-based reasoning (CBR) approach, leading to highly accurate marathon race time (MRT) predictions. </w:t>
-      </w:r>
-      <w:r>
-        <w:rPr>
-          <w:lang w:val="en-US"/>
-        </w:rPr>
-        <w:t>A longitudinal time</w:t>
+        <w:t xml:space="preserve"> [10] and </w:t>
+      </w:r>
+      <w:r>
+        <w:rPr>
+          <w:lang w:val="en-US"/>
+        </w:rPr>
+        <w:t xml:space="preserve">Lerebourg </w:t>
+      </w:r>
+      <w:r>
+        <w:rPr>
+          <w:i/>
+          <w:iCs/>
+          <w:lang w:val="en-US"/>
+        </w:rPr>
+        <w:t>et al.</w:t>
+      </w:r>
+      <w:r>
+        <w:rPr>
+          <w:lang w:val="en-US"/>
+        </w:rPr>
+        <w:t xml:space="preserve"> [11]</w:t>
       </w:r>
       <w:r>
         <w:rPr>
@@ -489,79 +521,61 @@
         <w:rPr>
           <w:lang w:val="en-US"/>
         </w:rPr>
-        <w:t>horizon was used</w:t>
-      </w:r>
-      <w:r>
-        <w:rPr>
-          <w:lang w:val="en-US"/>
-        </w:rPr>
-        <w:t xml:space="preserve">, comprising </w:t>
-      </w:r>
-      <w:r>
-        <w:rPr>
-          <w:lang w:val="en-US"/>
-        </w:rPr>
-        <w:t xml:space="preserve">1.5 million activity records gathered between </w:t>
-      </w:r>
-      <w:r>
-        <w:rPr>
-          <w:lang w:val="en-US"/>
-        </w:rPr>
-        <w:t xml:space="preserve">2014 and 2017. This dataset </w:t>
-      </w:r>
-      <w:r>
-        <w:rPr>
-          <w:lang w:val="en-US"/>
-        </w:rPr>
-        <w:t>had</w:t>
-      </w:r>
-      <w:r>
-        <w:rPr>
-          <w:lang w:val="en-US"/>
-        </w:rPr>
-        <w:t xml:space="preserve"> four main stages of pre-processing, including athlete pace</w:t>
-      </w:r>
-      <w:r>
-        <w:rPr>
-          <w:lang w:val="en-US"/>
-        </w:rPr>
-        <w:t xml:space="preserve"> extraction</w:t>
-      </w:r>
-      <w:r>
-        <w:rPr>
-          <w:lang w:val="en-US"/>
-        </w:rPr>
-        <w:t xml:space="preserve"> from raw 100-meter recorded intervals and aggregating these training activities to create weekly training cases. T</w:t>
-      </w:r>
-      <w:r>
-        <w:rPr>
-          <w:lang w:val="en-US"/>
-        </w:rPr>
-        <w:t xml:space="preserve">his was followed by summarizing features, and </w:t>
-      </w:r>
-      <w:r>
-        <w:rPr>
-          <w:lang w:val="en-US"/>
-        </w:rPr>
-        <w:t xml:space="preserve">due to prediction difficulties, </w:t>
-      </w:r>
-      <w:r>
-        <w:rPr>
-          <w:lang w:val="en-US"/>
-        </w:rPr>
-        <w:t xml:space="preserve">it was slightly condensed to </w:t>
-      </w:r>
-      <w:r>
-        <w:rPr>
-          <w:lang w:val="en-US"/>
-        </w:rPr>
-        <w:t xml:space="preserve">only female and male athletes </w:t>
-      </w:r>
-      <w:r>
-        <w:rPr>
-          <w:lang w:val="en-US"/>
-        </w:rPr>
-        <w:t>who achieved race times</w:t>
+        <w:t>employed</w:t>
+      </w:r>
+      <w:r>
+        <w:rPr>
+          <w:lang w:val="en-US"/>
+        </w:rPr>
+        <w:t xml:space="preserve"> the same instance-based learning approach </w:t>
+      </w:r>
+      <w:r>
+        <w:rPr>
+          <w:lang w:val="en-US"/>
+        </w:rPr>
+        <w:t xml:space="preserve">as a regressor </w:t>
+      </w:r>
+      <w:r>
+        <w:rPr>
+          <w:lang w:val="en-US"/>
+        </w:rPr>
+        <w:t>to predict athlete marathon race times (MRT)</w:t>
+      </w:r>
+      <w:r>
+        <w:rPr>
+          <w:lang w:val="en-US"/>
+        </w:rPr>
+        <w:t xml:space="preserve">. </w:t>
+      </w:r>
+      <w:r>
+        <w:rPr>
+          <w:lang w:val="en-US"/>
+        </w:rPr>
+        <w:t xml:space="preserve">The difference was that the former study coupled the k-Nearest Neighbor (KNN) model with a case-based reasoning (CBR) system, which helped </w:t>
+      </w:r>
+      <w:r>
+        <w:rPr>
+          <w:lang w:val="en-US"/>
+        </w:rPr>
+        <w:t xml:space="preserve">bypass the necessity of complex </w:t>
+      </w:r>
+      <w:r>
+        <w:rPr>
+          <w:lang w:val="en-US"/>
+        </w:rPr>
+        <w:t>physiological domain models</w:t>
+      </w:r>
+      <w:r>
+        <w:rPr>
+          <w:lang w:val="en-US"/>
+        </w:rPr>
+        <w:t xml:space="preserve"> and mitigated the likelihood of unrepresentative </w:t>
+      </w:r>
+      <w:r>
+        <w:rPr>
+          <w:lang w:val="en-US"/>
+        </w:rPr>
+        <w:t>training recommendations.</w:t>
       </w:r>
       <w:r>
         <w:rPr>
@@ -573,85 +587,61 @@
         <w:rPr>
           <w:lang w:val="en-US"/>
         </w:rPr>
-        <w:t>of</w:t>
-      </w:r>
-      <w:r>
-        <w:rPr>
-          <w:lang w:val="en-US"/>
-        </w:rPr>
-        <w:t xml:space="preserve"> three to five</w:t>
-      </w:r>
-      <w:r>
-        <w:rPr>
-          <w:lang w:val="en-US"/>
-        </w:rPr>
-        <w:t xml:space="preserve"> hours and less than </w:t>
-      </w:r>
-      <w:r>
-        <w:rPr>
-          <w:lang w:val="en-US"/>
-        </w:rPr>
-        <w:t>five</w:t>
-      </w:r>
-      <w:r>
-        <w:rPr>
-          <w:lang w:val="en-US"/>
-        </w:rPr>
-        <w:t xml:space="preserve"> hours, respectively</w:t>
-      </w:r>
-      <w:r>
-        <w:rPr>
-          <w:lang w:val="en-US"/>
-        </w:rPr>
-        <w:t xml:space="preserve">. </w:t>
-      </w:r>
-      <w:r>
-        <w:rPr>
-          <w:lang w:val="en-US"/>
-        </w:rPr>
-        <w:t>This CBR system was employed and evaluated using three algorithms, namely a baseline, feature selection, and multi-week feature variation. Using the Root Mean Square Error (RMSE), t</w:t>
-      </w:r>
-      <w:r>
-        <w:rPr>
-          <w:lang w:val="en-US"/>
-        </w:rPr>
-        <w:t xml:space="preserve">he experiments showed </w:t>
-      </w:r>
-      <w:r>
-        <w:rPr>
-          <w:lang w:val="en-US"/>
-        </w:rPr>
-        <w:t>that as time progressed and the athlete got closer to race day</w:t>
-      </w:r>
-      <w:r>
-        <w:rPr>
-          <w:lang w:val="en-US"/>
-        </w:rPr>
-        <w:t>, prediction accuracy got better</w:t>
-      </w:r>
-      <w:r>
-        <w:rPr>
-          <w:lang w:val="en-US"/>
-        </w:rPr>
-        <w:t xml:space="preserve"> (lower RMSE value). Although this study had promising results, future research should focus on a larger female sample population, as only 4,810 of the 19,930 athletes were females. </w:t>
-      </w:r>
-      <w:r>
-        <w:rPr>
-          <w:lang w:val="en-US"/>
-        </w:rPr>
-        <w:t>Since this prototype did not go through live-user trials</w:t>
-      </w:r>
-      <w:r>
-        <w:rPr>
-          <w:lang w:val="en-US"/>
-        </w:rPr>
-        <w:t xml:space="preserve">, it could result in incorrect training recommendations and MRT prediction in the real-world. Additionally, these could also include </w:t>
-      </w:r>
-      <w:r>
-        <w:rPr>
-          <w:lang w:val="en-US"/>
-        </w:rPr>
-        <w:t>female runners who achieved below three hours as a finish time.</w:t>
+        <w:t>The latter study compared a KNN model against an Artificial Neural Network (ANN)</w:t>
+      </w:r>
+      <w:r>
+        <w:rPr>
+          <w:lang w:val="en-US"/>
+        </w:rPr>
+        <w:t>,</w:t>
+      </w:r>
+      <w:r>
+        <w:rPr>
+          <w:lang w:val="en-US"/>
+        </w:rPr>
+        <w:t xml:space="preserve"> on the same objective. A clear </w:t>
+      </w:r>
+      <w:r>
+        <w:rPr>
+          <w:lang w:val="en-US"/>
+        </w:rPr>
+        <w:t>difference</w:t>
+      </w:r>
+      <w:r>
+        <w:rPr>
+          <w:lang w:val="en-US"/>
+        </w:rPr>
+        <w:t xml:space="preserve"> is observed in the time horizon</w:t>
+      </w:r>
+      <w:r>
+        <w:rPr>
+          <w:lang w:val="en-US"/>
+        </w:rPr>
+        <w:t xml:space="preserve"> when</w:t>
+      </w:r>
+      <w:r>
+        <w:rPr>
+          <w:lang w:val="en-US"/>
+        </w:rPr>
+        <w:t xml:space="preserve"> </w:t>
+      </w:r>
+      <w:r>
+        <w:rPr>
+          <w:lang w:val="en-US"/>
+        </w:rPr>
+        <w:t>choosing longitudinal [10] and cross-sectional [11] historical datasets</w:t>
+      </w:r>
+      <w:r>
+        <w:rPr>
+          <w:lang w:val="en-US"/>
+        </w:rPr>
+        <w:t>.</w:t>
+      </w:r>
+      <w:r>
+        <w:rPr>
+          <w:lang w:val="en-US"/>
+        </w:rPr>
+        <w:t xml:space="preserve"> </w:t>
       </w:r>
     </w:p>
     <w:p>
@@ -665,7 +655,7 @@
         <w:rPr>
           <w:lang w:val="en-US"/>
         </w:rPr>
-        <w:t xml:space="preserve">The study by Ruiz-Mayo </w:t>
+        <w:t xml:space="preserve">Feely </w:t>
       </w:r>
       <w:r>
         <w:rPr>
@@ -673,122 +663,177 @@
           <w:iCs/>
           <w:lang w:val="en-US"/>
         </w:rPr>
-        <w:t>et al.</w:t>
-      </w:r>
-      <w:r>
-        <w:rPr>
-          <w:lang w:val="en-US"/>
-        </w:rPr>
-        <w:t xml:space="preserve"> [11</w:t>
-      </w:r>
-      <w:r>
-        <w:rPr>
-          <w:lang w:val="en-US"/>
-        </w:rPr>
-        <w:t xml:space="preserve">] assessed the use of </w:t>
-      </w:r>
-      <w:r>
-        <w:rPr>
-          <w:lang w:val="en-US"/>
-        </w:rPr>
-        <w:t>L</w:t>
-      </w:r>
-      <w:r>
-        <w:rPr>
-          <w:lang w:val="en-US"/>
-        </w:rPr>
-        <w:t xml:space="preserve">inear </w:t>
-      </w:r>
-      <w:r>
-        <w:rPr>
-          <w:lang w:val="en-US"/>
-        </w:rPr>
-        <w:t>R</w:t>
-      </w:r>
-      <w:r>
-        <w:rPr>
-          <w:lang w:val="en-US"/>
-        </w:rPr>
-        <w:t xml:space="preserve">egression and </w:t>
-      </w:r>
-      <w:r>
-        <w:rPr>
-          <w:lang w:val="en-US"/>
-        </w:rPr>
-        <w:t>B</w:t>
-      </w:r>
-      <w:r>
-        <w:rPr>
-          <w:lang w:val="en-US"/>
-        </w:rPr>
-        <w:t xml:space="preserve">agging ML algorithms against a baseline ZeroR model, and this was performed for MRT prediction only for amateur runners. The dataset that the models were validated on was longitudinal and sequential, </w:t>
-      </w:r>
-      <w:r>
-        <w:rPr>
-          <w:lang w:val="en-US"/>
-        </w:rPr>
-        <w:lastRenderedPageBreak/>
-        <w:t xml:space="preserve">covering a six-week training window before the marathon event. </w:t>
-      </w:r>
-      <w:r>
-        <w:rPr>
-          <w:lang w:val="en-US"/>
-        </w:rPr>
-        <w:t xml:space="preserve">Given that this was secondary data, certain endurance sessions that were categorized incorrectly or had unrealistic paces were removed, and those athletes </w:t>
-      </w:r>
-      <w:r>
-        <w:rPr>
-          <w:lang w:val="en-US"/>
-        </w:rPr>
-        <w:t>who</w:t>
-      </w:r>
-      <w:r>
-        <w:rPr>
-          <w:lang w:val="en-US"/>
-        </w:rPr>
-        <w:t xml:space="preserve"> had less than three workouts per week were removed, resulting in a total of 1,000 athletes from the original </w:t>
-      </w:r>
-      <w:r>
-        <w:rPr>
-          <w:lang w:val="en-US"/>
-        </w:rPr>
-        <w:t xml:space="preserve">3,386. Before feeding this data to the ML models, multiple features of the same nature were engineered, but these were calculated on a weekly, bi-weekly, and 6-week basis. Three experiments were conducted: using the original dataset, the filtered dataset that recognizes marathon preparation characteristics, and another </w:t>
-      </w:r>
-      <w:r>
-        <w:rPr>
-          <w:lang w:val="en-US"/>
-        </w:rPr>
-        <w:t>with further filtering to exclude individuals who might have had cramps or dehydration issues during the marathon. The Bagging algorithms performed the best throughout, especially within the last experiment, with the lowest Mean Absolute Error (MAE). This study showed that through rigorous filtering of data, considerable improvements are possible when predicting the MRT. However, since the training data was gathered from athletes who participated in only two major events from a total of six, this approach cannot be generalized to other marathons. Also, more historical data could result in better predictions</w:t>
-      </w:r>
-      <w:r>
-        <w:rPr>
-          <w:lang w:val="en-US"/>
-        </w:rPr>
-        <w:t>,</w:t>
-      </w:r>
-      <w:r>
-        <w:rPr>
-          <w:lang w:val="en-US"/>
-        </w:rPr>
-        <w:t xml:space="preserve"> as the last 6 weeks of marathon training </w:t>
-      </w:r>
-      <w:r>
-        <w:rPr>
-          <w:lang w:val="en-US"/>
-        </w:rPr>
-        <w:t>hide the majority of the training period.</w:t>
-      </w:r>
-      <w:r>
-        <w:rPr>
-          <w:lang w:val="en-US"/>
-        </w:rPr>
-        <w:t xml:space="preserve"> (backed up by the author's quote: “</w:t>
-      </w:r>
-      <w:r>
-        <w:t>fairly large period of preparation of several months</w:t>
-      </w:r>
-      <w:r>
-        <w:t>”).</w:t>
+        <w:t xml:space="preserve">et al. </w:t>
+      </w:r>
+      <w:r>
+        <w:rPr>
+          <w:lang w:val="en-US"/>
+        </w:rPr>
+        <w:t>[10] gathered thousands of activity records from 19,930 individuals between 2014 and 2017,</w:t>
+      </w:r>
+      <w:r>
+        <w:rPr>
+          <w:lang w:val="en-US"/>
+        </w:rPr>
+        <w:t xml:space="preserve"> and notably, due to forecasting difficulties, the runners were eligible based on their marathon performance. It included finish times between three and five hours for females and less than five hours for males, </w:t>
+      </w:r>
+      <w:r>
+        <w:rPr>
+          <w:lang w:val="en-US"/>
+        </w:rPr>
+        <w:t>and</w:t>
+      </w:r>
+      <w:r>
+        <w:rPr>
+          <w:lang w:val="en-US"/>
+        </w:rPr>
+        <w:t xml:space="preserve"> although this </w:t>
+      </w:r>
+      <w:r>
+        <w:rPr>
+          <w:lang w:val="en-US"/>
+        </w:rPr>
+        <w:t>resulted in</w:t>
+      </w:r>
+      <w:r>
+        <w:rPr>
+          <w:lang w:val="en-US"/>
+        </w:rPr>
+        <w:t xml:space="preserve"> better accuracy</w:t>
+      </w:r>
+      <w:r>
+        <w:rPr>
+          <w:lang w:val="en-US"/>
+        </w:rPr>
+        <w:t xml:space="preserve"> (even through visual illustrations)</w:t>
+      </w:r>
+      <w:r>
+        <w:rPr>
+          <w:lang w:val="en-US"/>
+        </w:rPr>
+        <w:t xml:space="preserve">, </w:t>
+      </w:r>
+      <w:r>
+        <w:rPr>
+          <w:lang w:val="en-US"/>
+        </w:rPr>
+        <w:t>including</w:t>
+      </w:r>
+      <w:r>
+        <w:rPr>
+          <w:lang w:val="en-US"/>
+        </w:rPr>
+        <w:t xml:space="preserve"> </w:t>
+      </w:r>
+      <w:r>
+        <w:rPr>
+          <w:lang w:val="en-US"/>
+        </w:rPr>
+        <w:t xml:space="preserve">sub-three-hour female athletes should have been considered, as it provides variance. On the other hand, </w:t>
+      </w:r>
+      <w:r>
+        <w:rPr>
+          <w:lang w:val="en-US"/>
+        </w:rPr>
+        <w:t xml:space="preserve">Lerebourg </w:t>
+      </w:r>
+      <w:r>
+        <w:rPr>
+          <w:i/>
+          <w:iCs/>
+          <w:lang w:val="en-US"/>
+        </w:rPr>
+        <w:t xml:space="preserve">et al. </w:t>
+      </w:r>
+      <w:r>
+        <w:rPr>
+          <w:lang w:val="en-US"/>
+        </w:rPr>
+        <w:t xml:space="preserve">[11] </w:t>
+      </w:r>
+      <w:r>
+        <w:rPr>
+          <w:lang w:val="en-US"/>
+        </w:rPr>
+        <w:t>investigated solely</w:t>
+      </w:r>
+      <w:r>
+        <w:rPr>
+          <w:lang w:val="en-US"/>
+        </w:rPr>
+        <w:t xml:space="preserve"> </w:t>
+      </w:r>
+      <w:r>
+        <w:rPr>
+          <w:lang w:val="en-US"/>
+        </w:rPr>
+        <w:t xml:space="preserve">using </w:t>
+      </w:r>
+      <w:r>
+        <w:rPr>
+          <w:lang w:val="en-US"/>
+        </w:rPr>
+        <w:t>four static inputs from 820 runners</w:t>
+      </w:r>
+      <w:r>
+        <w:rPr>
+          <w:lang w:val="en-US"/>
+        </w:rPr>
+        <w:t xml:space="preserve">, including at least one 10-kilometer race result. </w:t>
+      </w:r>
+      <w:r>
+        <w:rPr>
+          <w:lang w:val="en-US"/>
+        </w:rPr>
+        <w:t xml:space="preserve">These were appropriately normalized </w:t>
+      </w:r>
+      <w:r>
+        <w:rPr>
+          <w:lang w:val="en-US"/>
+        </w:rPr>
+        <w:t>before being fed to</w:t>
+      </w:r>
+      <w:r>
+        <w:rPr>
+          <w:lang w:val="en-US"/>
+        </w:rPr>
+        <w:t xml:space="preserve"> the ANN </w:t>
+      </w:r>
+      <w:r>
+        <w:rPr>
+          <w:lang w:val="en-US"/>
+        </w:rPr>
+        <w:t xml:space="preserve">model, aligning with the sigmoid transfer function, </w:t>
+      </w:r>
+      <w:r>
+        <w:rPr>
+          <w:lang w:val="en-US"/>
+        </w:rPr>
+        <w:t xml:space="preserve">and to eliminate scale variations </w:t>
+      </w:r>
+      <w:r>
+        <w:rPr>
+          <w:lang w:val="en-US"/>
+        </w:rPr>
+        <w:t xml:space="preserve">between the input variables </w:t>
+      </w:r>
+      <w:r>
+        <w:rPr>
+          <w:lang w:val="en-US"/>
+        </w:rPr>
+        <w:t>for the KNN model</w:t>
+      </w:r>
+      <w:r>
+        <w:rPr>
+          <w:lang w:val="en-US"/>
+        </w:rPr>
+        <w:t>, for accurate Euclidean distance calculations</w:t>
+      </w:r>
+      <w:r>
+        <w:rPr>
+          <w:lang w:val="en-US"/>
+        </w:rPr>
+        <w:t>.</w:t>
       </w:r>
     </w:p>
     <w:p>
@@ -802,7 +847,38 @@
         <w:rPr>
           <w:lang w:val="en-US"/>
         </w:rPr>
-        <w:t xml:space="preserve">Lerebourg </w:t>
+        <w:lastRenderedPageBreak/>
+        <w:t>Regarding</w:t>
+      </w:r>
+      <w:r>
+        <w:rPr>
+          <w:lang w:val="en-US"/>
+        </w:rPr>
+        <w:t xml:space="preserve"> this study [10], </w:t>
+      </w:r>
+      <w:r>
+        <w:rPr>
+          <w:lang w:val="en-US"/>
+        </w:rPr>
+        <w:t xml:space="preserve">the large-scale dataset </w:t>
+      </w:r>
+      <w:r>
+        <w:rPr>
+          <w:lang w:val="en-US"/>
+        </w:rPr>
+        <w:t>was essential and proved highly beneficial</w:t>
+      </w:r>
+      <w:r>
+        <w:rPr>
+          <w:lang w:val="en-US"/>
+        </w:rPr>
+        <w:t xml:space="preserve"> when performing 3 separate experiments on feature variations. Although the Root Mean Square Error (RMSE) showed the models' improved performance over time, one must consider that it was not put through real-world trials.</w:t>
+      </w:r>
+      <w:r>
+        <w:rPr>
+          <w:lang w:val="en-US"/>
+        </w:rPr>
+        <w:t xml:space="preserve"> Furthermore, the dataset by Lerebourg </w:t>
       </w:r>
       <w:r>
         <w:rPr>
@@ -816,91 +892,67 @@
         <w:rPr>
           <w:lang w:val="en-US"/>
         </w:rPr>
-        <w:t xml:space="preserve"> [12] conducted a comparative analysis between a regressor and a deep learning model to determine which one performed better in predicting the MRT, considering the accuracy and </w:t>
-      </w:r>
-      <w:r>
-        <w:rPr>
-          <w:lang w:val="en-US"/>
-        </w:rPr>
-        <w:t>precision</w:t>
-      </w:r>
-      <w:r>
-        <w:rPr>
-          <w:lang w:val="en-US"/>
-        </w:rPr>
-        <w:t xml:space="preserve"> of both models. This time, the study was evaluated on a cross-sectional time horizon data source consisting of 820 athletes who participated in a 10-kilometer and a marathon race within the same year. </w:t>
-      </w:r>
-      <w:r>
-        <w:rPr>
-          <w:lang w:val="en-US"/>
-        </w:rPr>
-        <w:t xml:space="preserve">So instead of using daily activity records for prediction, four static inputs were used. This was downscaled from a greater pool of data through a lot of filtering, such as the age, missing biometric data, and having the marathon race after the shorter one. The supervised ML models, k-Nearest Neighbor (KNN) and Artificial Neural Network (ANN), were fed normalized data to align with the </w:t>
-      </w:r>
-      <w:r>
-        <w:rPr>
-          <w:lang w:val="en-US"/>
-        </w:rPr>
-        <w:t>sigmoid</w:t>
-      </w:r>
-      <w:r>
-        <w:rPr>
-          <w:lang w:val="en-US"/>
-        </w:rPr>
-        <w:t xml:space="preserve"> transfer function requirements</w:t>
-      </w:r>
-      <w:r>
-        <w:rPr>
-          <w:lang w:val="en-US"/>
-        </w:rPr>
-        <w:t xml:space="preserve">, and both acquired low MAE values. </w:t>
-      </w:r>
-      <w:r>
-        <w:rPr>
-          <w:lang w:val="en-US"/>
-        </w:rPr>
-        <w:t>This study proved that with a limited dataset</w:t>
-      </w:r>
-      <w:r>
-        <w:rPr>
-          <w:lang w:val="en-US"/>
-        </w:rPr>
-        <w:t xml:space="preserve">, </w:t>
-      </w:r>
-      <w:r>
-        <w:rPr>
-          <w:lang w:val="en-US"/>
-        </w:rPr>
-        <w:t>the</w:t>
-      </w:r>
-      <w:r>
-        <w:rPr>
-          <w:lang w:val="en-US"/>
-        </w:rPr>
-        <w:t xml:space="preserve"> KNN ML model</w:t>
-      </w:r>
-      <w:r>
-        <w:rPr>
-          <w:lang w:val="en-US"/>
-        </w:rPr>
-        <w:t xml:space="preserve"> outperforms the ANN in estimating the MRT, which could mean that better results can prove otherwise with a larger dataset</w:t>
-      </w:r>
-      <w:r>
-        <w:rPr>
-          <w:lang w:val="en-US"/>
-        </w:rPr>
-        <w:t xml:space="preserve">. On the other hand, </w:t>
-      </w:r>
-      <w:r>
-        <w:rPr>
-          <w:lang w:val="en-US"/>
-        </w:rPr>
-        <w:t xml:space="preserve">having additional race results from </w:t>
-      </w:r>
-      <w:r>
-        <w:rPr>
-          <w:lang w:val="en-US"/>
-        </w:rPr>
-        <w:t>multiple 10-kilometer</w:t>
+        <w:t xml:space="preserve"> [11] </w:t>
+      </w:r>
+      <w:r>
+        <w:rPr>
+          <w:lang w:val="en-US"/>
+        </w:rPr>
+        <w:t xml:space="preserve">was effective in </w:t>
+      </w:r>
+      <w:r>
+        <w:rPr>
+          <w:lang w:val="en-US"/>
+        </w:rPr>
+        <w:t>addressing overfitting</w:t>
+      </w:r>
+      <w:r>
+        <w:rPr>
+          <w:lang w:val="en-US"/>
+        </w:rPr>
+        <w:t xml:space="preserve"> and showed that KNN outperformed the ANN model</w:t>
+      </w:r>
+      <w:r>
+        <w:rPr>
+          <w:lang w:val="en-US"/>
+        </w:rPr>
+        <w:t xml:space="preserve">; however, </w:t>
+      </w:r>
+      <w:r>
+        <w:rPr>
+          <w:lang w:val="en-US"/>
+        </w:rPr>
+        <w:t xml:space="preserve">incorporating </w:t>
+      </w:r>
+      <w:r>
+        <w:rPr>
+          <w:lang w:val="en-US"/>
+        </w:rPr>
+        <w:t>a</w:t>
+      </w:r>
+      <w:r>
+        <w:rPr>
+          <w:lang w:val="en-US"/>
+        </w:rPr>
+        <w:t xml:space="preserve"> half-marathon </w:t>
+      </w:r>
+      <w:r>
+        <w:rPr>
+          <w:lang w:val="en-US"/>
+        </w:rPr>
+        <w:t xml:space="preserve">race result </w:t>
+      </w:r>
+      <w:r>
+        <w:rPr>
+          <w:lang w:val="en-US"/>
+        </w:rPr>
+        <w:t xml:space="preserve">from </w:t>
+      </w:r>
+      <w:r>
+        <w:rPr>
+          <w:lang w:val="en-US"/>
+        </w:rPr>
+        <w:t>the same year</w:t>
       </w:r>
       <w:r>
         <w:rPr>
@@ -912,7 +964,39 @@
         <w:rPr>
           <w:lang w:val="en-US"/>
         </w:rPr>
-        <w:t>and half-marathons</w:t>
+        <w:t xml:space="preserve">could </w:t>
+      </w:r>
+      <w:r>
+        <w:rPr>
+          <w:lang w:val="en-US"/>
+        </w:rPr>
+        <w:t>improve</w:t>
+      </w:r>
+      <w:r>
+        <w:rPr>
+          <w:lang w:val="en-US"/>
+        </w:rPr>
+        <w:t xml:space="preserve"> the model's predictive performance. This study</w:t>
+      </w:r>
+      <w:r>
+        <w:rPr>
+          <w:lang w:val="en-US"/>
+        </w:rPr>
+        <w:t xml:space="preserve"> [10] also stated that the </w:t>
+      </w:r>
+      <w:r>
+        <w:rPr>
+          <w:i/>
+          <w:iCs/>
+          <w:lang w:val="en-US"/>
+        </w:rPr>
+        <w:t>k</w:t>
+      </w:r>
+      <w:r>
+        <w:rPr>
+          <w:lang w:val="en-US"/>
+        </w:rPr>
+        <w:t xml:space="preserve"> value was set to 15</w:t>
       </w:r>
       <w:r>
         <w:rPr>
@@ -924,7 +1008,71 @@
         <w:rPr>
           <w:lang w:val="en-US"/>
         </w:rPr>
-        <w:t>could be beneficial</w:t>
+        <w:t xml:space="preserve">after showing a point of error stabilization, whilst Lerebourg </w:t>
+      </w:r>
+      <w:r>
+        <w:rPr>
+          <w:i/>
+          <w:iCs/>
+          <w:lang w:val="en-US"/>
+        </w:rPr>
+        <w:t>et al.</w:t>
+      </w:r>
+      <w:r>
+        <w:rPr>
+          <w:lang w:val="en-US"/>
+        </w:rPr>
+        <w:t xml:space="preserve"> [11], although having an acceptable Mean Absolute Error (MAE), </w:t>
+      </w:r>
+      <w:r>
+        <w:rPr>
+          <w:lang w:val="en-US"/>
+        </w:rPr>
+        <w:t xml:space="preserve">set </w:t>
+      </w:r>
+      <w:r>
+        <w:rPr>
+          <w:lang w:val="en-US"/>
+        </w:rPr>
+        <w:t xml:space="preserve">the </w:t>
+      </w:r>
+      <w:r>
+        <w:rPr>
+          <w:i/>
+          <w:iCs/>
+          <w:lang w:val="en-US"/>
+        </w:rPr>
+        <w:t>k</w:t>
+      </w:r>
+      <w:r>
+        <w:rPr>
+          <w:lang w:val="en-US"/>
+        </w:rPr>
+        <w:t xml:space="preserve"> value </w:t>
+      </w:r>
+      <w:r>
+        <w:rPr>
+          <w:lang w:val="en-US"/>
+        </w:rPr>
+        <w:t xml:space="preserve">to </w:t>
+      </w:r>
+      <w:r>
+        <w:rPr>
+          <w:lang w:val="en-US"/>
+        </w:rPr>
+        <w:t>3</w:t>
+      </w:r>
+      <w:r>
+        <w:rPr>
+          <w:lang w:val="en-US"/>
+        </w:rPr>
+        <w:t xml:space="preserve"> without any explicit reasons. This could mean that other values could have led to better results. </w:t>
+      </w:r>
+      <w:r>
+        <w:rPr>
+          <w:lang w:val="en-US"/>
+        </w:rPr>
+        <w:t>A common shortcoming of both studies</w:t>
       </w:r>
       <w:r>
         <w:rPr>
@@ -936,79 +1084,13 @@
         <w:rPr>
           <w:lang w:val="en-US"/>
         </w:rPr>
-        <w:t xml:space="preserve">to the model, </w:t>
-      </w:r>
-      <w:r>
-        <w:rPr>
-          <w:lang w:val="en-US"/>
-        </w:rPr>
-        <w:t>as</w:t>
-      </w:r>
-      <w:r>
-        <w:rPr>
-          <w:lang w:val="en-US"/>
-        </w:rPr>
-        <w:t xml:space="preserve"> </w:t>
-      </w:r>
-      <w:r>
-        <w:rPr>
-          <w:lang w:val="en-US"/>
-        </w:rPr>
-        <w:t xml:space="preserve">the model would learn from such trends and </w:t>
-      </w:r>
-      <w:r>
-        <w:rPr>
-          <w:lang w:val="en-US"/>
-        </w:rPr>
-        <w:t>yield</w:t>
-      </w:r>
-      <w:r>
-        <w:rPr>
-          <w:lang w:val="en-US"/>
-        </w:rPr>
-        <w:t xml:space="preserve"> even better results</w:t>
-      </w:r>
-      <w:r>
-        <w:rPr>
-          <w:lang w:val="en-US"/>
-        </w:rPr>
-        <w:t xml:space="preserve">. Also, gender imbalance is an evident issue here, </w:t>
-      </w:r>
-      <w:r>
-        <w:rPr>
-          <w:lang w:val="en-US"/>
-        </w:rPr>
-        <w:t xml:space="preserve">with </w:t>
-      </w:r>
-      <w:r>
-        <w:rPr>
-          <w:lang w:val="en-US"/>
-        </w:rPr>
-        <w:t xml:space="preserve">the majority of the sample population </w:t>
-      </w:r>
-      <w:r>
-        <w:rPr>
-          <w:lang w:val="en-US"/>
-        </w:rPr>
-        <w:t>being</w:t>
-      </w:r>
-      <w:r>
-        <w:rPr>
-          <w:lang w:val="en-US"/>
-        </w:rPr>
-        <w:t xml:space="preserve"> males</w:t>
-      </w:r>
-      <w:r>
-        <w:rPr>
-          <w:lang w:val="en-US"/>
-        </w:rPr>
-        <w:t xml:space="preserve"> (83%)</w:t>
-      </w:r>
-      <w:r>
-        <w:rPr>
-          <w:lang w:val="en-US"/>
-        </w:rPr>
-        <w:t>, which could lead to inaccurate performance predictions for females.</w:t>
+        <w:t>is gender imbalance, w</w:t>
+      </w:r>
+      <w:r>
+        <w:rPr>
+          <w:lang w:val="en-US"/>
+        </w:rPr>
+        <w:t>ith a 24% [10] and 17% [11] female sample population, which could result in inaccurate training recommendations and MRT prediction for this gender.</w:t>
       </w:r>
     </w:p>
     <w:p>
@@ -1022,7 +1104,7 @@
         <w:rPr>
           <w:lang w:val="en-US"/>
         </w:rPr>
-        <w:t xml:space="preserve">Dash </w:t>
+        <w:t xml:space="preserve">In another study by Ruiz-Mayo </w:t>
       </w:r>
       <w:r>
         <w:rPr>
@@ -1036,104 +1118,49 @@
         <w:rPr>
           <w:lang w:val="en-US"/>
         </w:rPr>
-        <w:t xml:space="preserve"> [13] </w:t>
-      </w:r>
-      <w:r>
-        <w:rPr>
-          <w:lang w:val="en-US"/>
-        </w:rPr>
-        <w:t xml:space="preserve">tried to develop a predictive model </w:t>
-      </w:r>
-      <w:r>
-        <w:rPr>
-          <w:lang w:val="en-US"/>
-        </w:rPr>
-        <w:t>that applied across a wide range of race distances</w:t>
-      </w:r>
-      <w:r>
-        <w:rPr>
-          <w:lang w:val="en-US"/>
-        </w:rPr>
-        <w:t xml:space="preserve">, different elevations, and even different athlete performance levels. This was all done using the same Long Short-Term Memory (LSTM) </w:t>
-      </w:r>
-      <w:r>
-        <w:rPr>
-          <w:lang w:val="en-US"/>
-        </w:rPr>
-        <w:t>deep learning</w:t>
-      </w:r>
-      <w:r>
-        <w:rPr>
-          <w:lang w:val="en-US"/>
-        </w:rPr>
-        <w:t xml:space="preserve"> model, but only as a regressor and then as a time series regressor (TSR). As a study, it utilized a longitudinal </w:t>
-      </w:r>
-      <w:r>
-        <w:rPr>
-          <w:lang w:val="en-US"/>
-        </w:rPr>
-        <w:t xml:space="preserve">and sequential </w:t>
-      </w:r>
-      <w:r>
-        <w:rPr>
-          <w:lang w:val="en-US"/>
-        </w:rPr>
-        <w:t xml:space="preserve">time horizon dataset, with training logs averaging 6.6 years from a total of 15 recreational ultra-marathon runners. </w:t>
-      </w:r>
-      <w:r>
-        <w:rPr>
-          <w:lang w:val="en-US"/>
-        </w:rPr>
-        <w:t xml:space="preserve">Notably, these runners needed to have a 50-kilometer race result between 2022 and 2023, ranging between a specific pace, to be an eligible participant in the study. An ad-hoc algorithm was used to remove outliers, such as athletes having very short training sessions, incomplete records, and activity paces being better than the world record. </w:t>
-      </w:r>
-      <w:r>
-        <w:rPr>
-          <w:lang w:val="en-US"/>
-        </w:rPr>
-        <w:t xml:space="preserve">Two experiments were held, with the first comparing the mentioned prototypes. Then the second experiment leveraged the superior model, being the LSTM regressor against benchmark models (mainly being traditional formulas), which still proved that the LSTM is the better option. </w:t>
-      </w:r>
-      <w:r>
-        <w:rPr>
-          <w:lang w:val="en-US"/>
-        </w:rPr>
-        <w:t>The</w:t>
-      </w:r>
-      <w:r>
-        <w:rPr>
-          <w:lang w:val="en-US"/>
-        </w:rPr>
-        <w:t xml:space="preserve"> </w:t>
-      </w:r>
-      <w:r>
-        <w:rPr>
-          <w:lang w:val="en-US"/>
-        </w:rPr>
-        <w:t xml:space="preserve">predictive performance of each model was measured </w:t>
-      </w:r>
-      <w:r>
-        <w:rPr>
-          <w:lang w:val="en-US"/>
-        </w:rPr>
-        <w:t xml:space="preserve">using the Mean Absolute Percentage Error (MAPE) and accuracy. This study sustained its validity when providing acceptable predictions on unseen data. A possible improvement would be to gather and test the model on a larger sample </w:t>
-      </w:r>
-      <w:r>
-        <w:rPr>
-          <w:lang w:val="en-US"/>
-        </w:rPr>
-        <w:lastRenderedPageBreak/>
-        <w:t>population</w:t>
-      </w:r>
-      <w:r>
-        <w:rPr>
-          <w:lang w:val="en-US"/>
-        </w:rPr>
-        <w:t xml:space="preserve"> and create a generalized LSTM predictive model, rather than a custom model per athlete, as this is not feasible in the real-world. Also, having more training trajectories would highlight certain flaws within the model and aid in certain improvements.</w:t>
-      </w:r>
-      <w:r>
-        <w:rPr>
-          <w:lang w:val="en-US"/>
-        </w:rPr>
-        <w:t xml:space="preserve"> </w:t>
+        <w:t xml:space="preserve"> [12], two regressors were evaluated and compared with a baseline ZeroR model, namely Linear Regression (LR) and Bagging, checking the validity of more complex regressors in forecasting the MRT. </w:t>
+      </w:r>
+      <w:r>
+        <w:rPr>
+          <w:lang w:val="en-US"/>
+        </w:rPr>
+        <w:t>The 6-week</w:t>
+      </w:r>
+      <w:r>
+        <w:rPr>
+          <w:lang w:val="en-US"/>
+        </w:rPr>
+        <w:t xml:space="preserve"> longitudinal dataset selection by the author </w:t>
+      </w:r>
+      <w:r>
+        <w:rPr>
+          <w:lang w:val="en-US"/>
+        </w:rPr>
+        <w:t>shows high contradiction, as</w:t>
+      </w:r>
+      <w:r>
+        <w:rPr>
+          <w:lang w:val="en-US"/>
+        </w:rPr>
+        <w:t xml:space="preserve"> they explicitly state that several months of preparation are required to compete. </w:t>
+      </w:r>
+      <w:r>
+        <w:rPr>
+          <w:lang w:val="en-US"/>
+        </w:rPr>
+        <w:t>Without any explanation for this period selection, it might hint at uninformed decisions, as this hides the majority of the training period, which could have resulted in better model performance. Adequate filtering was held, and relevant features were engineered based on weekly, bi-weekly, and the full training window. These supply the models with significant information, which contributed towards low MAE values</w:t>
+      </w:r>
+      <w:r>
+        <w:rPr>
+          <w:lang w:val="en-US"/>
+        </w:rPr>
+        <w:t>, showing the importance of rigorous pre-processing</w:t>
+      </w:r>
+      <w:r>
+        <w:rPr>
+          <w:lang w:val="en-US"/>
+        </w:rPr>
+        <w:t xml:space="preserve">. </w:t>
       </w:r>
     </w:p>
     <w:p>
@@ -1147,63 +1174,229 @@
         <w:rPr>
           <w:lang w:val="en-US"/>
         </w:rPr>
-        <w:t xml:space="preserve">El-Kassabi </w:t>
+        <w:t xml:space="preserve">The issue with the employed dataset was that </w:t>
+      </w:r>
+      <w:r>
+        <w:rPr>
+          <w:lang w:val="en-US"/>
+        </w:rPr>
+        <w:t>it solely had 1,000 suitable athletes from the original 3,386 coming from two major marathon events within the first half of the year, whilst there is a total of six. Therefore, generalizability could be difficult when applied to others. Moreover</w:t>
+      </w:r>
+      <w:r>
+        <w:rPr>
+          <w:lang w:val="en-US"/>
+        </w:rPr>
+        <w:t>,</w:t>
+      </w:r>
+      <w:r>
+        <w:rPr>
+          <w:lang w:val="en-US"/>
+        </w:rPr>
+        <w:t xml:space="preserve"> the study essentially uses the Weka </w:t>
+      </w:r>
+      <w:r>
+        <w:rPr>
+          <w:lang w:val="en-US"/>
+        </w:rPr>
+        <w:t>and Knime software</w:t>
+      </w:r>
+      <w:r>
+        <w:rPr>
+          <w:lang w:val="en-US"/>
+        </w:rPr>
+        <w:t>,</w:t>
+      </w:r>
+      <w:r>
+        <w:rPr>
+          <w:lang w:val="en-US"/>
+        </w:rPr>
+        <w:t xml:space="preserve"> </w:t>
+      </w:r>
+      <w:r>
+        <w:rPr>
+          <w:lang w:val="en-US"/>
+        </w:rPr>
+        <w:t>combining</w:t>
+      </w:r>
+      <w:r>
+        <w:rPr>
+          <w:lang w:val="en-US"/>
+        </w:rPr>
+        <w:t xml:space="preserve"> 100 regression trees for the Bagging model, and with this amount of regression trees, the lowest MAE value was yielded </w:t>
+      </w:r>
+      <w:r>
+        <w:rPr>
+          <w:lang w:val="en-US"/>
+        </w:rPr>
+        <w:t>among</w:t>
+      </w:r>
+      <w:r>
+        <w:rPr>
+          <w:lang w:val="en-US"/>
+        </w:rPr>
+        <w:t xml:space="preserve"> all the models. Thus, testing the algorithm with slightly more regression trees at a time could reveal better results.</w:t>
+      </w:r>
+    </w:p>
+    <w:p>
+      <w:pPr>
+        <w:jc w:val="both"/>
+        <w:rPr>
+          <w:lang w:val="en-US"/>
+        </w:rPr>
+      </w:pPr>
+      <w:r>
+        <w:rPr>
+          <w:lang w:val="en-US"/>
+        </w:rPr>
+        <w:t>NOTE: R</w:t>
+      </w:r>
+      <w:r>
+        <w:rPr>
+          <w:lang w:val="en-US"/>
+        </w:rPr>
+        <w:t xml:space="preserve">eference the six marathon majors </w:t>
+      </w:r>
+      <w:r>
+        <w:rPr>
+          <w:lang w:val="en-US"/>
+        </w:rPr>
+        <w:t xml:space="preserve">comment </w:t>
+      </w:r>
+      <w:r>
+        <w:rPr>
+          <w:lang w:val="en-US"/>
+        </w:rPr>
+        <w:t>with a paper</w:t>
+      </w:r>
+      <w:r>
+        <w:rPr>
+          <w:lang w:val="en-US"/>
+        </w:rPr>
+        <w:t>!</w:t>
+      </w:r>
+      <w:r>
+        <w:rPr>
+          <w:lang w:val="en-US"/>
+        </w:rPr>
+        <w:t xml:space="preserve"> Also mention the experiments and the visual representations!</w:t>
+      </w:r>
+    </w:p>
+    <w:p>
+      <w:pPr>
+        <w:jc w:val="both"/>
+        <w:rPr>
+          <w:lang w:val="en-US"/>
+        </w:rPr>
+      </w:pPr>
+      <w:r>
+        <w:rPr>
+          <w:highlight w:val="yellow"/>
+          <w:lang w:val="en-US"/>
+        </w:rPr>
+        <w:t xml:space="preserve">The study by Ruiz-Mayo </w:t>
       </w:r>
       <w:r>
         <w:rPr>
           <w:i/>
           <w:iCs/>
+          <w:highlight w:val="yellow"/>
           <w:lang w:val="en-US"/>
         </w:rPr>
         <w:t>et al.</w:t>
       </w:r>
       <w:r>
         <w:rPr>
-          <w:lang w:val="en-US"/>
-        </w:rPr>
-        <w:t xml:space="preserve"> [14] </w:t>
-      </w:r>
-      <w:r>
-        <w:rPr>
-          <w:lang w:val="en-US"/>
-        </w:rPr>
-        <w:t>also had the same goal in mind, to predict the MRT of athletes, but this was done solely using three deep learning models, namely Recurrent Neural Networks (RNN), LSTM, and Gated Recurrent Units (GRU), which were also compared to a Linear Regression (LR) model. The study used a 5-month longitudinal and sequential time horizon, consisting of training preparation for the 2017 Boston marathon.</w:t>
-      </w:r>
-      <w:r>
-        <w:rPr>
-          <w:lang w:val="en-US"/>
-        </w:rPr>
-        <w:t xml:space="preserve"> Data cleaning, transformation, and incomplete data were handled by tools such as Talend and Trifacta wrangler, with outliers beyond the third standard deviation being removed as well. The experiments revolved around different hidden states and the use of the original and filtered dataset</w:t>
-      </w:r>
-      <w:r>
-        <w:rPr>
-          <w:lang w:val="en-US"/>
-        </w:rPr>
-        <w:t>s.</w:t>
-      </w:r>
-      <w:r>
-        <w:rPr>
-          <w:lang w:val="en-US"/>
-        </w:rPr>
-        <w:t xml:space="preserve"> Using more hidden states contributed to a slight improvement whilst removing noise resulted in significant improvements in performance prediction.</w:t>
-      </w:r>
-      <w:r>
-        <w:rPr>
-          <w:lang w:val="en-US"/>
-        </w:rPr>
-        <w:t xml:space="preserve"> This was all evaluated using the RMSE, MAE, and MAPE metrics, showing the superior performance of the GRU model over all the deep learning models and even the baseline model. The achieved results were promising and considerably accurate, but this is only exhibited upon one major marathon, so applicability to other marathons could be analyzed.  </w:t>
-      </w:r>
-      <w:r>
-        <w:rPr>
-          <w:lang w:val="en-US"/>
-        </w:rPr>
-        <w:t>Based on experimental findings</w:t>
-      </w:r>
-      <w:r>
-        <w:rPr>
-          <w:lang w:val="en-US"/>
-        </w:rPr>
-        <w:t>, applying slightly more hidden states to the models could result in slightly more precise predictions, not only for the GRU model but for all the models.</w:t>
+          <w:highlight w:val="yellow"/>
+          <w:lang w:val="en-US"/>
+        </w:rPr>
+        <w:t xml:space="preserve"> [11] assessed the use of Linear Regression and Bagging ML algorithms against a baseline ZeroR model, and this was performed for MRT prediction only for amateur runners.</w:t>
+      </w:r>
+      <w:r>
+        <w:rPr>
+          <w:lang w:val="en-US"/>
+        </w:rPr>
+        <w:t xml:space="preserve"> The dataset that the models were validated on was longitudinal and sequential, covering a six-week training window before the marathon event. Given that this was secondary data, certain endurance sessions that were categorized incorrectly or had unrealistic paces were removed, and those athletes who had less than three workouts per week were removed, resulting in a total of 1,000 athletes from the original 3,386. Before feeding this data to the ML models, multiple features of the same nature were engineered, but these were calculated on a weekly, bi-weekly, and 6-week basis. Three experiments were conducted: using the original dataset, the filtered dataset that recognizes marathon preparation characteristics, and another with further filtering to exclude individuals who might have had cramps or dehydration issues during the marathon. The Bagging algorithms performed the best throughout, especially within the last experiment, with the lowest Mean Absolute Error (MAE). This study showed that through rigorous filtering of data, considerable improvements are possible when predicting the MRT. However, since the training data was gathered from athletes who participated in only two major events from </w:t>
+      </w:r>
+      <w:r>
+        <w:rPr>
+          <w:lang w:val="en-US"/>
+        </w:rPr>
+        <w:lastRenderedPageBreak/>
+        <w:t>a total of six, this approach cannot be generalized to other marathons. Also, more historical data could result in better predictions, as the last 6 weeks of marathon training hide the majority of the training period. (backed up by the author's quote: “</w:t>
+      </w:r>
+      <w:r>
+        <w:t>fairly large period of preparation of several months</w:t>
+      </w:r>
+      <w:r>
+        <w:t>”).</w:t>
+      </w:r>
+    </w:p>
+    <w:p>
+      <w:pPr>
+        <w:jc w:val="both"/>
+        <w:rPr>
+          <w:lang w:val="en-US"/>
+        </w:rPr>
+      </w:pPr>
+      <w:r>
+        <w:rPr>
+          <w:highlight w:val="yellow"/>
+          <w:lang w:val="en-US"/>
+        </w:rPr>
+        <w:t xml:space="preserve">Dash </w:t>
+      </w:r>
+      <w:r>
+        <w:rPr>
+          <w:i/>
+          <w:iCs/>
+          <w:highlight w:val="yellow"/>
+          <w:lang w:val="en-US"/>
+        </w:rPr>
+        <w:t>et al.</w:t>
+      </w:r>
+      <w:r>
+        <w:rPr>
+          <w:highlight w:val="yellow"/>
+          <w:lang w:val="en-US"/>
+        </w:rPr>
+        <w:t xml:space="preserve"> [13] tried to develop a predictive model that applied across a wide range of race distances, different elevations, and even different athlete performance levels.</w:t>
+      </w:r>
+      <w:r>
+        <w:rPr>
+          <w:lang w:val="en-US"/>
+        </w:rPr>
+        <w:t xml:space="preserve"> This was all done using the same Long Short-Term Memory (LSTM) deep learning model, but only as a regressor and then as a time series regressor (TSR). As a study, it utilized a longitudinal and sequential time horizon dataset, with training logs averaging 6.6 years from a total of 15 recreational ultra-marathon runners. Notably, these runners needed to have a 50-kilometer race result between 2022 and 2023, ranging between a specific pace, to be an eligible participant in the study. An ad-hoc algorithm was used to remove outliers, such as athletes having very short training sessions, incomplete records, and activity paces being better than the world record. Two experiments were held, with the first comparing the mentioned prototypes. Then the second experiment leveraged the superior model, being the LSTM regressor against benchmark models (mainly being traditional formulas), which still proved that the LSTM is the better option. The predictive performance of each model was measured using the Mean Absolute Percentage Error (MAPE) and accuracy. This study sustained its validity when providing acceptable predictions on unseen data. A possible improvement would be to gather and test the model on a larger sample population and create a generalized LSTM predictive model, rather than a custom model per athlete, as this is not feasible in the real-world. Also, having more training trajectories would highlight certain flaws within the model and aid in certain improvements. </w:t>
+      </w:r>
+    </w:p>
+    <w:p>
+      <w:r>
+        <w:rPr>
+          <w:highlight w:val="yellow"/>
+          <w:lang w:val="en-US"/>
+        </w:rPr>
+        <w:t xml:space="preserve">El-Kassabi </w:t>
+      </w:r>
+      <w:r>
+        <w:rPr>
+          <w:i/>
+          <w:iCs/>
+          <w:highlight w:val="yellow"/>
+          <w:lang w:val="en-US"/>
+        </w:rPr>
+        <w:t>et al.</w:t>
+      </w:r>
+      <w:r>
+        <w:rPr>
+          <w:highlight w:val="yellow"/>
+          <w:lang w:val="en-US"/>
+        </w:rPr>
+        <w:t xml:space="preserve"> [14] also had the same goal in mind, to predict the MRT of athletes, but this was done solely using three deep learning models, namely Recurrent Neural Networks (RNN), LSTM, and Gated Recurrent Units (GRU), which were also compared to a Linear Regression (LR) model.</w:t>
+      </w:r>
+      <w:r>
+        <w:rPr>
+          <w:lang w:val="en-US"/>
+        </w:rPr>
+        <w:t xml:space="preserve"> The study used a 5-month longitudinal and sequential time horizon, consisting of training preparation for the 2017 Boston marathon. Data cleaning, transformation, and incomplete data were handled by tools such as Talend and Trifacta wrangler, with outliers beyond the third standard deviation being removed as well. The experiments revolved around different hidden states and the use of the original and filtered datasets. Using more hidden states contributed to a slight improvement whilst removing noise resulted in significant improvements in performance prediction. This was all evaluated using the RMSE, MAE, and MAPE metrics, showing the superior performance of the GRU model over all the deep learning models and even the baseline model. The achieved results were promising and considerably accurate, but this is only exhibited upon one major marathon, so applicability to other marathons could be analyzed.  Based on experimental findings, applying slightly more hidden states to the models could result in slightly more precise predictions, not only for the GRU model but for all the models.</w:t>
       </w:r>
     </w:p>
     <w:p>
@@ -1431,7 +1624,7 @@
               <w:rPr>
                 <w:lang w:val="en-US"/>
               </w:rPr>
-              <w:t xml:space="preserve">Ruiz-Mayo </w:t>
+              <w:t xml:space="preserve">Lerebourg </w:t>
             </w:r>
             <w:r>
               <w:rPr>
@@ -1499,7 +1692,7 @@
               <w:rPr>
                 <w:lang w:val="en-US"/>
               </w:rPr>
-              <w:t>Experimental and Archival research, Longitudinal</w:t>
+              <w:t xml:space="preserve">Experimental and Archival research, Cross-sectional </w:t>
             </w:r>
           </w:p>
         </w:tc>
@@ -1524,7 +1717,7 @@
               <w:rPr>
                 <w:lang w:val="en-US"/>
               </w:rPr>
-              <w:t xml:space="preserve">Lerebourg </w:t>
+              <w:t xml:space="preserve">Ruiz-Mayo </w:t>
             </w:r>
             <w:r>
               <w:rPr>
@@ -1538,7 +1731,19 @@
               <w:rPr>
                 <w:lang w:val="en-US"/>
               </w:rPr>
-              <w:t>[12]</w:t>
+              <w:t>[1</w:t>
+            </w:r>
+            <w:r>
+              <w:rPr>
+                <w:lang w:val="en-US"/>
+              </w:rPr>
+              <w:t>2</w:t>
+            </w:r>
+            <w:r>
+              <w:rPr>
+                <w:lang w:val="en-US"/>
+              </w:rPr>
+              <w:t>]</w:t>
             </w:r>
           </w:p>
         </w:tc>
@@ -1592,7 +1797,7 @@
               <w:rPr>
                 <w:lang w:val="en-US"/>
               </w:rPr>
-              <w:t xml:space="preserve">Experimental and Archival research, Cross-sectional </w:t>
+              <w:t>Experimental and Archival research, Longitudinal</w:t>
             </w:r>
           </w:p>
         </w:tc>
@@ -1992,7 +2197,7 @@
               <w:rPr>
                 <w:lang w:val="en-US"/>
               </w:rPr>
-              <w:t xml:space="preserve">Ruiz-Mayo </w:t>
+              <w:t xml:space="preserve">Lerebourg </w:t>
             </w:r>
             <w:r>
               <w:rPr>
@@ -2079,7 +2284,7 @@
               <w:rPr>
                 <w:lang w:val="en-US"/>
               </w:rPr>
-              <w:t xml:space="preserve">Lerebourg </w:t>
+              <w:t xml:space="preserve">Ruiz-Mayo </w:t>
             </w:r>
             <w:r>
               <w:rPr>
@@ -2093,7 +2298,19 @@
               <w:rPr>
                 <w:lang w:val="en-US"/>
               </w:rPr>
-              <w:t>[12]</w:t>
+              <w:t>[1</w:t>
+            </w:r>
+            <w:r>
+              <w:rPr>
+                <w:lang w:val="en-US"/>
+              </w:rPr>
+              <w:t>2</w:t>
+            </w:r>
+            <w:r>
+              <w:rPr>
+                <w:lang w:val="en-US"/>
+              </w:rPr>
+              <w:t>]</w:t>
             </w:r>
           </w:p>
         </w:tc>
@@ -2981,30 +3198,13 @@
         <w:jc w:val="both"/>
       </w:pPr>
       <w:r>
-        <w:t>[11]</w:t>
-      </w:r>
-      <w:r>
-        <w:t xml:space="preserve"> </w:t>
-      </w:r>
-      <w:r>
-        <w:t xml:space="preserve">D. Ruiz-Mayo, E. Pulido, and G. </w:t>
-      </w:r>
-      <w:proofErr w:type="spellStart"/>
-      <w:r>
-        <w:t>Martınez</w:t>
-      </w:r>
-      <w:proofErr w:type="spellEnd"/>
-      <w:r>
-        <w:t>-Munoz, “Marathon Performance Prediction of Amateur Runners based on Training Session Data”.</w:t>
-      </w:r>
-    </w:p>
-    <w:p>
-      <w:pPr>
-        <w:spacing w:line="360" w:lineRule="auto"/>
-        <w:jc w:val="both"/>
-      </w:pPr>
-      <w:r>
-        <w:t>[12]</w:t>
+        <w:t>[1</w:t>
+      </w:r>
+      <w:r>
+        <w:t>1</w:t>
+      </w:r>
+      <w:r>
+        <w:t>]</w:t>
       </w:r>
       <w:r>
         <w:t xml:space="preserve"> </w:t>
@@ -3064,6 +3264,35 @@
       </w:hyperlink>
       <w:r>
         <w:t>.</w:t>
+      </w:r>
+    </w:p>
+    <w:p>
+      <w:pPr>
+        <w:spacing w:line="360" w:lineRule="auto"/>
+        <w:jc w:val="both"/>
+      </w:pPr>
+      <w:r>
+        <w:t>[1</w:t>
+      </w:r>
+      <w:r>
+        <w:t>2</w:t>
+      </w:r>
+      <w:r>
+        <w:t>]</w:t>
+      </w:r>
+      <w:r>
+        <w:t xml:space="preserve"> </w:t>
+      </w:r>
+      <w:r>
+        <w:t xml:space="preserve">D. Ruiz-Mayo, E. Pulido, and G. </w:t>
+      </w:r>
+      <w:proofErr w:type="spellStart"/>
+      <w:r>
+        <w:t>Martınez</w:t>
+      </w:r>
+      <w:proofErr w:type="spellEnd"/>
+      <w:r>
+        <w:t>-Munoz, “Marathon Performance Prediction of Amateur Runners based on Training Session Data”.</w:t>
       </w:r>
     </w:p>
     <w:p>

</xml_diff>

<commit_message>
Minor update for Milestone 02
</commit_message>
<xml_diff>
--- a/doc/milestone_02/miguelabela_swd63a_milestone_02.docx
+++ b/doc/milestone_02/miguelabela_swd63a_milestone_02.docx
@@ -1153,8 +1153,8 @@
           <w:rStyle w:val="Strong"/>
         </w:rPr>
         <w:sectPr>
-          <w:headerReference w:type="default" r:id="rId6"/>
-          <w:footerReference w:type="default" r:id="rId7"/>
+          <w:headerReference w:type="default" r:id="rId7"/>
+          <w:footerReference w:type="default" r:id="rId8"/>
           <w:pgSz w:w="11906" w:h="16838"/>
           <w:pgMar w:top="1440" w:right="1440" w:bottom="1440" w:left="1440" w:header="708" w:footer="708" w:gutter="0"/>
           <w:cols w:space="708"/>
@@ -1190,7 +1190,7 @@
                     <pic:cNvPicPr/>
                   </pic:nvPicPr>
                   <pic:blipFill>
-                    <a:blip r:embed="rId8">
+                    <a:blip r:embed="rId9">
                       <a:extLst>
                         <a:ext uri="{28A0092B-C50C-407E-A947-70E740481C1C}">
                           <a14:useLocalDpi xmlns:a14="http://schemas.microsoft.com/office/drawing/2010/main" val="0"/>
@@ -1272,6 +1272,1695 @@
     </w:p>
     <w:p>
       <w:pPr>
+        <w:pStyle w:val="Subtitle"/>
+      </w:pPr>
+      <w:r>
+        <w:lastRenderedPageBreak/>
+        <w:t xml:space="preserve">Section </w:t>
+      </w:r>
+      <w:r>
+        <w:t>3</w:t>
+      </w:r>
+      <w:r>
+        <w:t xml:space="preserve"> – </w:t>
+      </w:r>
+      <w:r>
+        <w:t>Research Methodology</w:t>
+      </w:r>
+    </w:p>
+    <w:p>
+      <w:pPr>
+        <w:jc w:val="both"/>
+        <w:rPr>
+          <w:lang w:val="en-US"/>
+        </w:rPr>
+      </w:pPr>
+      <w:r>
+        <w:rPr>
+          <w:lang w:val="en-US"/>
+        </w:rPr>
+        <w:t xml:space="preserve">After analyzing the methodologies outlined in Section II, it was noted that researchers in numerous studies ([10], [11], [12], [13], [14]) employed a comparative approach, which evaluated machine learning (ML) models from the same or different paradigms. These investigations were conducted to determine whether more complex algorithms are necessary to achieve a common objective, concerning prediction accuracy in long-distance running events. In keeping with these methodological approaches, our study endorsed a similar strategy, performing two sequential and comparative experiments, aimed at addressing the following research questions:      </w:t>
+      </w:r>
+    </w:p>
+    <w:p>
+      <w:pPr>
+        <w:pStyle w:val="ListParagraph"/>
+        <w:numPr>
+          <w:ilvl w:val="0"/>
+          <w:numId w:val="1"/>
+        </w:numPr>
+        <w:rPr>
+          <w:rStyle w:val="Strong"/>
+          <w:b w:val="0"/>
+          <w:bCs w:val="0"/>
+        </w:rPr>
+      </w:pPr>
+      <w:r>
+        <w:rPr>
+          <w:rStyle w:val="Strong"/>
+        </w:rPr>
+        <w:t>RQ1:</w:t>
+      </w:r>
+      <w:r>
+        <w:rPr>
+          <w:rStyle w:val="Strong"/>
+          <w:b w:val="0"/>
+          <w:bCs w:val="0"/>
+        </w:rPr>
+        <w:t xml:space="preserve"> Which tree-based machine learning regressor obtains the highest predictive performance when forecasting an athlete’s marathon race time?</w:t>
+      </w:r>
+    </w:p>
+    <w:p>
+      <w:pPr>
+        <w:pStyle w:val="ListParagraph"/>
+        <w:numPr>
+          <w:ilvl w:val="0"/>
+          <w:numId w:val="1"/>
+        </w:numPr>
+        <w:rPr>
+          <w:rStyle w:val="Strong"/>
+          <w:b w:val="0"/>
+          <w:bCs w:val="0"/>
+        </w:rPr>
+      </w:pPr>
+      <w:r>
+        <w:rPr>
+          <w:rStyle w:val="Strong"/>
+        </w:rPr>
+        <w:t xml:space="preserve">RQ2: </w:t>
+      </w:r>
+      <w:r>
+        <w:rPr>
+          <w:rStyle w:val="Strong"/>
+          <w:b w:val="0"/>
+          <w:bCs w:val="0"/>
+        </w:rPr>
+        <w:t>To what extent does the amount of weekly historical data affect the predictive accuracy?</w:t>
+      </w:r>
+    </w:p>
+    <w:p>
+      <w:pPr>
+        <w:jc w:val="both"/>
+        <w:rPr>
+          <w:rStyle w:val="Strong"/>
+          <w:b w:val="0"/>
+          <w:bCs w:val="0"/>
+        </w:rPr>
+      </w:pPr>
+      <w:r>
+        <w:rPr>
+          <w:rStyle w:val="Strong"/>
+          <w:b w:val="0"/>
+          <w:bCs w:val="0"/>
+        </w:rPr>
+        <w:t xml:space="preserve">The first experiment addresses RQ1, in which two ML regressors are evaluated based on their predictive performance on the same amount of weekly historical data. In this manner, a superior model is established. The second experiment, related to RQ2, tests the same ML regressors but using a progressively reducing data source. Thus, this will analyse the effects of different weekly historical data and conclude whether a model remains consistently better, based on the prediction accuracy. To address the research questions, this paper presents the following objectives, which are also outlined within the research pipeline (Fig. </w:t>
+      </w:r>
+      <w:r>
+        <w:rPr>
+          <w:rStyle w:val="Strong"/>
+          <w:b w:val="0"/>
+          <w:bCs w:val="0"/>
+        </w:rPr>
+        <w:t>2</w:t>
+      </w:r>
+      <w:r>
+        <w:rPr>
+          <w:rStyle w:val="Strong"/>
+          <w:b w:val="0"/>
+          <w:bCs w:val="0"/>
+        </w:rPr>
+        <w:t>):</w:t>
+      </w:r>
+    </w:p>
+    <w:p>
+      <w:pPr>
+        <w:pStyle w:val="ListParagraph"/>
+        <w:numPr>
+          <w:ilvl w:val="0"/>
+          <w:numId w:val="2"/>
+        </w:numPr>
+        <w:jc w:val="both"/>
+        <w:rPr>
+          <w:rStyle w:val="Strong"/>
+          <w:b w:val="0"/>
+          <w:bCs w:val="0"/>
+        </w:rPr>
+      </w:pPr>
+      <w:r>
+        <w:rPr>
+          <w:rStyle w:val="Strong"/>
+          <w:b w:val="0"/>
+          <w:bCs w:val="0"/>
+        </w:rPr>
+        <w:t xml:space="preserve">Obtain a dataset containing daily activity records from individuals and filter to the </w:t>
+      </w:r>
+      <w:r>
+        <w:rPr>
+          <w:rStyle w:val="Strong"/>
+          <w:b w:val="0"/>
+          <w:bCs w:val="0"/>
+        </w:rPr>
+        <w:t>dominant demographic (gender and age group).</w:t>
+      </w:r>
+    </w:p>
+    <w:p>
+      <w:pPr>
+        <w:pStyle w:val="ListParagraph"/>
+        <w:numPr>
+          <w:ilvl w:val="0"/>
+          <w:numId w:val="2"/>
+        </w:numPr>
+        <w:jc w:val="both"/>
+        <w:rPr>
+          <w:rStyle w:val="Strong"/>
+          <w:b w:val="0"/>
+          <w:bCs w:val="0"/>
+        </w:rPr>
+      </w:pPr>
+      <w:r>
+        <w:rPr>
+          <w:rStyle w:val="Strong"/>
+          <w:b w:val="0"/>
+          <w:bCs w:val="0"/>
+        </w:rPr>
+        <w:t>Check for major marathon events that have at least 16 weeks of daily training data.</w:t>
+      </w:r>
+    </w:p>
+    <w:p>
+      <w:pPr>
+        <w:pStyle w:val="ListParagraph"/>
+        <w:numPr>
+          <w:ilvl w:val="0"/>
+          <w:numId w:val="2"/>
+        </w:numPr>
+        <w:jc w:val="both"/>
+        <w:rPr>
+          <w:rStyle w:val="Strong"/>
+          <w:b w:val="0"/>
+          <w:bCs w:val="0"/>
+        </w:rPr>
+      </w:pPr>
+      <w:r>
+        <w:rPr>
+          <w:rStyle w:val="Strong"/>
+          <w:b w:val="0"/>
+          <w:bCs w:val="0"/>
+        </w:rPr>
+        <w:t>Aggregate the training block data of each athlete into a single record, whilst engineering new features.</w:t>
+      </w:r>
+    </w:p>
+    <w:p>
+      <w:pPr>
+        <w:pStyle w:val="ListParagraph"/>
+        <w:numPr>
+          <w:ilvl w:val="0"/>
+          <w:numId w:val="2"/>
+        </w:numPr>
+        <w:jc w:val="both"/>
+        <w:rPr>
+          <w:rStyle w:val="Strong"/>
+          <w:b w:val="0"/>
+          <w:bCs w:val="0"/>
+        </w:rPr>
+      </w:pPr>
+      <w:r>
+        <w:rPr>
+          <w:rStyle w:val="Strong"/>
+          <w:b w:val="0"/>
+          <w:bCs w:val="0"/>
+        </w:rPr>
+        <w:t>Test the ML regressors on the data and evaluate their predictive performance.</w:t>
+      </w:r>
+    </w:p>
+    <w:p>
+      <w:pPr>
+        <w:pStyle w:val="ListParagraph"/>
+        <w:numPr>
+          <w:ilvl w:val="0"/>
+          <w:numId w:val="2"/>
+        </w:numPr>
+        <w:jc w:val="both"/>
+        <w:rPr>
+          <w:rStyle w:val="Strong"/>
+          <w:b w:val="0"/>
+          <w:bCs w:val="0"/>
+        </w:rPr>
+      </w:pPr>
+      <w:r>
+        <w:rPr>
+          <w:rStyle w:val="Strong"/>
+          <w:b w:val="0"/>
+          <w:bCs w:val="0"/>
+        </w:rPr>
+        <w:t>Progressively reduce the amount of historical data, and repeat objective 3.</w:t>
+      </w:r>
+    </w:p>
+    <w:p>
+      <w:pPr>
+        <w:pStyle w:val="ListParagraph"/>
+        <w:numPr>
+          <w:ilvl w:val="0"/>
+          <w:numId w:val="2"/>
+        </w:numPr>
+        <w:jc w:val="both"/>
+        <w:rPr>
+          <w:rStyle w:val="Strong"/>
+          <w:b w:val="0"/>
+          <w:bCs w:val="0"/>
+        </w:rPr>
+      </w:pPr>
+      <w:r>
+        <w:rPr>
+          <w:rStyle w:val="Strong"/>
+          <w:b w:val="0"/>
+          <w:bCs w:val="0"/>
+        </w:rPr>
+        <w:t>Test the ML regressors on the decreasing historical data and evaluate them through predictive accuracy to identify which model adjusts best to different data availability.</w:t>
+      </w:r>
+    </w:p>
+    <w:p>
+      <w:pPr>
+        <w:jc w:val="both"/>
+        <w:rPr>
+          <w:rStyle w:val="Strong"/>
+          <w:b w:val="0"/>
+          <w:bCs w:val="0"/>
+          <w:i/>
+          <w:iCs/>
+        </w:rPr>
+      </w:pPr>
+      <w:r>
+        <w:rPr>
+          <w:rStyle w:val="Strong"/>
+          <w:b w:val="0"/>
+          <w:bCs w:val="0"/>
+          <w:i/>
+          <w:iCs/>
+        </w:rPr>
+        <w:t>A. Methodology Approach</w:t>
+      </w:r>
+    </w:p>
+    <w:p>
+      <w:pPr>
+        <w:jc w:val="both"/>
+        <w:rPr>
+          <w:rStyle w:val="Strong"/>
+          <w:b w:val="0"/>
+          <w:bCs w:val="0"/>
+        </w:rPr>
+      </w:pPr>
+      <w:r>
+        <w:rPr>
+          <w:rStyle w:val="Strong"/>
+          <w:b w:val="0"/>
+          <w:bCs w:val="0"/>
+        </w:rPr>
+        <w:t>This approach supports the positivist philosophy and deductive approach conveyed in Section I, which highlights a systematic and rigorous analysis of ML regressors for predicting an individual's marathon race time (MRT), while gathering measurable outcomes through their predictive performance. During each experimental course, a cross-sectional dataset will be supplied to each model, independent of the historical timeframe being assessed. Therefore, a mono-method quantitative research choice will be followed. Consequently, our experiments align with the Research Onion model illustrated in Fig. 1, maintaining consistency in our research methodology.</w:t>
+      </w:r>
+    </w:p>
+    <w:p>
+      <w:pPr>
+        <w:jc w:val="both"/>
+        <w:rPr>
+          <w:rStyle w:val="Strong"/>
+          <w:b w:val="0"/>
+          <w:bCs w:val="0"/>
+          <w:i/>
+          <w:iCs/>
+        </w:rPr>
+      </w:pPr>
+      <w:r>
+        <w:rPr>
+          <w:rStyle w:val="Strong"/>
+          <w:b w:val="0"/>
+          <w:bCs w:val="0"/>
+          <w:i/>
+          <w:iCs/>
+        </w:rPr>
+        <w:t>B. Research Pipeline and Methods – Experiment Design</w:t>
+      </w:r>
+    </w:p>
+    <w:p>
+      <w:pPr>
+        <w:jc w:val="both"/>
+        <w:rPr>
+          <w:rStyle w:val="Strong"/>
+          <w:b w:val="0"/>
+          <w:bCs w:val="0"/>
+        </w:rPr>
+      </w:pPr>
+      <w:r>
+        <w:rPr>
+          <w:rStyle w:val="Strong"/>
+          <w:b w:val="0"/>
+          <w:bCs w:val="0"/>
+        </w:rPr>
+        <w:t xml:space="preserve">The research pipeline in Fig. </w:t>
+      </w:r>
+      <w:r>
+        <w:rPr>
+          <w:rStyle w:val="Strong"/>
+          <w:b w:val="0"/>
+          <w:bCs w:val="0"/>
+        </w:rPr>
+        <w:t>2</w:t>
+      </w:r>
+      <w:r>
+        <w:rPr>
+          <w:rStyle w:val="Strong"/>
+          <w:b w:val="0"/>
+          <w:bCs w:val="0"/>
+        </w:rPr>
+        <w:t xml:space="preserve"> outlines the main phases required to achieve the stated objectives and answer the research questions posed in this paper. The foundational work necessary for the experiments (Phases 01 and 02) was conducted in a similar study that aimed to predict the MRT using sequential deep learning (DL) models, and a prototype was also provided [15]. In turn, the desired dataset was provided with the target value. This was also highly specific to the dominant demographic group within the dataset (males aged 35 to 54 years). Additionally, from the six </w:t>
+      </w:r>
+      <w:r>
+        <w:rPr>
+          <w:rStyle w:val="Strong"/>
+          <w:b w:val="0"/>
+          <w:bCs w:val="0"/>
+        </w:rPr>
+        <w:lastRenderedPageBreak/>
+        <w:t xml:space="preserve">available marathon majors, the training block concerning the Tokyo 2019 marathon was removed as it contained only 8.5 weeks of data. </w:t>
+      </w:r>
+    </w:p>
+    <w:p>
+      <w:pPr>
+        <w:jc w:val="both"/>
+        <w:rPr>
+          <w:rStyle w:val="Strong"/>
+          <w:b w:val="0"/>
+          <w:bCs w:val="0"/>
+        </w:rPr>
+      </w:pPr>
+      <w:r>
+        <w:rPr>
+          <w:rStyle w:val="Strong"/>
+          <w:b w:val="0"/>
+          <w:bCs w:val="0"/>
+        </w:rPr>
+        <w:t>By leveraging this data source in Phase 03, additional features were engineered from two native input features, distance (kilometres) and duration (minutes). The individual training blocks were then combined into a single record per athlete and split into separate train-test data files for model training and testing within Phase 04. Therefore, the last phase was highly focused on obtaining quantitative results by employing and comparing two ML regressors: Random Forest (RF) and XGBoost, starting with the data-rich train-test files and progressively utilising those that had less weekly training data.</w:t>
+      </w:r>
+    </w:p>
+    <w:p>
+      <w:pPr>
+        <w:jc w:val="both"/>
+        <w:rPr>
+          <w:rStyle w:val="Strong"/>
+          <w:i/>
+          <w:iCs/>
+        </w:rPr>
+      </w:pPr>
+      <w:r>
+        <w:rPr>
+          <w:rStyle w:val="Strong"/>
+          <w:i/>
+          <w:iCs/>
+        </w:rPr>
+        <w:t>RQ1: Which tree-based machine learning regressor obtains the highest predictive performance when forecasting an athlete’s marathon race time?</w:t>
+      </w:r>
+    </w:p>
+    <w:p>
+      <w:pPr>
+        <w:jc w:val="both"/>
+        <w:rPr>
+          <w:rStyle w:val="Strong"/>
+          <w:b w:val="0"/>
+          <w:bCs w:val="0"/>
+        </w:rPr>
+      </w:pPr>
+      <w:r>
+        <w:rPr>
+          <w:rStyle w:val="Strong"/>
+          <w:b w:val="0"/>
+          <w:bCs w:val="0"/>
+        </w:rPr>
+        <w:t>This subsection delves into the first research question, which seeks to identify the ML regression model that achieves the closest prediction in utilising the most data-rich athlete training data source. This investigation will serve as the basis for the subsequent research question.</w:t>
+      </w:r>
+    </w:p>
+    <w:p>
+      <w:pPr>
+        <w:jc w:val="both"/>
+        <w:rPr>
+          <w:rStyle w:val="Strong"/>
+          <w:b w:val="0"/>
+          <w:bCs w:val="0"/>
+        </w:rPr>
+      </w:pPr>
+      <w:r>
+        <w:rPr>
+          <w:rStyle w:val="Strong"/>
+          <w:b w:val="0"/>
+          <w:bCs w:val="0"/>
+        </w:rPr>
+        <w:t>The experiment was conducted using two ML regressors, RF and XGBoost, based on three criteria: (a) similar underlying algorithmic structures, (b) common data input formats, and (c) no feature scaling required. Therefore, this contributed to a better comparative study, specifically analysing the effectiveness of tree-based ensemble regression models. A 16-week sequentially ordered running activity dataset was aggregated, containing individuals from the dominant demographic. Some inessential features were removed, such as rolling metrics and weekly metrics, and new ones were formulated from the original distance and duration column values. This ensured that the models were supplied with essential information to aid performance predictions, as previously done by [10]. Notably, the original dataset [16] was open-source and obtained from Kaggle.</w:t>
+      </w:r>
+    </w:p>
+    <w:p>
+      <w:pPr>
+        <w:jc w:val="both"/>
+        <w:rPr>
+          <w:rStyle w:val="Strong"/>
+          <w:b w:val="0"/>
+          <w:bCs w:val="0"/>
+        </w:rPr>
+      </w:pPr>
+      <w:r>
+        <w:rPr>
+          <w:rStyle w:val="Strong"/>
+          <w:b w:val="0"/>
+          <w:bCs w:val="0"/>
+        </w:rPr>
+        <w:t>Before training both models, the dataset was split into separate data files, using an 80:20 split ratio. This ensured that both models were given the same training and testing data files, contributing towards a fair and unbiased comparison. As in previous work [12], the domain-standard 10-fold cross-validation technique was applied, as it is best practice for reliably validating predictive algorithms. Also, common hyperparameter values within these different ML models were kept the same to maintain consistency. The effectiveness of their predictive performance was assessed using the universal Mean Absolute Error (MAE), Root Mean Square Error (RMSE), and the R-square</w:t>
+      </w:r>
+      <w:r>
+        <w:rPr>
+          <w:rStyle w:val="Strong"/>
+          <w:b w:val="0"/>
+          <w:bCs w:val="0"/>
+        </w:rPr>
+        <w:t>d</w:t>
+      </w:r>
+      <w:r>
+        <w:rPr>
+          <w:rStyle w:val="Strong"/>
+          <w:b w:val="0"/>
+          <w:bCs w:val="0"/>
+        </w:rPr>
+        <w:t xml:space="preserve"> value (R</w:t>
+      </w:r>
+      <w:r>
+        <w:rPr>
+          <w:rStyle w:val="Strong"/>
+          <w:b w:val="0"/>
+          <w:bCs w:val="0"/>
+          <w:vertAlign w:val="superscript"/>
+        </w:rPr>
+        <w:t>2</w:t>
+      </w:r>
+      <w:r>
+        <w:rPr>
+          <w:rStyle w:val="Strong"/>
+          <w:b w:val="0"/>
+          <w:bCs w:val="0"/>
+        </w:rPr>
+        <w:t>) metrics, as proposed by [10] [11] [12] [14], and these are defined as follows:</w:t>
+      </w:r>
+    </w:p>
+    <w:p>
+      <w:pPr>
+        <w:jc w:val="both"/>
+        <w:rPr>
+          <w:rStyle w:val="Strong"/>
+          <w:rFonts w:eastAsiaTheme="minorEastAsia"/>
+          <w:b w:val="0"/>
+          <w:bCs w:val="0"/>
+        </w:rPr>
+      </w:pPr>
+      <m:oMathPara>
+        <m:oMath>
+          <m:r>
+            <w:rPr>
+              <w:rStyle w:val="Strong"/>
+              <w:rFonts w:ascii="Cambria Math" w:hAnsi="Cambria Math"/>
+            </w:rPr>
+            <m:t xml:space="preserve">MAE= </m:t>
+          </m:r>
+          <m:nary>
+            <m:naryPr>
+              <m:chr m:val="∑"/>
+              <m:limLoc m:val="undOvr"/>
+              <m:ctrlPr>
+                <w:rPr>
+                  <w:rStyle w:val="Strong"/>
+                  <w:rFonts w:ascii="Cambria Math" w:hAnsi="Cambria Math"/>
+                  <w:b w:val="0"/>
+                  <w:bCs w:val="0"/>
+                  <w:i/>
+                </w:rPr>
+              </m:ctrlPr>
+            </m:naryPr>
+            <m:sub>
+              <m:r>
+                <w:rPr>
+                  <w:rStyle w:val="Strong"/>
+                  <w:rFonts w:ascii="Cambria Math" w:hAnsi="Cambria Math"/>
+                </w:rPr>
+                <m:t>t=1</m:t>
+              </m:r>
+            </m:sub>
+            <m:sup>
+              <m:r>
+                <w:rPr>
+                  <w:rStyle w:val="Strong"/>
+                  <w:rFonts w:ascii="Cambria Math" w:hAnsi="Cambria Math"/>
+                </w:rPr>
+                <m:t>n</m:t>
+              </m:r>
+            </m:sup>
+            <m:e>
+              <m:f>
+                <m:fPr>
+                  <m:ctrlPr>
+                    <w:rPr>
+                      <w:rStyle w:val="Strong"/>
+                      <w:rFonts w:ascii="Cambria Math" w:hAnsi="Cambria Math"/>
+                      <w:b w:val="0"/>
+                      <w:bCs w:val="0"/>
+                      <w:i/>
+                    </w:rPr>
+                  </m:ctrlPr>
+                </m:fPr>
+                <m:num>
+                  <m:r>
+                    <w:rPr>
+                      <w:rStyle w:val="Strong"/>
+                      <w:rFonts w:ascii="Cambria Math" w:hAnsi="Cambria Math"/>
+                    </w:rPr>
+                    <m:t>|</m:t>
+                  </m:r>
+                  <m:sSub>
+                    <m:sSubPr>
+                      <m:ctrlPr>
+                        <w:rPr>
+                          <w:rStyle w:val="Strong"/>
+                          <w:rFonts w:ascii="Cambria Math" w:hAnsi="Cambria Math"/>
+                          <w:b w:val="0"/>
+                          <w:bCs w:val="0"/>
+                          <w:i/>
+                        </w:rPr>
+                      </m:ctrlPr>
+                    </m:sSubPr>
+                    <m:e>
+                      <m:r>
+                        <w:rPr>
+                          <w:rStyle w:val="Strong"/>
+                          <w:rFonts w:ascii="Cambria Math" w:hAnsi="Cambria Math"/>
+                        </w:rPr>
+                        <m:t>y</m:t>
+                      </m:r>
+                    </m:e>
+                    <m:sub>
+                      <m:r>
+                        <w:rPr>
+                          <w:rStyle w:val="Strong"/>
+                          <w:rFonts w:ascii="Cambria Math" w:hAnsi="Cambria Math"/>
+                        </w:rPr>
+                        <m:t>pt</m:t>
+                      </m:r>
+                    </m:sub>
+                  </m:sSub>
+                  <m:r>
+                    <w:rPr>
+                      <w:rStyle w:val="Strong"/>
+                      <w:rFonts w:ascii="Cambria Math" w:hAnsi="Cambria Math"/>
+                    </w:rPr>
+                    <m:t xml:space="preserve">- </m:t>
+                  </m:r>
+                  <m:sSub>
+                    <m:sSubPr>
+                      <m:ctrlPr>
+                        <w:rPr>
+                          <w:rStyle w:val="Strong"/>
+                          <w:rFonts w:ascii="Cambria Math" w:hAnsi="Cambria Math"/>
+                          <w:b w:val="0"/>
+                          <w:bCs w:val="0"/>
+                          <w:i/>
+                        </w:rPr>
+                      </m:ctrlPr>
+                    </m:sSubPr>
+                    <m:e>
+                      <m:r>
+                        <w:rPr>
+                          <w:rStyle w:val="Strong"/>
+                          <w:rFonts w:ascii="Cambria Math" w:hAnsi="Cambria Math"/>
+                        </w:rPr>
+                        <m:t>y</m:t>
+                      </m:r>
+                    </m:e>
+                    <m:sub>
+                      <m:r>
+                        <w:rPr>
+                          <w:rStyle w:val="Strong"/>
+                          <w:rFonts w:ascii="Cambria Math" w:hAnsi="Cambria Math"/>
+                        </w:rPr>
+                        <m:t xml:space="preserve">t </m:t>
+                      </m:r>
+                    </m:sub>
+                  </m:sSub>
+                  <m:r>
+                    <w:rPr>
+                      <w:rStyle w:val="Strong"/>
+                      <w:rFonts w:ascii="Cambria Math" w:hAnsi="Cambria Math"/>
+                    </w:rPr>
+                    <m:t>|</m:t>
+                  </m:r>
+                </m:num>
+                <m:den>
+                  <m:r>
+                    <w:rPr>
+                      <w:rStyle w:val="Strong"/>
+                      <w:rFonts w:ascii="Cambria Math" w:hAnsi="Cambria Math"/>
+                    </w:rPr>
+                    <m:t>n</m:t>
+                  </m:r>
+                </m:den>
+              </m:f>
+            </m:e>
+          </m:nary>
+        </m:oMath>
+      </m:oMathPara>
+    </w:p>
+    <w:p>
+      <w:pPr>
+        <w:jc w:val="both"/>
+        <w:rPr>
+          <w:rStyle w:val="Strong"/>
+          <w:rFonts w:eastAsiaTheme="minorEastAsia"/>
+          <w:b w:val="0"/>
+          <w:bCs w:val="0"/>
+        </w:rPr>
+      </w:pPr>
+      <m:oMathPara>
+        <m:oMath>
+          <m:r>
+            <w:rPr>
+              <w:rStyle w:val="Strong"/>
+              <w:rFonts w:ascii="Cambria Math" w:hAnsi="Cambria Math"/>
+            </w:rPr>
+            <m:t xml:space="preserve">RMSE= </m:t>
+          </m:r>
+          <m:rad>
+            <m:radPr>
+              <m:degHide m:val="1"/>
+              <m:ctrlPr>
+                <w:rPr>
+                  <w:rStyle w:val="Strong"/>
+                  <w:rFonts w:ascii="Cambria Math" w:hAnsi="Cambria Math"/>
+                  <w:b w:val="0"/>
+                  <w:bCs w:val="0"/>
+                  <w:i/>
+                </w:rPr>
+              </m:ctrlPr>
+            </m:radPr>
+            <m:deg/>
+            <m:e>
+              <m:f>
+                <m:fPr>
+                  <m:ctrlPr>
+                    <w:rPr>
+                      <w:rStyle w:val="Strong"/>
+                      <w:rFonts w:ascii="Cambria Math" w:hAnsi="Cambria Math"/>
+                      <w:b w:val="0"/>
+                      <w:bCs w:val="0"/>
+                      <w:i/>
+                    </w:rPr>
+                  </m:ctrlPr>
+                </m:fPr>
+                <m:num>
+                  <m:nary>
+                    <m:naryPr>
+                      <m:chr m:val="∑"/>
+                      <m:limLoc m:val="undOvr"/>
+                      <m:ctrlPr>
+                        <w:rPr>
+                          <w:rStyle w:val="Strong"/>
+                          <w:rFonts w:ascii="Cambria Math" w:hAnsi="Cambria Math"/>
+                          <w:b w:val="0"/>
+                          <w:bCs w:val="0"/>
+                          <w:i/>
+                        </w:rPr>
+                      </m:ctrlPr>
+                    </m:naryPr>
+                    <m:sub>
+                      <m:r>
+                        <w:rPr>
+                          <w:rStyle w:val="Strong"/>
+                          <w:rFonts w:ascii="Cambria Math" w:hAnsi="Cambria Math"/>
+                        </w:rPr>
+                        <m:t>t=1</m:t>
+                      </m:r>
+                    </m:sub>
+                    <m:sup>
+                      <m:r>
+                        <w:rPr>
+                          <w:rStyle w:val="Strong"/>
+                          <w:rFonts w:ascii="Cambria Math" w:hAnsi="Cambria Math"/>
+                        </w:rPr>
+                        <m:t>n</m:t>
+                      </m:r>
+                    </m:sup>
+                    <m:e>
+                      <m:sSup>
+                        <m:sSupPr>
+                          <m:ctrlPr>
+                            <w:rPr>
+                              <w:rStyle w:val="Strong"/>
+                              <w:rFonts w:ascii="Cambria Math" w:hAnsi="Cambria Math"/>
+                              <w:b w:val="0"/>
+                              <w:bCs w:val="0"/>
+                              <w:i/>
+                            </w:rPr>
+                          </m:ctrlPr>
+                        </m:sSupPr>
+                        <m:e>
+                          <m:r>
+                            <w:rPr>
+                              <w:rStyle w:val="Strong"/>
+                              <w:rFonts w:ascii="Cambria Math" w:hAnsi="Cambria Math"/>
+                            </w:rPr>
+                            <m:t>(</m:t>
+                          </m:r>
+                          <m:sSub>
+                            <m:sSubPr>
+                              <m:ctrlPr>
+                                <w:rPr>
+                                  <w:rStyle w:val="Strong"/>
+                                  <w:rFonts w:ascii="Cambria Math" w:hAnsi="Cambria Math"/>
+                                  <w:b w:val="0"/>
+                                  <w:bCs w:val="0"/>
+                                  <w:i/>
+                                </w:rPr>
+                              </m:ctrlPr>
+                            </m:sSubPr>
+                            <m:e>
+                              <m:r>
+                                <w:rPr>
+                                  <w:rStyle w:val="Strong"/>
+                                  <w:rFonts w:ascii="Cambria Math" w:hAnsi="Cambria Math"/>
+                                </w:rPr>
+                                <m:t>y</m:t>
+                              </m:r>
+                            </m:e>
+                            <m:sub>
+                              <m:r>
+                                <w:rPr>
+                                  <w:rStyle w:val="Strong"/>
+                                  <w:rFonts w:ascii="Cambria Math" w:hAnsi="Cambria Math"/>
+                                </w:rPr>
+                                <m:t>pt</m:t>
+                              </m:r>
+                            </m:sub>
+                          </m:sSub>
+                          <m:r>
+                            <w:rPr>
+                              <w:rStyle w:val="Strong"/>
+                              <w:rFonts w:ascii="Cambria Math" w:hAnsi="Cambria Math"/>
+                            </w:rPr>
+                            <m:t xml:space="preserve">- </m:t>
+                          </m:r>
+                          <m:sSub>
+                            <m:sSubPr>
+                              <m:ctrlPr>
+                                <w:rPr>
+                                  <w:rStyle w:val="Strong"/>
+                                  <w:rFonts w:ascii="Cambria Math" w:hAnsi="Cambria Math"/>
+                                  <w:b w:val="0"/>
+                                  <w:bCs w:val="0"/>
+                                  <w:i/>
+                                </w:rPr>
+                              </m:ctrlPr>
+                            </m:sSubPr>
+                            <m:e>
+                              <m:r>
+                                <w:rPr>
+                                  <w:rStyle w:val="Strong"/>
+                                  <w:rFonts w:ascii="Cambria Math" w:hAnsi="Cambria Math"/>
+                                </w:rPr>
+                                <m:t>y</m:t>
+                              </m:r>
+                            </m:e>
+                            <m:sub>
+                              <m:r>
+                                <w:rPr>
+                                  <w:rStyle w:val="Strong"/>
+                                  <w:rFonts w:ascii="Cambria Math" w:hAnsi="Cambria Math"/>
+                                </w:rPr>
+                                <m:t xml:space="preserve">t </m:t>
+                              </m:r>
+                            </m:sub>
+                          </m:sSub>
+                          <m:r>
+                            <w:rPr>
+                              <w:rStyle w:val="Strong"/>
+                              <w:rFonts w:ascii="Cambria Math" w:hAnsi="Cambria Math"/>
+                            </w:rPr>
+                            <m:t>)</m:t>
+                          </m:r>
+                        </m:e>
+                        <m:sup>
+                          <m:r>
+                            <w:rPr>
+                              <w:rStyle w:val="Strong"/>
+                              <w:rFonts w:ascii="Cambria Math" w:hAnsi="Cambria Math"/>
+                            </w:rPr>
+                            <m:t>2</m:t>
+                          </m:r>
+                        </m:sup>
+                      </m:sSup>
+                    </m:e>
+                  </m:nary>
+                </m:num>
+                <m:den>
+                  <m:r>
+                    <w:rPr>
+                      <w:rStyle w:val="Strong"/>
+                      <w:rFonts w:ascii="Cambria Math" w:hAnsi="Cambria Math"/>
+                    </w:rPr>
+                    <m:t>n</m:t>
+                  </m:r>
+                </m:den>
+              </m:f>
+            </m:e>
+          </m:rad>
+        </m:oMath>
+      </m:oMathPara>
+    </w:p>
+    <w:p>
+      <w:pPr>
+        <w:jc w:val="both"/>
+        <w:rPr>
+          <w:rStyle w:val="Strong"/>
+          <w:b w:val="0"/>
+          <w:bCs w:val="0"/>
+        </w:rPr>
+      </w:pPr>
+      <m:oMathPara>
+        <m:oMath>
+          <m:sSup>
+            <m:sSupPr>
+              <m:ctrlPr>
+                <w:rPr>
+                  <w:rStyle w:val="Strong"/>
+                  <w:rFonts w:ascii="Cambria Math" w:hAnsi="Cambria Math"/>
+                  <w:b w:val="0"/>
+                  <w:bCs w:val="0"/>
+                  <w:i/>
+                </w:rPr>
+              </m:ctrlPr>
+            </m:sSupPr>
+            <m:e>
+              <m:r>
+                <w:rPr>
+                  <w:rStyle w:val="Strong"/>
+                  <w:rFonts w:ascii="Cambria Math" w:hAnsi="Cambria Math"/>
+                </w:rPr>
+                <m:t>R</m:t>
+              </m:r>
+            </m:e>
+            <m:sup>
+              <m:r>
+                <w:rPr>
+                  <w:rStyle w:val="Strong"/>
+                  <w:rFonts w:ascii="Cambria Math" w:hAnsi="Cambria Math"/>
+                </w:rPr>
+                <m:t>2</m:t>
+              </m:r>
+            </m:sup>
+          </m:sSup>
+          <m:r>
+            <w:rPr>
+              <w:rStyle w:val="Strong"/>
+              <w:rFonts w:ascii="Cambria Math" w:hAnsi="Cambria Math"/>
+            </w:rPr>
+            <m:t xml:space="preserve">=1- </m:t>
+          </m:r>
+          <m:f>
+            <m:fPr>
+              <m:ctrlPr>
+                <w:rPr>
+                  <w:rStyle w:val="Strong"/>
+                  <w:rFonts w:ascii="Cambria Math" w:hAnsi="Cambria Math"/>
+                  <w:b w:val="0"/>
+                  <w:bCs w:val="0"/>
+                  <w:i/>
+                </w:rPr>
+              </m:ctrlPr>
+            </m:fPr>
+            <m:num>
+              <m:nary>
+                <m:naryPr>
+                  <m:chr m:val="∑"/>
+                  <m:limLoc m:val="undOvr"/>
+                  <m:ctrlPr>
+                    <w:rPr>
+                      <w:rStyle w:val="Strong"/>
+                      <w:rFonts w:ascii="Cambria Math" w:hAnsi="Cambria Math"/>
+                      <w:b w:val="0"/>
+                      <w:bCs w:val="0"/>
+                      <w:i/>
+                    </w:rPr>
+                  </m:ctrlPr>
+                </m:naryPr>
+                <m:sub>
+                  <m:r>
+                    <w:rPr>
+                      <w:rStyle w:val="Strong"/>
+                      <w:rFonts w:ascii="Cambria Math" w:hAnsi="Cambria Math"/>
+                    </w:rPr>
+                    <m:t>i=1</m:t>
+                  </m:r>
+                </m:sub>
+                <m:sup>
+                  <m:r>
+                    <w:rPr>
+                      <w:rStyle w:val="Strong"/>
+                      <w:rFonts w:ascii="Cambria Math" w:hAnsi="Cambria Math"/>
+                    </w:rPr>
+                    <m:t>n</m:t>
+                  </m:r>
+                </m:sup>
+                <m:e>
+                  <m:sSup>
+                    <m:sSupPr>
+                      <m:ctrlPr>
+                        <w:rPr>
+                          <w:rStyle w:val="Strong"/>
+                          <w:rFonts w:ascii="Cambria Math" w:hAnsi="Cambria Math"/>
+                          <w:b w:val="0"/>
+                          <w:bCs w:val="0"/>
+                          <w:i/>
+                        </w:rPr>
+                      </m:ctrlPr>
+                    </m:sSupPr>
+                    <m:e>
+                      <m:r>
+                        <w:rPr>
+                          <w:rStyle w:val="Strong"/>
+                          <w:rFonts w:ascii="Cambria Math" w:hAnsi="Cambria Math"/>
+                        </w:rPr>
+                        <m:t>(</m:t>
+                      </m:r>
+                      <m:sSub>
+                        <m:sSubPr>
+                          <m:ctrlPr>
+                            <w:rPr>
+                              <w:rStyle w:val="Strong"/>
+                              <w:rFonts w:ascii="Cambria Math" w:hAnsi="Cambria Math"/>
+                              <w:b w:val="0"/>
+                              <w:bCs w:val="0"/>
+                              <w:i/>
+                            </w:rPr>
+                          </m:ctrlPr>
+                        </m:sSubPr>
+                        <m:e>
+                          <m:r>
+                            <w:rPr>
+                              <w:rStyle w:val="Strong"/>
+                              <w:rFonts w:ascii="Cambria Math" w:hAnsi="Cambria Math"/>
+                            </w:rPr>
+                            <m:t>y</m:t>
+                          </m:r>
+                        </m:e>
+                        <m:sub>
+                          <m:r>
+                            <w:rPr>
+                              <w:rStyle w:val="Strong"/>
+                              <w:rFonts w:ascii="Cambria Math" w:hAnsi="Cambria Math"/>
+                            </w:rPr>
+                            <m:t>i</m:t>
+                          </m:r>
+                        </m:sub>
+                      </m:sSub>
+                      <m:r>
+                        <w:rPr>
+                          <w:rStyle w:val="Strong"/>
+                          <w:rFonts w:ascii="Cambria Math" w:hAnsi="Cambria Math"/>
+                        </w:rPr>
+                        <m:t xml:space="preserve"> - </m:t>
+                      </m:r>
+                      <m:sSub>
+                        <m:sSubPr>
+                          <m:ctrlPr>
+                            <w:rPr>
+                              <w:rStyle w:val="Strong"/>
+                              <w:rFonts w:ascii="Cambria Math" w:hAnsi="Cambria Math"/>
+                              <w:b w:val="0"/>
+                              <w:bCs w:val="0"/>
+                              <w:i/>
+                            </w:rPr>
+                          </m:ctrlPr>
+                        </m:sSubPr>
+                        <m:e>
+                          <m:acc>
+                            <m:accPr>
+                              <m:ctrlPr>
+                                <w:rPr>
+                                  <w:rStyle w:val="Strong"/>
+                                  <w:rFonts w:ascii="Cambria Math" w:hAnsi="Cambria Math"/>
+                                  <w:b w:val="0"/>
+                                  <w:bCs w:val="0"/>
+                                  <w:i/>
+                                </w:rPr>
+                              </m:ctrlPr>
+                            </m:accPr>
+                            <m:e>
+                              <m:r>
+                                <w:rPr>
+                                  <w:rStyle w:val="Strong"/>
+                                  <w:rFonts w:ascii="Cambria Math" w:hAnsi="Cambria Math"/>
+                                </w:rPr>
+                                <m:t>y</m:t>
+                              </m:r>
+                            </m:e>
+                          </m:acc>
+                        </m:e>
+                        <m:sub>
+                          <m:r>
+                            <w:rPr>
+                              <w:rStyle w:val="Strong"/>
+                              <w:rFonts w:ascii="Cambria Math" w:hAnsi="Cambria Math"/>
+                            </w:rPr>
+                            <m:t>i</m:t>
+                          </m:r>
+                        </m:sub>
+                      </m:sSub>
+                      <m:r>
+                        <w:rPr>
+                          <w:rStyle w:val="Strong"/>
+                          <w:rFonts w:ascii="Cambria Math" w:hAnsi="Cambria Math"/>
+                        </w:rPr>
+                        <m:t>)</m:t>
+                      </m:r>
+                    </m:e>
+                    <m:sup>
+                      <m:r>
+                        <w:rPr>
+                          <w:rStyle w:val="Strong"/>
+                          <w:rFonts w:ascii="Cambria Math" w:hAnsi="Cambria Math"/>
+                        </w:rPr>
+                        <m:t>2</m:t>
+                      </m:r>
+                    </m:sup>
+                  </m:sSup>
+                </m:e>
+              </m:nary>
+            </m:num>
+            <m:den>
+              <m:nary>
+                <m:naryPr>
+                  <m:chr m:val="∑"/>
+                  <m:limLoc m:val="undOvr"/>
+                  <m:ctrlPr>
+                    <w:rPr>
+                      <w:rStyle w:val="Strong"/>
+                      <w:rFonts w:ascii="Cambria Math" w:hAnsi="Cambria Math"/>
+                      <w:b w:val="0"/>
+                      <w:bCs w:val="0"/>
+                      <w:i/>
+                    </w:rPr>
+                  </m:ctrlPr>
+                </m:naryPr>
+                <m:sub>
+                  <m:r>
+                    <w:rPr>
+                      <w:rStyle w:val="Strong"/>
+                      <w:rFonts w:ascii="Cambria Math" w:hAnsi="Cambria Math"/>
+                    </w:rPr>
+                    <m:t>i=1</m:t>
+                  </m:r>
+                </m:sub>
+                <m:sup>
+                  <m:r>
+                    <w:rPr>
+                      <w:rStyle w:val="Strong"/>
+                      <w:rFonts w:ascii="Cambria Math" w:hAnsi="Cambria Math"/>
+                    </w:rPr>
+                    <m:t>n</m:t>
+                  </m:r>
+                </m:sup>
+                <m:e>
+                  <m:sSup>
+                    <m:sSupPr>
+                      <m:ctrlPr>
+                        <w:rPr>
+                          <w:rStyle w:val="Strong"/>
+                          <w:rFonts w:ascii="Cambria Math" w:hAnsi="Cambria Math"/>
+                          <w:b w:val="0"/>
+                          <w:bCs w:val="0"/>
+                          <w:i/>
+                        </w:rPr>
+                      </m:ctrlPr>
+                    </m:sSupPr>
+                    <m:e>
+                      <m:r>
+                        <w:rPr>
+                          <w:rStyle w:val="Strong"/>
+                          <w:rFonts w:ascii="Cambria Math" w:hAnsi="Cambria Math"/>
+                        </w:rPr>
+                        <m:t>(</m:t>
+                      </m:r>
+                      <m:sSub>
+                        <m:sSubPr>
+                          <m:ctrlPr>
+                            <w:rPr>
+                              <w:rStyle w:val="Strong"/>
+                              <w:rFonts w:ascii="Cambria Math" w:hAnsi="Cambria Math"/>
+                              <w:b w:val="0"/>
+                              <w:bCs w:val="0"/>
+                              <w:i/>
+                            </w:rPr>
+                          </m:ctrlPr>
+                        </m:sSubPr>
+                        <m:e>
+                          <m:r>
+                            <w:rPr>
+                              <w:rStyle w:val="Strong"/>
+                              <w:rFonts w:ascii="Cambria Math" w:hAnsi="Cambria Math"/>
+                            </w:rPr>
+                            <m:t>y</m:t>
+                          </m:r>
+                        </m:e>
+                        <m:sub>
+                          <m:r>
+                            <w:rPr>
+                              <w:rStyle w:val="Strong"/>
+                              <w:rFonts w:ascii="Cambria Math" w:hAnsi="Cambria Math"/>
+                            </w:rPr>
+                            <m:t>i</m:t>
+                          </m:r>
+                        </m:sub>
+                      </m:sSub>
+                      <m:r>
+                        <w:rPr>
+                          <w:rStyle w:val="Strong"/>
+                          <w:rFonts w:ascii="Cambria Math" w:hAnsi="Cambria Math"/>
+                        </w:rPr>
+                        <m:t xml:space="preserve"> - </m:t>
+                      </m:r>
+                      <m:acc>
+                        <m:accPr>
+                          <m:chr m:val="̅"/>
+                          <m:ctrlPr>
+                            <w:rPr>
+                              <w:rStyle w:val="Strong"/>
+                              <w:rFonts w:ascii="Cambria Math" w:hAnsi="Cambria Math"/>
+                              <w:b w:val="0"/>
+                              <w:bCs w:val="0"/>
+                              <w:i/>
+                            </w:rPr>
+                          </m:ctrlPr>
+                        </m:accPr>
+                        <m:e>
+                          <m:r>
+                            <w:rPr>
+                              <w:rStyle w:val="Strong"/>
+                              <w:rFonts w:ascii="Cambria Math" w:hAnsi="Cambria Math"/>
+                            </w:rPr>
+                            <m:t>y</m:t>
+                          </m:r>
+                        </m:e>
+                      </m:acc>
+                      <m:r>
+                        <w:rPr>
+                          <w:rStyle w:val="Strong"/>
+                          <w:rFonts w:ascii="Cambria Math" w:hAnsi="Cambria Math"/>
+                        </w:rPr>
+                        <m:t>)</m:t>
+                      </m:r>
+                    </m:e>
+                    <m:sup>
+                      <m:r>
+                        <w:rPr>
+                          <w:rStyle w:val="Strong"/>
+                          <w:rFonts w:ascii="Cambria Math" w:hAnsi="Cambria Math"/>
+                        </w:rPr>
+                        <m:t>2</m:t>
+                      </m:r>
+                    </m:sup>
+                  </m:sSup>
+                </m:e>
+              </m:nary>
+            </m:den>
+          </m:f>
+          <m:r>
+            <w:rPr>
+              <w:rStyle w:val="Strong"/>
+              <w:rFonts w:ascii="Cambria Math" w:hAnsi="Cambria Math"/>
+            </w:rPr>
+            <m:t xml:space="preserve"> </m:t>
+          </m:r>
+        </m:oMath>
+      </m:oMathPara>
+    </w:p>
+    <w:p>
+      <w:pPr>
+        <w:jc w:val="both"/>
+        <w:rPr>
+          <w:rStyle w:val="Strong"/>
+          <w:b w:val="0"/>
+          <w:bCs w:val="0"/>
+        </w:rPr>
+      </w:pPr>
+      <w:r>
+        <w:rPr>
+          <w:rStyle w:val="Strong"/>
+          <w:b w:val="0"/>
+          <w:bCs w:val="0"/>
+        </w:rPr>
+        <w:t xml:space="preserve">To answer this research question, the MAE was key to deduce which model accomplished the closest prediction to the actual target MRT value. The other values were still calculated because </w:t>
+      </w:r>
+      <w:r>
+        <w:rPr>
+          <w:rStyle w:val="Strong"/>
+          <w:b w:val="0"/>
+          <w:bCs w:val="0"/>
+        </w:rPr>
+        <w:lastRenderedPageBreak/>
+        <w:t>they were used in conjunction with the results obtained within the following research question and to serve as backup in case the MAE values had no significant difference. Obviously, these were calculated using their respective imports from sklearn.metrics library. Reliability was established by repeating the experiment three times, thereby reducing the likelihood of random errors. Such an approach was also adopted by [13].</w:t>
+      </w:r>
+    </w:p>
+    <w:p>
+      <w:pPr>
+        <w:jc w:val="both"/>
+        <w:rPr>
+          <w:rStyle w:val="Strong"/>
+          <w:i/>
+          <w:iCs/>
+        </w:rPr>
+      </w:pPr>
+      <w:r>
+        <w:rPr>
+          <w:rStyle w:val="Strong"/>
+          <w:i/>
+          <w:iCs/>
+        </w:rPr>
+        <w:t>RQ2: To what extent does the amount of weekly historical data affect the predictive accuracy?</w:t>
+      </w:r>
+    </w:p>
+    <w:p>
+      <w:pPr>
+        <w:jc w:val="both"/>
+        <w:rPr>
+          <w:rStyle w:val="Strong"/>
+          <w:b w:val="0"/>
+          <w:bCs w:val="0"/>
+        </w:rPr>
+      </w:pPr>
+      <w:r>
+        <w:rPr>
+          <w:rStyle w:val="Strong"/>
+          <w:b w:val="0"/>
+          <w:bCs w:val="0"/>
+        </w:rPr>
+        <w:t>Using the metric scores from the previous experiment, this subsection addresses the second research question, where the main objective is to observe how both models adjust and perform when provided with fewer weeks of training data. In doing so, the ideal ML regressor will be identified.</w:t>
+      </w:r>
+    </w:p>
+    <w:p>
+      <w:pPr>
+        <w:jc w:val="both"/>
+        <w:rPr>
+          <w:rStyle w:val="Strong"/>
+          <w:b w:val="0"/>
+          <w:bCs w:val="0"/>
+        </w:rPr>
+      </w:pPr>
+      <w:r>
+        <w:rPr>
+          <w:rStyle w:val="Strong"/>
+          <w:b w:val="0"/>
+          <w:bCs w:val="0"/>
+        </w:rPr>
+        <w:t>The investigation leveraged the same sequentially ordered activity dataset, but this time using fewer weeks of historical data. Both model architectures were kept the same as those developed within the first experiment to maintain coherence. The same train-test split strategy and 10-fold cross-validation technique were also applied to the weekly reduced datasets, as these models were provided with progressively reduced information, starting from 14 weeks, and going down to 6 weeks (in two-week interval steps). Another study [12] also used tree-based ensemble regression models, but only with 6 weeks of data; thus, this led to such a methodological approach. In this instance, the MAE and R-squared values were most critical, with the RMSE highlighting any limitations of the individual models. Consistency was maintained by training each model 3 times, which mitigated random errors as done within the first research question.</w:t>
+      </w:r>
+    </w:p>
+    <w:p>
+      <w:pPr>
+        <w:keepNext/>
+        <w:spacing w:line="360" w:lineRule="auto"/>
+        <w:jc w:val="both"/>
+      </w:pPr>
+      <w:r>
+        <w:rPr>
+          <w:b/>
+          <w:bCs/>
+          <w:noProof/>
+        </w:rPr>
+        <w:lastRenderedPageBreak/>
+        <w:drawing>
+          <wp:inline distT="0" distB="0" distL="0" distR="0" wp14:anchorId="1C308088" wp14:editId="0C21EBED">
+            <wp:extent cx="5731510" cy="4937760"/>
+            <wp:effectExtent l="0" t="0" r="2540" b="0"/>
+            <wp:docPr id="2011485321" name="Picture 1"/>
+            <wp:cNvGraphicFramePr>
+              <a:graphicFrameLocks xmlns:a="http://schemas.openxmlformats.org/drawingml/2006/main" noChangeAspect="1"/>
+            </wp:cNvGraphicFramePr>
+            <a:graphic xmlns:a="http://schemas.openxmlformats.org/drawingml/2006/main">
+              <a:graphicData uri="http://schemas.openxmlformats.org/drawingml/2006/picture">
+                <pic:pic xmlns:pic="http://schemas.openxmlformats.org/drawingml/2006/picture">
+                  <pic:nvPicPr>
+                    <pic:cNvPr id="2011485321" name="Picture 2011485321"/>
+                    <pic:cNvPicPr/>
+                  </pic:nvPicPr>
+                  <pic:blipFill>
+                    <a:blip r:embed="rId10">
+                      <a:extLst>
+                        <a:ext uri="{28A0092B-C50C-407E-A947-70E740481C1C}">
+                          <a14:useLocalDpi xmlns:a14="http://schemas.microsoft.com/office/drawing/2010/main" val="0"/>
+                        </a:ext>
+                      </a:extLst>
+                    </a:blip>
+                    <a:stretch>
+                      <a:fillRect/>
+                    </a:stretch>
+                  </pic:blipFill>
+                  <pic:spPr>
+                    <a:xfrm>
+                      <a:off x="0" y="0"/>
+                      <a:ext cx="5731510" cy="4937760"/>
+                    </a:xfrm>
+                    <a:prstGeom prst="rect">
+                      <a:avLst/>
+                    </a:prstGeom>
+                  </pic:spPr>
+                </pic:pic>
+              </a:graphicData>
+            </a:graphic>
+          </wp:inline>
+        </w:drawing>
+      </w:r>
+    </w:p>
+    <w:p>
+      <w:pPr>
+        <w:pStyle w:val="Caption"/>
+        <w:jc w:val="center"/>
+      </w:pPr>
+      <w:r>
+        <w:t xml:space="preserve">Figure </w:t>
+      </w:r>
+      <w:r>
+        <w:fldChar w:fldCharType="begin"/>
+      </w:r>
+      <w:r>
+        <w:instrText xml:space="preserve"> SEQ Figure \* ARABIC </w:instrText>
+      </w:r>
+      <w:r>
+        <w:fldChar w:fldCharType="separate"/>
+      </w:r>
+      <w:r>
+        <w:rPr>
+          <w:noProof/>
+        </w:rPr>
+        <w:t>2</w:t>
+      </w:r>
+      <w:r>
+        <w:fldChar w:fldCharType="end"/>
+      </w:r>
+      <w:r>
+        <w:t xml:space="preserve"> Research Pipeline</w:t>
+      </w:r>
+    </w:p>
+    <w:p>
+      <w:pPr>
+        <w:jc w:val="both"/>
+        <w:rPr>
+          <w:rStyle w:val="Strong"/>
+          <w:b w:val="0"/>
+          <w:bCs w:val="0"/>
+          <w:i/>
+          <w:iCs/>
+        </w:rPr>
+      </w:pPr>
+      <w:r>
+        <w:rPr>
+          <w:rStyle w:val="Strong"/>
+          <w:b w:val="0"/>
+          <w:bCs w:val="0"/>
+          <w:i/>
+          <w:iCs/>
+        </w:rPr>
+        <w:t>C. Validity, Reliability, and Generalizability</w:t>
+      </w:r>
+    </w:p>
+    <w:p>
+      <w:pPr>
+        <w:jc w:val="both"/>
+        <w:rPr>
+          <w:rStyle w:val="Strong"/>
+          <w:b w:val="0"/>
+          <w:bCs w:val="0"/>
+        </w:rPr>
+      </w:pPr>
+      <w:r>
+        <w:rPr>
+          <w:rStyle w:val="Strong"/>
+          <w:b w:val="0"/>
+          <w:bCs w:val="0"/>
+          <w:i/>
+          <w:iCs/>
+        </w:rPr>
+        <w:t>Validity:</w:t>
+      </w:r>
+      <w:r>
+        <w:rPr>
+          <w:rStyle w:val="Strong"/>
+          <w:b w:val="0"/>
+          <w:bCs w:val="0"/>
+        </w:rPr>
+        <w:t xml:space="preserve"> Numerous steps were taken to ensure the validity of each experiment, including the common 80:20 split ratio technique for all datasets, even after reducing some historical data. Consequently, the same train and test data files were supplied to each ML regressor to ensure valid comparisons. The models were also chosen with intent, as they fall within the same ML category types and require no feature scaling. Construct validity was adhered to when developing new features, as they represented valid athlete physical exertions during the training block. Additionally, the evaluation metrics (MAE, RMSE, R</w:t>
+      </w:r>
+      <w:r>
+        <w:rPr>
+          <w:rStyle w:val="Strong"/>
+          <w:b w:val="0"/>
+          <w:bCs w:val="0"/>
+          <w:vertAlign w:val="superscript"/>
+        </w:rPr>
+        <w:t>2</w:t>
+      </w:r>
+      <w:r>
+        <w:rPr>
+          <w:rStyle w:val="Strong"/>
+          <w:b w:val="0"/>
+          <w:bCs w:val="0"/>
+        </w:rPr>
+        <w:t>) were valid as they were used in similar studies [10] [11] [12] [14], and they provided complementary strengths to ensure a robust and valid evaluation.</w:t>
+      </w:r>
+    </w:p>
+    <w:p>
+      <w:pPr>
+        <w:jc w:val="both"/>
+        <w:rPr>
+          <w:rStyle w:val="Strong"/>
+          <w:b w:val="0"/>
+          <w:bCs w:val="0"/>
+        </w:rPr>
+      </w:pPr>
+      <w:r>
+        <w:rPr>
+          <w:rStyle w:val="Strong"/>
+          <w:b w:val="0"/>
+          <w:bCs w:val="0"/>
+          <w:i/>
+          <w:iCs/>
+        </w:rPr>
+        <w:t xml:space="preserve">Reliability: </w:t>
+      </w:r>
+      <w:r>
+        <w:rPr>
+          <w:rStyle w:val="Strong"/>
+          <w:b w:val="0"/>
+          <w:bCs w:val="0"/>
+        </w:rPr>
+        <w:t>Having the model architectures and common hyperparameter values as control variables ensured experimental reliability. Using the domain-standard 10-fold cross-validation technique ensured stable and consistent results during training and testing. Moreover, both models were trained three times on all the supplied datasets to mitigate any random errors, and the same technologies and environments were used. Notably, a common script was utilised when calculating and developing new features for all datasets.</w:t>
+      </w:r>
+    </w:p>
+    <w:p>
+      <w:pPr>
+        <w:jc w:val="both"/>
+      </w:pPr>
+      <w:r>
+        <w:rPr>
+          <w:rStyle w:val="Strong"/>
+          <w:b w:val="0"/>
+          <w:bCs w:val="0"/>
+          <w:i/>
+          <w:iCs/>
+        </w:rPr>
+        <w:lastRenderedPageBreak/>
+        <w:t xml:space="preserve">Generalizability: </w:t>
+      </w:r>
+      <w:r>
+        <w:rPr>
+          <w:rStyle w:val="Strong"/>
+          <w:b w:val="0"/>
+          <w:bCs w:val="0"/>
+        </w:rPr>
+        <w:t xml:space="preserve">Regarding this aspect, the results are partially limited because the study focused on a specific demographic, applying only to male runners aged 35 to 54. Therefore, employing the developed models on athletes from different demographic groups would yield inaccurate results. Also, only two ML regressors were used with a specific, consistent structure throughout. On the other hand, when the models were provided with unseen test data, they adjusted and performed predictions accordingly, and training data was gathered before five of the six major marathons. Thus making them applicable for most marathon majors for this specific demographic group. </w:t>
+      </w:r>
+      <w:r>
+        <w:rPr>
+          <w:rStyle w:val="Strong"/>
+          <w:b w:val="0"/>
+          <w:bCs w:val="0"/>
+        </w:rPr>
+        <w:t>W</w:t>
+      </w:r>
+      <w:r>
+        <w:rPr>
+          <w:rStyle w:val="Strong"/>
+          <w:b w:val="0"/>
+          <w:bCs w:val="0"/>
+        </w:rPr>
+        <w:t>hile the research provides valuable insight into MRT predictions, attention should be given when applied to broader contexts.</w:t>
+      </w:r>
+    </w:p>
+    <w:p>
+      <w:pPr>
+        <w:jc w:val="both"/>
+        <w:rPr>
+          <w:rStyle w:val="Strong"/>
+          <w:b w:val="0"/>
+          <w:bCs w:val="0"/>
+          <w:i/>
+          <w:iCs/>
+        </w:rPr>
+      </w:pPr>
+      <w:r>
+        <w:rPr>
+          <w:rStyle w:val="Strong"/>
+          <w:b w:val="0"/>
+          <w:bCs w:val="0"/>
+          <w:i/>
+          <w:iCs/>
+        </w:rPr>
+        <w:t>D. Technologies and Environment Used</w:t>
+      </w:r>
+    </w:p>
+    <w:p>
+      <w:pPr>
+        <w:jc w:val="both"/>
+        <w:rPr>
+          <w:rStyle w:val="Strong"/>
+          <w:b w:val="0"/>
+          <w:bCs w:val="0"/>
+        </w:rPr>
+      </w:pPr>
+      <w:r>
+        <w:rPr>
+          <w:rStyle w:val="Strong"/>
+          <w:b w:val="0"/>
+          <w:bCs w:val="0"/>
+        </w:rPr>
+        <w:t>The experiments were executed on a local machine with a 13</w:t>
+      </w:r>
+      <w:r>
+        <w:rPr>
+          <w:rStyle w:val="Strong"/>
+          <w:b w:val="0"/>
+          <w:bCs w:val="0"/>
+          <w:vertAlign w:val="superscript"/>
+        </w:rPr>
+        <w:t>th</w:t>
+      </w:r>
+      <w:r>
+        <w:rPr>
+          <w:rStyle w:val="Strong"/>
+          <w:b w:val="0"/>
+          <w:bCs w:val="0"/>
+        </w:rPr>
+        <w:t xml:space="preserve"> Gen Intel® Core™ i7-1355U CPU, 16 GB of RAM, and an integrated Intel® UHD Graphics GPU, drawing from 7.8 GB of the system RAM. Since the ML regression models did not require high computational power for training and testing, this setup was more than enough. All the prototypes were developed and executed in a dedicated Python 3.11.14 environment using a Jupyter Notebook with multiple sections, as it provides a lot of flexibility and compatibility. Additionally, key dependencies and libraries included NumPy, Pandas, Matplotlib, Seaborn, Scikit-learn, Statsmodels, TensorFlow, and Dill, managed via the conda-forge channel.</w:t>
+      </w:r>
+    </w:p>
+    <w:p>
+      <w:pPr>
+        <w:jc w:val="both"/>
+        <w:rPr>
+          <w:rStyle w:val="Strong"/>
+          <w:b w:val="0"/>
+          <w:bCs w:val="0"/>
+          <w:i/>
+          <w:iCs/>
+        </w:rPr>
+      </w:pPr>
+      <w:r>
+        <w:rPr>
+          <w:rStyle w:val="Strong"/>
+          <w:b w:val="0"/>
+          <w:bCs w:val="0"/>
+          <w:i/>
+          <w:iCs/>
+        </w:rPr>
+        <w:t>E. Ethical Considerations</w:t>
+      </w:r>
+    </w:p>
+    <w:p>
+      <w:pPr>
+        <w:jc w:val="both"/>
+        <w:rPr>
+          <w:rStyle w:val="Strong"/>
+          <w:b w:val="0"/>
+          <w:bCs w:val="0"/>
+        </w:rPr>
+      </w:pPr>
+      <w:r>
+        <w:rPr>
+          <w:rStyle w:val="Strong"/>
+          <w:b w:val="0"/>
+          <w:bCs w:val="0"/>
+        </w:rPr>
+        <w:t xml:space="preserve">While conducting this study, an open-source dataset was used, consisting of running activity gathered from public athlete Strava pages. As a data source, it was used in numerous studies. It is licensed under the Creative Commons Attribution 4.0 (CC BY 4.0, Deed – Attribution 4.0 International – Creative Commons) licence, and the data collection process was in accordance with the Brazilian Ethics Research Committee standards. </w:t>
+      </w:r>
+    </w:p>
+    <w:p>
+      <w:pPr>
+        <w:jc w:val="both"/>
+        <w:rPr>
+          <w:rStyle w:val="Strong"/>
+          <w:b w:val="0"/>
+          <w:bCs w:val="0"/>
+        </w:rPr>
+      </w:pPr>
+      <w:r>
+        <w:rPr>
+          <w:rStyle w:val="Strong"/>
+          <w:b w:val="0"/>
+          <w:bCs w:val="0"/>
+        </w:rPr>
+        <w:t>The</w:t>
+      </w:r>
+      <w:r>
+        <w:rPr>
+          <w:rStyle w:val="Strong"/>
+          <w:b w:val="0"/>
+          <w:bCs w:val="0"/>
+        </w:rPr>
+        <w:t xml:space="preserve"> individuals were anonymised, and no personal information was kept or shared to safeguard any sensitive information and the runners’ identities. Only essential training session data was used, such as training distance and duration, gender, age group, country, and a list of previously run marathon majors. No harm was inflicted on the runners themselves as they were not instructed or forced to run for the benefit of this study; rather, they were primarily randomly chosen from Strava based on their participation in marathon majors in 2019 and 2020. </w:t>
+      </w:r>
+    </w:p>
+    <w:p>
+      <w:r>
+        <w:rPr>
+          <w:rStyle w:val="Strong"/>
+          <w:b w:val="0"/>
+          <w:bCs w:val="0"/>
+        </w:rPr>
+        <w:t>In mentioning Strava, a popular training application worldwide, the tracking devices used during the training sessions, their software, and those linked to them were not recorded as they did not form part of this study. Our study is purely aimed at predicting an athlete's running performances within different marathons while leveraging separate training efforts.</w:t>
+      </w:r>
+    </w:p>
+    <w:p>
+      <w:pPr>
+        <w:spacing w:line="360" w:lineRule="auto"/>
+        <w:jc w:val="both"/>
+        <w:rPr>
+          <w:rStyle w:val="Strong"/>
+        </w:rPr>
+      </w:pPr>
+    </w:p>
+    <w:p>
+      <w:pPr>
+        <w:rPr>
+          <w:rStyle w:val="Strong"/>
+        </w:rPr>
+      </w:pPr>
+      <w:r>
+        <w:rPr>
+          <w:rStyle w:val="Strong"/>
+        </w:rPr>
+        <w:br w:type="page"/>
+      </w:r>
+    </w:p>
+    <w:p>
+      <w:pPr>
         <w:spacing w:line="360" w:lineRule="auto"/>
         <w:jc w:val="both"/>
         <w:rPr>
@@ -1298,55 +2987,7 @@
         <w:jc w:val="both"/>
       </w:pPr>
       <w:r>
-        <w:t xml:space="preserve">[1] S. </w:t>
-      </w:r>
-      <w:proofErr w:type="spellStart"/>
-      <w:r>
-        <w:t>Wiecha</w:t>
-      </w:r>
-      <w:proofErr w:type="spellEnd"/>
-      <w:r>
-        <w:t xml:space="preserve">, P. S. </w:t>
-      </w:r>
-      <w:proofErr w:type="spellStart"/>
-      <w:r>
-        <w:t>Kasiak</w:t>
-      </w:r>
-      <w:proofErr w:type="spellEnd"/>
-      <w:r>
-        <w:t xml:space="preserve">, I. </w:t>
-      </w:r>
-      <w:proofErr w:type="spellStart"/>
-      <w:r>
-        <w:t>Cieśliński</w:t>
-      </w:r>
-      <w:proofErr w:type="spellEnd"/>
-      <w:r>
-        <w:t xml:space="preserve">, M. Maciejczyk, A. </w:t>
-      </w:r>
-      <w:proofErr w:type="spellStart"/>
-      <w:r>
-        <w:t>Mamcarz</w:t>
-      </w:r>
-      <w:proofErr w:type="spellEnd"/>
-      <w:r>
-        <w:t xml:space="preserve">, and D. </w:t>
-      </w:r>
-      <w:proofErr w:type="spellStart"/>
-      <w:r>
-        <w:t>Śliż</w:t>
-      </w:r>
-      <w:proofErr w:type="spellEnd"/>
-      <w:r>
-        <w:t>, “</w:t>
-      </w:r>
-      <w:proofErr w:type="spellStart"/>
-      <w:r>
-        <w:t>Modeling</w:t>
-      </w:r>
-      <w:proofErr w:type="spellEnd"/>
-      <w:r>
-        <w:t xml:space="preserve"> Physiological Predictors of Running Velocity for Endurance Athletes,” </w:t>
+        <w:t xml:space="preserve">[1] S. Wiecha, P. S. Kasiak, I. Cieśliński, M. Maciejczyk, A. Mamcarz, and D. Śliż, “Modeling Physiological Predictors of Running Velocity for Endurance Athletes,” </w:t>
       </w:r>
       <w:r>
         <w:rPr>
@@ -1356,17 +2997,9 @@
         <w:t>JCM</w:t>
       </w:r>
       <w:r>
-        <w:t xml:space="preserve">, vol. 11, no. 22, p. 6688, Nov. 2022, </w:t>
-      </w:r>
-      <w:proofErr w:type="spellStart"/>
-      <w:r>
-        <w:t>doi</w:t>
-      </w:r>
-      <w:proofErr w:type="spellEnd"/>
-      <w:r>
-        <w:t xml:space="preserve">: </w:t>
-      </w:r>
-      <w:hyperlink r:id="rId9" w:history="1">
+        <w:t xml:space="preserve">, vol. 11, no. 22, p. 6688, Nov. 2022, doi: </w:t>
+      </w:r>
+      <w:hyperlink r:id="rId11" w:history="1">
         <w:r>
           <w:rPr>
             <w:rStyle w:val="Hyperlink"/>
@@ -1384,15 +3017,7 @@
         <w:jc w:val="both"/>
       </w:pPr>
       <w:r>
-        <w:t xml:space="preserve">[2] J. Esteve-Lanao, S. Del Rosso, E. Larumbe-Zabala, C. Cardona, A. Alcocer-Gamboa, and D. A. </w:t>
-      </w:r>
-      <w:proofErr w:type="spellStart"/>
-      <w:r>
-        <w:t>Boullosa</w:t>
-      </w:r>
-      <w:proofErr w:type="spellEnd"/>
-      <w:r>
-        <w:t xml:space="preserve">, “Predicting Recreational Runners’ Marathon Performance Time During Their Training Preparation,” </w:t>
+        <w:t xml:space="preserve">[2] J. Esteve-Lanao, S. Del Rosso, E. Larumbe-Zabala, C. Cardona, A. Alcocer-Gamboa, and D. A. Boullosa, “Predicting Recreational Runners’ Marathon Performance Time During Their Training Preparation,” </w:t>
       </w:r>
       <w:r>
         <w:rPr>
@@ -1402,17 +3027,9 @@
         <w:t>Journal of Strength &amp; Conditioning Research</w:t>
       </w:r>
       <w:r>
-        <w:t xml:space="preserve">, vol. 35, no. 11, pp. 3218–3224, Nov. 2021, </w:t>
-      </w:r>
-      <w:proofErr w:type="spellStart"/>
-      <w:r>
-        <w:t>doi</w:t>
-      </w:r>
-      <w:proofErr w:type="spellEnd"/>
-      <w:r>
-        <w:t xml:space="preserve">: </w:t>
-      </w:r>
-      <w:hyperlink r:id="rId10" w:history="1">
+        <w:t xml:space="preserve">, vol. 35, no. 11, pp. 3218–3224, Nov. 2021, doi: </w:t>
+      </w:r>
+      <w:hyperlink r:id="rId12" w:history="1">
         <w:r>
           <w:rPr>
             <w:rStyle w:val="Hyperlink"/>
@@ -1430,15 +3047,7 @@
         <w:jc w:val="both"/>
       </w:pPr>
       <w:r>
-        <w:t xml:space="preserve">[3] M. </w:t>
-      </w:r>
-      <w:proofErr w:type="spellStart"/>
-      <w:r>
-        <w:t>Thuany</w:t>
-      </w:r>
-      <w:proofErr w:type="spellEnd"/>
-      <w:r>
-        <w:t xml:space="preserve"> </w:t>
+        <w:t xml:space="preserve">[3] M. Thuany </w:t>
       </w:r>
       <w:r>
         <w:rPr>
@@ -1458,17 +3067,9 @@
         <w:t>Front. Sports Act. Living</w:t>
       </w:r>
       <w:r>
-        <w:t xml:space="preserve">, vol. 7, p. 1577470, Sep. 2025, </w:t>
-      </w:r>
-      <w:proofErr w:type="spellStart"/>
-      <w:r>
-        <w:t>doi</w:t>
-      </w:r>
-      <w:proofErr w:type="spellEnd"/>
-      <w:r>
-        <w:t xml:space="preserve">: </w:t>
-      </w:r>
-      <w:hyperlink r:id="rId11" w:history="1">
+        <w:t xml:space="preserve">, vol. 7, p. 1577470, Sep. 2025, doi: </w:t>
+      </w:r>
+      <w:hyperlink r:id="rId13" w:history="1">
         <w:r>
           <w:rPr>
             <w:rStyle w:val="Hyperlink"/>
@@ -1486,39 +3087,7 @@
         <w:jc w:val="both"/>
       </w:pPr>
       <w:r>
-        <w:t>[4] J. Martínez-</w:t>
-      </w:r>
-      <w:proofErr w:type="spellStart"/>
-      <w:r>
-        <w:t>Gramage</w:t>
-      </w:r>
-      <w:proofErr w:type="spellEnd"/>
-      <w:r>
-        <w:t xml:space="preserve">, J. P. </w:t>
-      </w:r>
-      <w:proofErr w:type="spellStart"/>
-      <w:r>
-        <w:t>Albiach</w:t>
-      </w:r>
-      <w:proofErr w:type="spellEnd"/>
-      <w:r>
-        <w:t xml:space="preserve">, I. N. Moltó, J. J. Amer-Cuenca, V. </w:t>
-      </w:r>
-      <w:proofErr w:type="spellStart"/>
-      <w:r>
-        <w:t>Huesa</w:t>
-      </w:r>
-      <w:proofErr w:type="spellEnd"/>
-      <w:r>
-        <w:t xml:space="preserve"> Moreno, and E. Segura-</w:t>
-      </w:r>
-      <w:proofErr w:type="spellStart"/>
-      <w:r>
-        <w:t>Ortí</w:t>
-      </w:r>
-      <w:proofErr w:type="spellEnd"/>
-      <w:r>
-        <w:t xml:space="preserve">, “A Random Forest Machine Learning Framework to Reduce Running Injuries in Young Triathletes,” </w:t>
+        <w:t xml:space="preserve">[4] J. Martínez-Gramage, J. P. Albiach, I. N. Moltó, J. J. Amer-Cuenca, V. Huesa Moreno, and E. Segura-Ortí, “A Random Forest Machine Learning Framework to Reduce Running Injuries in Young Triathletes,” </w:t>
       </w:r>
       <w:r>
         <w:rPr>
@@ -1528,17 +3097,9 @@
         <w:t>Sensors</w:t>
       </w:r>
       <w:r>
-        <w:t xml:space="preserve">, vol. 20, no. 21, p. 6388, Nov. 2020, </w:t>
-      </w:r>
-      <w:proofErr w:type="spellStart"/>
-      <w:r>
-        <w:t>doi</w:t>
-      </w:r>
-      <w:proofErr w:type="spellEnd"/>
-      <w:r>
-        <w:t xml:space="preserve">: </w:t>
-      </w:r>
-      <w:hyperlink r:id="rId12" w:history="1">
+        <w:t xml:space="preserve">, vol. 20, no. 21, p. 6388, Nov. 2020, doi: </w:t>
+      </w:r>
+      <w:hyperlink r:id="rId14" w:history="1">
         <w:r>
           <w:rPr>
             <w:rStyle w:val="Hyperlink"/>
@@ -1556,23 +3117,7 @@
         <w:jc w:val="both"/>
       </w:pPr>
       <w:r>
-        <w:t xml:space="preserve">[5] A. </w:t>
-      </w:r>
-      <w:proofErr w:type="spellStart"/>
-      <w:r>
-        <w:t>Karahanoğlu</w:t>
-      </w:r>
-      <w:proofErr w:type="spellEnd"/>
-      <w:r>
-        <w:t xml:space="preserve">, R. Gouveia, J. </w:t>
-      </w:r>
-      <w:proofErr w:type="spellStart"/>
-      <w:r>
-        <w:t>Reenalda</w:t>
-      </w:r>
-      <w:proofErr w:type="spellEnd"/>
-      <w:r>
-        <w:t xml:space="preserve">, and G. Ludden, “How Are Sports-Trackers Used by Runners? Running-Related Data, Personal Goals, and Self-Tracking in Running,” </w:t>
+        <w:t xml:space="preserve">[5] A. Karahanoğlu, R. Gouveia, J. Reenalda, and G. Ludden, “How Are Sports-Trackers Used by Runners? Running-Related Data, Personal Goals, and Self-Tracking in Running,” </w:t>
       </w:r>
       <w:r>
         <w:rPr>
@@ -1582,17 +3127,9 @@
         <w:t>Sensors</w:t>
       </w:r>
       <w:r>
-        <w:t xml:space="preserve">, vol. 21, no. 11, p. 3687, May 2021, </w:t>
-      </w:r>
-      <w:proofErr w:type="spellStart"/>
-      <w:r>
-        <w:t>doi</w:t>
-      </w:r>
-      <w:proofErr w:type="spellEnd"/>
-      <w:r>
-        <w:t xml:space="preserve">: </w:t>
-      </w:r>
-      <w:hyperlink r:id="rId13" w:history="1">
+        <w:t xml:space="preserve">, vol. 21, no. 11, p. 3687, May 2021, doi: </w:t>
+      </w:r>
+      <w:hyperlink r:id="rId15" w:history="1">
         <w:r>
           <w:rPr>
             <w:rStyle w:val="Hyperlink"/>
@@ -1610,76 +3147,19 @@
         <w:jc w:val="both"/>
       </w:pPr>
       <w:r>
-        <w:t xml:space="preserve">[6] M. </w:t>
-      </w:r>
-      <w:proofErr w:type="spellStart"/>
-      <w:r>
-        <w:t>Pobiruchin</w:t>
-      </w:r>
-      <w:proofErr w:type="spellEnd"/>
-      <w:r>
-        <w:t xml:space="preserve">, J. </w:t>
-      </w:r>
-      <w:proofErr w:type="spellStart"/>
-      <w:r>
-        <w:t>Suleder</w:t>
-      </w:r>
-      <w:proofErr w:type="spellEnd"/>
-      <w:r>
-        <w:t xml:space="preserve">, R. </w:t>
-      </w:r>
-      <w:proofErr w:type="spellStart"/>
-      <w:r>
-        <w:t>Zowalla</w:t>
-      </w:r>
-      <w:proofErr w:type="spellEnd"/>
-      <w:r>
-        <w:t xml:space="preserve">, and M. Wiesner, “Accuracy and Adoption of Wearable Technology Used by Active Citizens: A Marathon Event Field Study,” </w:t>
+        <w:t xml:space="preserve">[6] M. Pobiruchin, J. Suleder, R. Zowalla, and M. Wiesner, “Accuracy and Adoption of Wearable Technology Used by Active Citizens: A Marathon Event Field Study,” </w:t>
       </w:r>
       <w:r>
         <w:rPr>
           <w:i/>
           <w:iCs/>
         </w:rPr>
-        <w:t xml:space="preserve">JMIR </w:t>
-      </w:r>
-      <w:proofErr w:type="spellStart"/>
-      <w:r>
-        <w:rPr>
-          <w:i/>
-          <w:iCs/>
-        </w:rPr>
-        <w:t>Mhealth</w:t>
-      </w:r>
-      <w:proofErr w:type="spellEnd"/>
-      <w:r>
-        <w:rPr>
-          <w:i/>
-          <w:iCs/>
-        </w:rPr>
-        <w:t xml:space="preserve"> </w:t>
-      </w:r>
-      <w:proofErr w:type="spellStart"/>
-      <w:r>
-        <w:rPr>
-          <w:i/>
-          <w:iCs/>
-        </w:rPr>
-        <w:t>Uhealth</w:t>
-      </w:r>
-      <w:proofErr w:type="spellEnd"/>
-      <w:r>
-        <w:t xml:space="preserve">, vol. 5, no. 2, p. e24, Feb. 2017, </w:t>
-      </w:r>
-      <w:proofErr w:type="spellStart"/>
-      <w:r>
-        <w:t>doi</w:t>
-      </w:r>
-      <w:proofErr w:type="spellEnd"/>
-      <w:r>
-        <w:t xml:space="preserve">: </w:t>
-      </w:r>
-      <w:hyperlink r:id="rId14" w:history="1">
+        <w:t>JMIR Mhealth Uhealth</w:t>
+      </w:r>
+      <w:r>
+        <w:t xml:space="preserve">, vol. 5, no. 2, p. e24, Feb. 2017, doi: </w:t>
+      </w:r>
+      <w:hyperlink r:id="rId16" w:history="1">
         <w:r>
           <w:rPr>
             <w:rStyle w:val="Hyperlink"/>
@@ -1713,17 +3193,9 @@
         <w:t>2025 International Conference on Advances in Machine Intelligence, and Cybersecurity Technologies (AMICT)</w:t>
       </w:r>
       <w:r>
-        <w:t xml:space="preserve">, Kota Kinabalu, Sabah, Malaysia: IEEE, Nov. 2025, pp. 290–295. </w:t>
-      </w:r>
-      <w:proofErr w:type="spellStart"/>
-      <w:r>
-        <w:t>doi</w:t>
-      </w:r>
-      <w:proofErr w:type="spellEnd"/>
-      <w:r>
-        <w:t xml:space="preserve">: </w:t>
-      </w:r>
-      <w:hyperlink r:id="rId15" w:history="1">
+        <w:t xml:space="preserve">, Kota Kinabalu, Sabah, Malaysia: IEEE, Nov. 2025, pp. 290–295. doi: </w:t>
+      </w:r>
+      <w:hyperlink r:id="rId17" w:history="1">
         <w:r>
           <w:rPr>
             <w:rStyle w:val="Hyperlink"/>
@@ -1809,17 +3281,9 @@
         <w:t>Recommender Systems</w:t>
       </w:r>
       <w:r>
-        <w:t xml:space="preserve">, Virtual Event Brazil: ACM, Sep. 2020, pp. 539–544. </w:t>
-      </w:r>
-      <w:proofErr w:type="spellStart"/>
-      <w:r>
-        <w:t>doi</w:t>
-      </w:r>
-      <w:proofErr w:type="spellEnd"/>
-      <w:r>
-        <w:t xml:space="preserve">: </w:t>
-      </w:r>
-      <w:hyperlink r:id="rId16" w:history="1">
+        <w:t xml:space="preserve">, Virtual Event Brazil: ACM, Sep. 2020, pp. 539–544. doi: </w:t>
+      </w:r>
+      <w:hyperlink r:id="rId18" w:history="1">
         <w:r>
           <w:rPr>
             <w:rStyle w:val="Hyperlink"/>
@@ -1837,31 +3301,7 @@
         <w:jc w:val="both"/>
       </w:pPr>
       <w:r>
-        <w:t xml:space="preserve">[11] L. Lerebourg, D. </w:t>
-      </w:r>
-      <w:proofErr w:type="spellStart"/>
-      <w:r>
-        <w:t>Saboul</w:t>
-      </w:r>
-      <w:proofErr w:type="spellEnd"/>
-      <w:r>
-        <w:t xml:space="preserve">, M. </w:t>
-      </w:r>
-      <w:proofErr w:type="spellStart"/>
-      <w:r>
-        <w:t>Clémençon</w:t>
-      </w:r>
-      <w:proofErr w:type="spellEnd"/>
-      <w:r>
-        <w:t xml:space="preserve">, and J. B. </w:t>
-      </w:r>
-      <w:proofErr w:type="spellStart"/>
-      <w:r>
-        <w:t>Coquart</w:t>
-      </w:r>
-      <w:proofErr w:type="spellEnd"/>
-      <w:r>
-        <w:t xml:space="preserve">, “Prediction of Marathon Performance using Artificial Intelligence,” </w:t>
+        <w:t xml:space="preserve">[11] L. Lerebourg, D. Saboul, M. Clémençon, and J. B. Coquart, “Prediction of Marathon Performance using Artificial Intelligence,” </w:t>
       </w:r>
       <w:r>
         <w:rPr>
@@ -1871,17 +3311,9 @@
         <w:t>Int J Sports Med</w:t>
       </w:r>
       <w:r>
-        <w:t xml:space="preserve">, vol. 44, no. 05, pp. 352–360, May 2023, </w:t>
-      </w:r>
-      <w:proofErr w:type="spellStart"/>
-      <w:r>
-        <w:t>doi</w:t>
-      </w:r>
-      <w:proofErr w:type="spellEnd"/>
-      <w:r>
-        <w:t xml:space="preserve">: </w:t>
-      </w:r>
-      <w:hyperlink r:id="rId17" w:history="1">
+        <w:t xml:space="preserve">, vol. 44, no. 05, pp. 352–360, May 2023, doi: </w:t>
+      </w:r>
+      <w:hyperlink r:id="rId19" w:history="1">
         <w:r>
           <w:rPr>
             <w:rStyle w:val="Hyperlink"/>
@@ -1905,15 +3337,7 @@
         <w:t>2</w:t>
       </w:r>
       <w:r>
-        <w:t xml:space="preserve">] D. Ruiz-Mayo, E. Pulido, and G. </w:t>
-      </w:r>
-      <w:proofErr w:type="spellStart"/>
-      <w:r>
-        <w:t>Martınez</w:t>
-      </w:r>
-      <w:proofErr w:type="spellEnd"/>
-      <w:r>
-        <w:t>-Munoz, “Marathon Performance Prediction of Amateur Runners based on Training Session Data”.</w:t>
+        <w:t>] D. Ruiz-Mayo, E. Pulido, and G. Martınez-Munoz, “Marathon Performance Prediction of Amateur Runners based on Training Session Data”.</w:t>
       </w:r>
     </w:p>
     <w:p>
@@ -1932,17 +3356,9 @@
         <w:t>Sports Med Int Open</w:t>
       </w:r>
       <w:r>
-        <w:t xml:space="preserve">, vol. 08, no. CP, p. a-2401-6234, Oct. 2024, </w:t>
-      </w:r>
-      <w:proofErr w:type="spellStart"/>
-      <w:r>
-        <w:t>doi</w:t>
-      </w:r>
-      <w:proofErr w:type="spellEnd"/>
-      <w:r>
-        <w:t xml:space="preserve">: </w:t>
-      </w:r>
-      <w:hyperlink r:id="rId18" w:history="1">
+        <w:t xml:space="preserve">, vol. 08, no. CP, p. a-2401-6234, Oct. 2024, doi: </w:t>
+      </w:r>
+      <w:hyperlink r:id="rId20" w:history="1">
         <w:r>
           <w:rPr>
             <w:rStyle w:val="Hyperlink"/>
@@ -1960,15 +3376,7 @@
         <w:jc w:val="both"/>
       </w:pPr>
       <w:r>
-        <w:t xml:space="preserve">[14] H. T. El-Kassabi, K. Khalil, and M. A. </w:t>
-      </w:r>
-      <w:proofErr w:type="spellStart"/>
-      <w:r>
-        <w:t>Serhani</w:t>
-      </w:r>
-      <w:proofErr w:type="spellEnd"/>
-      <w:r>
-        <w:t xml:space="preserve">, “Deep Learning Approach for Forecasting Athletes’ Performance in Sports Tournaments,” in </w:t>
+        <w:t xml:space="preserve">[14] H. T. El-Kassabi, K. Khalil, and M. A. Serhani, “Deep Learning Approach for Forecasting Athletes’ Performance in Sports Tournaments,” in </w:t>
       </w:r>
       <w:r>
         <w:rPr>
@@ -1978,17 +3386,9 @@
         <w:t>Proceedings of the 13th International Conference on Intelligent Systems: Theories and Applications</w:t>
       </w:r>
       <w:r>
-        <w:t xml:space="preserve">, Rabat Morocco: ACM, Sep. 2020, pp. 1–6. </w:t>
-      </w:r>
-      <w:proofErr w:type="spellStart"/>
-      <w:r>
-        <w:t>doi</w:t>
-      </w:r>
-      <w:proofErr w:type="spellEnd"/>
-      <w:r>
-        <w:t xml:space="preserve">: </w:t>
-      </w:r>
-      <w:hyperlink r:id="rId19" w:history="1">
+        <w:t xml:space="preserve">, Rabat Morocco: ACM, Sep. 2020, pp. 1–6. doi: </w:t>
+      </w:r>
+      <w:hyperlink r:id="rId21" w:history="1">
         <w:r>
           <w:rPr>
             <w:rStyle w:val="Hyperlink"/>
@@ -1998,6 +3398,54 @@
       </w:hyperlink>
       <w:r>
         <w:t>.</w:t>
+      </w:r>
+    </w:p>
+    <w:p>
+      <w:pPr>
+        <w:spacing w:line="360" w:lineRule="auto"/>
+        <w:jc w:val="both"/>
+      </w:pPr>
+      <w:r>
+        <w:t xml:space="preserve">[15] </w:t>
+      </w:r>
+      <w:r>
+        <w:t xml:space="preserve">zuskakluska, "Intelligent marathon race predictions," </w:t>
+      </w:r>
+      <w:r>
+        <w:rPr>
+          <w:i/>
+          <w:iCs/>
+        </w:rPr>
+        <w:t>Kaggle</w:t>
+      </w:r>
+      <w:r>
+        <w:t xml:space="preserve">, 2025. [Online]. Available: </w:t>
+      </w:r>
+      <w:hyperlink r:id="rId22" w:tgtFrame="_blank" w:history="1">
+        <w:r>
+          <w:rPr>
+            <w:rStyle w:val="Hyperlink"/>
+          </w:rPr>
+          <w:t>https://www.kaggle.com/code/zuskakluska/intelligent-marathon-race-predictions</w:t>
+        </w:r>
+      </w:hyperlink>
+      <w:r>
+        <w:t>. [Accessed: Apr. 11, 2026].</w:t>
+      </w:r>
+    </w:p>
+    <w:p>
+      <w:pPr>
+        <w:spacing w:line="360" w:lineRule="auto"/>
+        <w:jc w:val="both"/>
+      </w:pPr>
+      <w:r>
+        <w:t>[1</w:t>
+      </w:r>
+      <w:r>
+        <w:t>6</w:t>
+      </w:r>
+      <w:r>
+        <w:t>] L. A. Afonseca, R. N. Watanabe, and M. Duarte, “A worldwide comparison of long-distance running training in 2019 and 2020: associated effects of the COVID-19 pandemic,” PeerJ, vol. 10, p. e13192, Mar. 2022, doi: 10.7717/peerj.13192.</w:t>
       </w:r>
     </w:p>
     <w:p>
@@ -2147,6 +3595,219 @@
     </w:r>
   </w:p>
 </w:hdr>
+</file>
+
+<file path=word/numbering.xml><?xml version="1.0" encoding="utf-8"?>
+<w:numbering xmlns:wpc="http://schemas.microsoft.com/office/word/2010/wordprocessingCanvas" xmlns:cx="http://schemas.microsoft.com/office/drawing/2014/chartex" xmlns:cx1="http://schemas.microsoft.com/office/drawing/2015/9/8/chartex" xmlns:cx2="http://schemas.microsoft.com/office/drawing/2015/10/21/chartex" xmlns:cx3="http://schemas.microsoft.com/office/drawing/2016/5/9/chartex" xmlns:cx4="http://schemas.microsoft.com/office/drawing/2016/5/10/chartex" xmlns:cx5="http://schemas.microsoft.com/office/drawing/2016/5/11/chartex" xmlns:cx6="http://schemas.microsoft.com/office/drawing/2016/5/12/chartex" xmlns:cx7="http://schemas.microsoft.com/office/drawing/2016/5/13/chartex" xmlns:cx8="http://schemas.microsoft.com/office/drawing/2016/5/14/chartex" xmlns:mc="http://schemas.openxmlformats.org/markup-compatibility/2006" xmlns:aink="http://schemas.microsoft.com/office/drawing/2016/ink" xmlns:am3d="http://schemas.microsoft.com/office/drawing/2017/model3d" xmlns:o="urn:schemas-microsoft-com:office:office" xmlns:oel="http://schemas.microsoft.com/office/2019/extlst" xmlns:r="http://schemas.openxmlformats.org/officeDocument/2006/relationships" xmlns:m="http://schemas.openxmlformats.org/officeDocument/2006/math" xmlns:v="urn:schemas-microsoft-com:vml" xmlns:wp14="http://schemas.microsoft.com/office/word/2010/wordprocessingDrawing" xmlns:wp="http://schemas.openxmlformats.org/drawingml/2006/wordprocessingDrawing" xmlns:w10="urn:schemas-microsoft-com:office:word" xmlns:w="http://schemas.openxmlformats.org/wordprocessingml/2006/main" xmlns:w14="http://schemas.microsoft.com/office/word/2010/wordml" xmlns:w15="http://schemas.microsoft.com/office/word/2012/wordml" xmlns:w16cex="http://schemas.microsoft.com/office/word/2018/wordml/cex" xmlns:w16cid="http://schemas.microsoft.com/office/word/2016/wordml/cid" xmlns:w16="http://schemas.microsoft.com/office/word/2018/wordml" xmlns:w16du="http://schemas.microsoft.com/office/word/2023/wordml/word16du" xmlns:w16sdtdh="http://schemas.microsoft.com/office/word/2020/wordml/sdtdatahash" xmlns:w16sdtfl="http://schemas.microsoft.com/office/word/2024/wordml/sdtformatlock" xmlns:w16se="http://schemas.microsoft.com/office/word/2015/wordml/symex" xmlns:wpg="http://schemas.microsoft.com/office/word/2010/wordprocessingGroup" xmlns:wpi="http://schemas.microsoft.com/office/word/2010/wordprocessingInk" xmlns:wne="http://schemas.microsoft.com/office/word/2006/wordml" xmlns:wps="http://schemas.microsoft.com/office/word/2010/wordprocessingShape" mc:Ignorable="w14 w15 w16se w16cid w16 w16cex w16sdtdh w16sdtfl w16du wp14">
+  <w:abstractNum w:abstractNumId="0" w15:restartNumberingAfterBreak="0">
+    <w:nsid w:val="075A3FA4"/>
+    <w:multiLevelType w:val="hybridMultilevel"/>
+    <w:tmpl w:val="107226CA"/>
+    <w:lvl w:ilvl="0" w:tplc="20000011">
+      <w:start w:val="1"/>
+      <w:numFmt w:val="decimal"/>
+      <w:lvlText w:val="%1)"/>
+      <w:lvlJc w:val="left"/>
+      <w:pPr>
+        <w:ind w:left="770" w:hanging="360"/>
+      </w:pPr>
+      <w:rPr>
+        <w:rFonts w:hint="default"/>
+      </w:rPr>
+    </w:lvl>
+    <w:lvl w:ilvl="1" w:tplc="FFFFFFFF" w:tentative="1">
+      <w:start w:val="1"/>
+      <w:numFmt w:val="bullet"/>
+      <w:lvlText w:val="o"/>
+      <w:lvlJc w:val="left"/>
+      <w:pPr>
+        <w:ind w:left="1490" w:hanging="360"/>
+      </w:pPr>
+      <w:rPr>
+        <w:rFonts w:ascii="Courier New" w:hAnsi="Courier New" w:cs="Courier New" w:hint="default"/>
+      </w:rPr>
+    </w:lvl>
+    <w:lvl w:ilvl="2" w:tplc="FFFFFFFF" w:tentative="1">
+      <w:start w:val="1"/>
+      <w:numFmt w:val="bullet"/>
+      <w:lvlText w:val=""/>
+      <w:lvlJc w:val="left"/>
+      <w:pPr>
+        <w:ind w:left="2210" w:hanging="360"/>
+      </w:pPr>
+      <w:rPr>
+        <w:rFonts w:ascii="Wingdings" w:hAnsi="Wingdings" w:hint="default"/>
+      </w:rPr>
+    </w:lvl>
+    <w:lvl w:ilvl="3" w:tplc="FFFFFFFF" w:tentative="1">
+      <w:start w:val="1"/>
+      <w:numFmt w:val="bullet"/>
+      <w:lvlText w:val=""/>
+      <w:lvlJc w:val="left"/>
+      <w:pPr>
+        <w:ind w:left="2930" w:hanging="360"/>
+      </w:pPr>
+      <w:rPr>
+        <w:rFonts w:ascii="Symbol" w:hAnsi="Symbol" w:hint="default"/>
+      </w:rPr>
+    </w:lvl>
+    <w:lvl w:ilvl="4" w:tplc="FFFFFFFF" w:tentative="1">
+      <w:start w:val="1"/>
+      <w:numFmt w:val="bullet"/>
+      <w:lvlText w:val="o"/>
+      <w:lvlJc w:val="left"/>
+      <w:pPr>
+        <w:ind w:left="3650" w:hanging="360"/>
+      </w:pPr>
+      <w:rPr>
+        <w:rFonts w:ascii="Courier New" w:hAnsi="Courier New" w:cs="Courier New" w:hint="default"/>
+      </w:rPr>
+    </w:lvl>
+    <w:lvl w:ilvl="5" w:tplc="FFFFFFFF" w:tentative="1">
+      <w:start w:val="1"/>
+      <w:numFmt w:val="bullet"/>
+      <w:lvlText w:val=""/>
+      <w:lvlJc w:val="left"/>
+      <w:pPr>
+        <w:ind w:left="4370" w:hanging="360"/>
+      </w:pPr>
+      <w:rPr>
+        <w:rFonts w:ascii="Wingdings" w:hAnsi="Wingdings" w:hint="default"/>
+      </w:rPr>
+    </w:lvl>
+    <w:lvl w:ilvl="6" w:tplc="FFFFFFFF" w:tentative="1">
+      <w:start w:val="1"/>
+      <w:numFmt w:val="bullet"/>
+      <w:lvlText w:val=""/>
+      <w:lvlJc w:val="left"/>
+      <w:pPr>
+        <w:ind w:left="5090" w:hanging="360"/>
+      </w:pPr>
+      <w:rPr>
+        <w:rFonts w:ascii="Symbol" w:hAnsi="Symbol" w:hint="default"/>
+      </w:rPr>
+    </w:lvl>
+    <w:lvl w:ilvl="7" w:tplc="FFFFFFFF" w:tentative="1">
+      <w:start w:val="1"/>
+      <w:numFmt w:val="bullet"/>
+      <w:lvlText w:val="o"/>
+      <w:lvlJc w:val="left"/>
+      <w:pPr>
+        <w:ind w:left="5810" w:hanging="360"/>
+      </w:pPr>
+      <w:rPr>
+        <w:rFonts w:ascii="Courier New" w:hAnsi="Courier New" w:cs="Courier New" w:hint="default"/>
+      </w:rPr>
+    </w:lvl>
+    <w:lvl w:ilvl="8" w:tplc="FFFFFFFF" w:tentative="1">
+      <w:start w:val="1"/>
+      <w:numFmt w:val="bullet"/>
+      <w:lvlText w:val=""/>
+      <w:lvlJc w:val="left"/>
+      <w:pPr>
+        <w:ind w:left="6530" w:hanging="360"/>
+      </w:pPr>
+      <w:rPr>
+        <w:rFonts w:ascii="Wingdings" w:hAnsi="Wingdings" w:hint="default"/>
+      </w:rPr>
+    </w:lvl>
+  </w:abstractNum>
+  <w:abstractNum w:abstractNumId="1" w15:restartNumberingAfterBreak="0">
+    <w:nsid w:val="4C330F4F"/>
+    <w:multiLevelType w:val="hybridMultilevel"/>
+    <w:tmpl w:val="AF6C45DC"/>
+    <w:lvl w:ilvl="0" w:tplc="20000001">
+      <w:start w:val="1"/>
+      <w:numFmt w:val="bullet"/>
+      <w:lvlText w:val=""/>
+      <w:lvlJc w:val="left"/>
+      <w:pPr>
+        <w:ind w:left="720" w:hanging="360"/>
+      </w:pPr>
+      <w:rPr>
+        <w:rFonts w:ascii="Symbol" w:hAnsi="Symbol" w:hint="default"/>
+      </w:rPr>
+    </w:lvl>
+    <w:lvl w:ilvl="1" w:tplc="FFFFFFFF" w:tentative="1">
+      <w:start w:val="1"/>
+      <w:numFmt w:val="lowerLetter"/>
+      <w:lvlText w:val="%2."/>
+      <w:lvlJc w:val="left"/>
+      <w:pPr>
+        <w:ind w:left="1440" w:hanging="360"/>
+      </w:pPr>
+    </w:lvl>
+    <w:lvl w:ilvl="2" w:tplc="FFFFFFFF" w:tentative="1">
+      <w:start w:val="1"/>
+      <w:numFmt w:val="lowerRoman"/>
+      <w:lvlText w:val="%3."/>
+      <w:lvlJc w:val="right"/>
+      <w:pPr>
+        <w:ind w:left="2160" w:hanging="180"/>
+      </w:pPr>
+    </w:lvl>
+    <w:lvl w:ilvl="3" w:tplc="FFFFFFFF" w:tentative="1">
+      <w:start w:val="1"/>
+      <w:numFmt w:val="decimal"/>
+      <w:lvlText w:val="%4."/>
+      <w:lvlJc w:val="left"/>
+      <w:pPr>
+        <w:ind w:left="2880" w:hanging="360"/>
+      </w:pPr>
+    </w:lvl>
+    <w:lvl w:ilvl="4" w:tplc="FFFFFFFF" w:tentative="1">
+      <w:start w:val="1"/>
+      <w:numFmt w:val="lowerLetter"/>
+      <w:lvlText w:val="%5."/>
+      <w:lvlJc w:val="left"/>
+      <w:pPr>
+        <w:ind w:left="3600" w:hanging="360"/>
+      </w:pPr>
+    </w:lvl>
+    <w:lvl w:ilvl="5" w:tplc="FFFFFFFF" w:tentative="1">
+      <w:start w:val="1"/>
+      <w:numFmt w:val="lowerRoman"/>
+      <w:lvlText w:val="%6."/>
+      <w:lvlJc w:val="right"/>
+      <w:pPr>
+        <w:ind w:left="4320" w:hanging="180"/>
+      </w:pPr>
+    </w:lvl>
+    <w:lvl w:ilvl="6" w:tplc="FFFFFFFF" w:tentative="1">
+      <w:start w:val="1"/>
+      <w:numFmt w:val="decimal"/>
+      <w:lvlText w:val="%7."/>
+      <w:lvlJc w:val="left"/>
+      <w:pPr>
+        <w:ind w:left="5040" w:hanging="360"/>
+      </w:pPr>
+    </w:lvl>
+    <w:lvl w:ilvl="7" w:tplc="FFFFFFFF" w:tentative="1">
+      <w:start w:val="1"/>
+      <w:numFmt w:val="lowerLetter"/>
+      <w:lvlText w:val="%8."/>
+      <w:lvlJc w:val="left"/>
+      <w:pPr>
+        <w:ind w:left="5760" w:hanging="360"/>
+      </w:pPr>
+    </w:lvl>
+    <w:lvl w:ilvl="8" w:tplc="FFFFFFFF" w:tentative="1">
+      <w:start w:val="1"/>
+      <w:numFmt w:val="lowerRoman"/>
+      <w:lvlText w:val="%9."/>
+      <w:lvlJc w:val="right"/>
+      <w:pPr>
+        <w:ind w:left="6480" w:hanging="180"/>
+      </w:pPr>
+    </w:lvl>
+  </w:abstractNum>
+  <w:num w:numId="1" w16cid:durableId="2133742926">
+    <w:abstractNumId w:val="1"/>
+  </w:num>
+  <w:num w:numId="2" w16cid:durableId="1076518447">
+    <w:abstractNumId w:val="0"/>
+  </w:num>
+</w:numbering>
 </file>
 
 <file path=word/styles.xml><?xml version="1.0" encoding="utf-8"?>

</xml_diff>